<commit_message>
feat(risk): Finalize Page 5 (Acts 4/5) to Gold Enterprise v7.7
Critical Fixes & Improvements:
- Fixed Accounting Bug in Stress Scenario: Net Income ('lucro_liquido') is now correctly recalculated based on stressed revenue/opex, ensuring 'Capital Consumed' metric is accurate.
- Visual Excellence: Unified table rendering in 'celula_0_utils.py' to force styled HTML with badges in notebooks, fixing broken pipe-table display.
- Gold Standard Insights: Integrated deep 'How to Read' analysis blocks (Time-to-Profit & Shapley Leakage) directly into charts, removing redundant text.
- Syntax Error Recovery: Fixed code duplication in PAGINA_5_RISCO_ATO4_5.py.
- Documentation: Added 'auditoria_matematica_risco.md'.
</commit_message>
<xml_diff>
--- a/notebooks/quarto_pdf/relatorio_completo.docx
+++ b/notebooks/quarto_pdf/relatorio_completo.docx
@@ -5665,7 +5665,7 @@
       <w:r>
         <w:drawing>
           <wp:inline>
-            <wp:extent cx="5334000" cy="2449645"/>
+            <wp:extent cx="5334000" cy="2452905"/>
             <wp:effectExtent b="0" l="0" r="0" t="0"/>
             <wp:docPr descr="" title="" id="121" name="Picture"/>
             <a:graphic>
@@ -5686,7 +5686,7 @@
                   <pic:spPr bwMode="auto">
                     <a:xfrm>
                       <a:off x="0" y="0"/>
-                      <a:ext cx="5334000" cy="2449645"/>
+                      <a:ext cx="5334000" cy="2452905"/>
                     </a:xfrm>
                     <a:prstGeom prst="rect">
                       <a:avLst/>
@@ -6819,7 +6819,7 @@
       <w:r>
         <w:drawing>
           <wp:inline>
-            <wp:extent cx="5334000" cy="2587907"/>
+            <wp:extent cx="5334000" cy="2581392"/>
             <wp:effectExtent b="0" l="0" r="0" t="0"/>
             <wp:docPr descr="" title="" id="146" name="Picture"/>
             <a:graphic>
@@ -6840,7 +6840,7 @@
                   <pic:spPr bwMode="auto">
                     <a:xfrm>
                       <a:off x="0" y="0"/>
-                      <a:ext cx="5334000" cy="2587907"/>
+                      <a:ext cx="5334000" cy="2581392"/>
                     </a:xfrm>
                     <a:prstGeom prst="rect">
                       <a:avLst/>
@@ -7898,7 +7898,7 @@
       <w:r>
         <w:drawing>
           <wp:inline>
-            <wp:extent cx="5334000" cy="2607454"/>
+            <wp:extent cx="5334000" cy="2595271"/>
             <wp:effectExtent b="0" l="0" r="0" t="0"/>
             <wp:docPr descr="" title="" id="171" name="Picture"/>
             <a:graphic>
@@ -7919,7 +7919,7 @@
                   <pic:spPr bwMode="auto">
                     <a:xfrm>
                       <a:off x="0" y="0"/>
-                      <a:ext cx="5334000" cy="2607454"/>
+                      <a:ext cx="5334000" cy="2595271"/>
                     </a:xfrm>
                     <a:prstGeom prst="rect">
                       <a:avLst/>
@@ -9059,7 +9059,7 @@
       <w:r>
         <w:drawing>
           <wp:inline>
-            <wp:extent cx="5334000" cy="2757805"/>
+            <wp:extent cx="5334000" cy="2751000"/>
             <wp:effectExtent b="0" l="0" r="0" t="0"/>
             <wp:docPr descr="" title="" id="196" name="Picture"/>
             <a:graphic>
@@ -9080,7 +9080,7 @@
                   <pic:spPr bwMode="auto">
                     <a:xfrm>
                       <a:off x="0" y="0"/>
-                      <a:ext cx="5334000" cy="2757805"/>
+                      <a:ext cx="5334000" cy="2751000"/>
                     </a:xfrm>
                     <a:prstGeom prst="rect">
                       <a:avLst/>
@@ -11093,7 +11093,7 @@
       <w:r>
         <w:drawing>
           <wp:inline>
-            <wp:extent cx="5334000" cy="2525006"/>
+            <wp:extent cx="5334000" cy="2519190"/>
             <wp:effectExtent b="0" l="0" r="0" t="0"/>
             <wp:docPr descr="" title="" id="248" name="Picture"/>
             <a:graphic>
@@ -11114,7 +11114,7 @@
                   <pic:spPr bwMode="auto">
                     <a:xfrm>
                       <a:off x="0" y="0"/>
-                      <a:ext cx="5334000" cy="2525006"/>
+                      <a:ext cx="5334000" cy="2519190"/>
                     </a:xfrm>
                     <a:prstGeom prst="rect">
                       <a:avLst/>
@@ -24090,7 +24090,7 @@
       </w:r>
     </w:p>
     <w:bookmarkEnd w:id="541"/>
-    <w:bookmarkStart w:id="737" w:name="tier5"/>
+    <w:bookmarkStart w:id="736" w:name="tier5"/>
     <w:bookmarkStart w:id="543" w:name="tier5-1"/>
     <w:bookmarkStart w:id="542" w:name="página-5-risco-cenários"/>
     <w:p>
@@ -24253,7 +24253,7 @@
                 <w:b/>
                 <w:bCs/>
               </w:rPr>
-              <w:t xml:space="preserve">92.7%</w:t>
+              <w:t xml:space="preserve">99.3%</w:t>
             </w:r>
           </w:p>
         </w:tc>
@@ -24269,7 +24269,7 @@
                 <w:b/>
                 <w:bCs/>
               </w:rPr>
-              <w:t xml:space="preserve">R$ -5.198,67</w:t>
+              <w:t xml:space="preserve">R$ 3.056,70</w:t>
             </w:r>
           </w:p>
         </w:tc>
@@ -24285,7 +24285,7 @@
                 <w:b/>
                 <w:bCs/>
               </w:rPr>
-              <w:t xml:space="preserve">777%</w:t>
+              <w:t xml:space="preserve">1094%</w:t>
             </w:r>
           </w:p>
         </w:tc>
@@ -24301,7 +24301,7 @@
                 <w:b/>
                 <w:bCs/>
               </w:rPr>
-              <w:t xml:space="preserve">8.8x</w:t>
+              <w:t xml:space="preserve">11.9x</w:t>
             </w:r>
           </w:p>
         </w:tc>
@@ -24365,7 +24365,7 @@
               <w:jc w:val="center"/>
             </w:pPr>
             <w:r>
-              <w:t xml:space="preserve">+2.7% vs meta 90%</w:t>
+              <w:t xml:space="preserve">+9.3% vs meta 90%</w:t>
             </w:r>
           </w:p>
         </w:tc>
@@ -24377,7 +24377,7 @@
               <w:jc w:val="center"/>
             </w:pPr>
             <w:r>
-              <w:t xml:space="preserve">5k vs limite -50k</w:t>
+              <w:t xml:space="preserve">3k vs limite -50k</w:t>
             </w:r>
           </w:p>
         </w:tc>
@@ -24389,7 +24389,7 @@
               <w:jc w:val="center"/>
             </w:pPr>
             <w:r>
-              <w:t xml:space="preserve">777% potencial acima mediana</w:t>
+              <w:t xml:space="preserve">1094% potencial acima mediana</w:t>
             </w:r>
           </w:p>
         </w:tc>
@@ -24667,7 +24667,7 @@
               <w:jc w:val="left"/>
             </w:pPr>
             <w:r>
-              <w:t xml:space="preserve">7.3%</w:t>
+              <w:t xml:space="preserve">0.7%</w:t>
             </w:r>
           </w:p>
         </w:tc>
@@ -24741,7 +24741,7 @@
               <w:jc w:val="left"/>
             </w:pPr>
             <w:r>
-              <w:t xml:space="preserve">26.7%</w:t>
+              <w:t xml:space="preserve">28.0%</w:t>
             </w:r>
           </w:p>
         </w:tc>
@@ -24815,7 +24815,7 @@
               <w:jc w:val="left"/>
             </w:pPr>
             <w:r>
-              <w:t xml:space="preserve">63.3%</w:t>
+              <w:t xml:space="preserve">56.0%</w:t>
             </w:r>
           </w:p>
         </w:tc>
@@ -24889,7 +24889,7 @@
               <w:jc w:val="left"/>
             </w:pPr>
             <w:r>
-              <w:t xml:space="preserve">38.0%</w:t>
+              <w:t xml:space="preserve">40.7%</w:t>
             </w:r>
           </w:p>
         </w:tc>
@@ -24963,7 +24963,7 @@
               <w:jc w:val="left"/>
             </w:pPr>
             <w:r>
-              <w:t xml:space="preserve">38.0%</w:t>
+              <w:t xml:space="preserve">34.7%</w:t>
             </w:r>
           </w:p>
         </w:tc>
@@ -25877,7 +25877,7 @@
               <w:jc w:val="left"/>
             </w:pPr>
             <w:r>
-              <w:t xml:space="preserve">R$ -5.198,67</w:t>
+              <w:t xml:space="preserve">R$ 3.056,70</w:t>
             </w:r>
           </w:p>
         </w:tc>
@@ -25951,7 +25951,7 @@
               <w:jc w:val="left"/>
             </w:pPr>
             <w:r>
-              <w:t xml:space="preserve">R$ -10.711,58</w:t>
+              <w:t xml:space="preserve">R$ 654,10</w:t>
             </w:r>
           </w:p>
         </w:tc>
@@ -26025,7 +26025,7 @@
               <w:jc w:val="left"/>
             </w:pPr>
             <w:r>
-              <w:t xml:space="preserve">R$ 197.746,61</w:t>
+              <w:t xml:space="preserve">R$ 137.084,72</w:t>
             </w:r>
           </w:p>
         </w:tc>
@@ -26099,7 +26099,7 @@
               <w:jc w:val="left"/>
             </w:pPr>
             <w:r>
-              <w:t xml:space="preserve">R$ 1.739.868,78</w:t>
+              <w:t xml:space="preserve">R$ 1.633.344,56</w:t>
             </w:r>
           </w:p>
         </w:tc>
@@ -26305,7 +26305,7 @@
               <w:t xml:space="preserve"> </w:t>
             </w:r>
             <w:r>
-              <w:t xml:space="preserve">7.3% (Atenção necessária)</w:t>
+              <w:t xml:space="preserve">0.7% (&lt; 5% - Excelente)</w:t>
             </w:r>
           </w:p>
           <w:p>
@@ -27960,7 +27960,7 @@
                 <w:b/>
                 <w:bCs/>
               </w:rPr>
-              <w:t xml:space="preserve">2.0%</w:t>
+              <w:t xml:space="preserve">0.0%</w:t>
             </w:r>
             <w:r>
               <w:t xml:space="preserve"> </w:t>
@@ -28016,7 +28016,7 @@
                 <w:b/>
                 <w:bCs/>
               </w:rPr>
-              <w:t xml:space="preserve">24.0%</w:t>
+              <w:t xml:space="preserve">27.3%</w:t>
             </w:r>
             <w:r>
               <w:t xml:space="preserve"> </w:t>
@@ -28084,7 +28084,7 @@
                 <w:b/>
                 <w:bCs/>
               </w:rPr>
-              <w:t xml:space="preserve">74.0%</w:t>
+              <w:t xml:space="preserve">72.7%</w:t>
             </w:r>
             <w:r>
               <w:t xml:space="preserve"> </w:t>
@@ -28351,103 +28351,103 @@
               <w:jc w:val="left"/>
             </w:pPr>
             <w:r>
-              <w:t xml:space="preserve">R$ -5.198,67</w:t>
-            </w:r>
-          </w:p>
-        </w:tc>
-        <w:tc>
-          <w:tcPr/>
-          <w:p>
-            <w:pPr>
-              <w:pStyle w:val="Compact"/>
-              <w:jc w:val="left"/>
-            </w:pPr>
-            <w:r>
-              <w:t xml:space="preserve">R$ 8.494,58</w:t>
-            </w:r>
-          </w:p>
-        </w:tc>
-        <w:tc>
-          <w:tcPr/>
-          <w:p>
-            <w:pPr>
-              <w:pStyle w:val="Compact"/>
-              <w:jc w:val="left"/>
-            </w:pPr>
-            <w:r>
-              <w:t xml:space="preserve">R$ 46.256,97</w:t>
-            </w:r>
-          </w:p>
-        </w:tc>
-        <w:tc>
-          <w:tcPr/>
-          <w:p>
-            <w:pPr>
-              <w:pStyle w:val="Compact"/>
-              <w:jc w:val="left"/>
-            </w:pPr>
-            <w:r>
-              <w:t xml:space="preserve">R$ 197.746,61</w:t>
-            </w:r>
-          </w:p>
-        </w:tc>
-        <w:tc>
-          <w:tcPr/>
-          <w:p>
-            <w:pPr>
-              <w:pStyle w:val="Compact"/>
-              <w:jc w:val="left"/>
-            </w:pPr>
-            <w:r>
-              <w:t xml:space="preserve">R$ 560.731,03</w:t>
-            </w:r>
-          </w:p>
-        </w:tc>
-        <w:tc>
-          <w:tcPr/>
-          <w:p>
-            <w:pPr>
-              <w:pStyle w:val="Compact"/>
-              <w:jc w:val="left"/>
-            </w:pPr>
-            <w:r>
-              <w:t xml:space="preserve">R$ 1.543.586,34</w:t>
-            </w:r>
-          </w:p>
-        </w:tc>
-        <w:tc>
-          <w:tcPr/>
-          <w:p>
-            <w:pPr>
-              <w:pStyle w:val="Compact"/>
-              <w:jc w:val="left"/>
-            </w:pPr>
-            <w:r>
-              <w:t xml:space="preserve">R$ 1.734.670,11</w:t>
-            </w:r>
-          </w:p>
-        </w:tc>
-        <w:tc>
-          <w:tcPr/>
-          <w:p>
-            <w:pPr>
-              <w:pStyle w:val="Compact"/>
-              <w:jc w:val="left"/>
-            </w:pPr>
-            <w:r>
-              <w:t xml:space="preserve">R$ 424.562,05</w:t>
-            </w:r>
-          </w:p>
-        </w:tc>
-        <w:tc>
-          <w:tcPr/>
-          <w:p>
-            <w:pPr>
-              <w:pStyle w:val="Compact"/>
-              <w:jc w:val="left"/>
-            </w:pPr>
-            <w:r>
-              <w:t xml:space="preserve">R$ 578.563,91</w:t>
+              <w:t xml:space="preserve">R$ 3.056,70</w:t>
+            </w:r>
+          </w:p>
+        </w:tc>
+        <w:tc>
+          <w:tcPr/>
+          <w:p>
+            <w:pPr>
+              <w:pStyle w:val="Compact"/>
+              <w:jc w:val="left"/>
+            </w:pPr>
+            <w:r>
+              <w:t xml:space="preserve">R$ 9.673,35</w:t>
+            </w:r>
+          </w:p>
+        </w:tc>
+        <w:tc>
+          <w:tcPr/>
+          <w:p>
+            <w:pPr>
+              <w:pStyle w:val="Compact"/>
+              <w:jc w:val="left"/>
+            </w:pPr>
+            <w:r>
+              <w:t xml:space="preserve">R$ 42.315,30</w:t>
+            </w:r>
+          </w:p>
+        </w:tc>
+        <w:tc>
+          <w:tcPr/>
+          <w:p>
+            <w:pPr>
+              <w:pStyle w:val="Compact"/>
+              <w:jc w:val="left"/>
+            </w:pPr>
+            <w:r>
+              <w:t xml:space="preserve">R$ 137.084,72</w:t>
+            </w:r>
+          </w:p>
+        </w:tc>
+        <w:tc>
+          <w:tcPr/>
+          <w:p>
+            <w:pPr>
+              <w:pStyle w:val="Compact"/>
+              <w:jc w:val="left"/>
+            </w:pPr>
+            <w:r>
+              <w:t xml:space="preserve">R$ 502.989,60</w:t>
+            </w:r>
+          </w:p>
+        </w:tc>
+        <w:tc>
+          <w:tcPr/>
+          <w:p>
+            <w:pPr>
+              <w:pStyle w:val="Compact"/>
+              <w:jc w:val="left"/>
+            </w:pPr>
+            <w:r>
+              <w:t xml:space="preserve">R$ 1.294.009,34</w:t>
+            </w:r>
+          </w:p>
+        </w:tc>
+        <w:tc>
+          <w:tcPr/>
+          <w:p>
+            <w:pPr>
+              <w:pStyle w:val="Compact"/>
+              <w:jc w:val="left"/>
+            </w:pPr>
+            <w:r>
+              <w:t xml:space="preserve">R$ 1.636.401,25</w:t>
+            </w:r>
+          </w:p>
+        </w:tc>
+        <w:tc>
+          <w:tcPr/>
+          <w:p>
+            <w:pPr>
+              <w:pStyle w:val="Compact"/>
+              <w:jc w:val="left"/>
+            </w:pPr>
+            <w:r>
+              <w:t xml:space="preserve">R$ 412.753,00</w:t>
+            </w:r>
+          </w:p>
+        </w:tc>
+        <w:tc>
+          <w:tcPr/>
+          <w:p>
+            <w:pPr>
+              <w:pStyle w:val="Compact"/>
+              <w:jc w:val="left"/>
+            </w:pPr>
+            <w:r>
+              <w:t xml:space="preserve">R$ 618.367,84</w:t>
             </w:r>
           </w:p>
         </w:tc>
@@ -28473,103 +28473,103 @@
               <w:jc w:val="left"/>
             </w:pPr>
             <w:r>
-              <w:t xml:space="preserve">R$ 31.425,06</w:t>
-            </w:r>
-          </w:p>
-        </w:tc>
-        <w:tc>
-          <w:tcPr/>
-          <w:p>
-            <w:pPr>
-              <w:pStyle w:val="Compact"/>
-              <w:jc w:val="left"/>
-            </w:pPr>
-            <w:r>
-              <w:t xml:space="preserve">R$ 60.440,04</w:t>
-            </w:r>
-          </w:p>
-        </w:tc>
-        <w:tc>
-          <w:tcPr/>
-          <w:p>
-            <w:pPr>
-              <w:pStyle w:val="Compact"/>
-              <w:jc w:val="left"/>
-            </w:pPr>
-            <w:r>
-              <w:t xml:space="preserve">R$ 181.068,90</w:t>
-            </w:r>
-          </w:p>
-        </w:tc>
-        <w:tc>
-          <w:tcPr/>
-          <w:p>
-            <w:pPr>
-              <w:pStyle w:val="Compact"/>
-              <w:jc w:val="left"/>
-            </w:pPr>
-            <w:r>
-              <w:t xml:space="preserve">R$ 684.734,40</w:t>
-            </w:r>
-          </w:p>
-        </w:tc>
-        <w:tc>
-          <w:tcPr/>
-          <w:p>
-            <w:pPr>
-              <w:pStyle w:val="Compact"/>
-              <w:jc w:val="left"/>
-            </w:pPr>
-            <w:r>
-              <w:t xml:space="preserve">R$ 1.941.312,60</w:t>
-            </w:r>
-          </w:p>
-        </w:tc>
-        <w:tc>
-          <w:tcPr/>
-          <w:p>
-            <w:pPr>
-              <w:pStyle w:val="Compact"/>
-              <w:jc w:val="left"/>
-            </w:pPr>
-            <w:r>
-              <w:t xml:space="preserve">R$ 3.222.416,40</w:t>
-            </w:r>
-          </w:p>
-        </w:tc>
-        <w:tc>
-          <w:tcPr/>
-          <w:p>
-            <w:pPr>
-              <w:pStyle w:val="Compact"/>
-              <w:jc w:val="left"/>
-            </w:pPr>
-            <w:r>
-              <w:t xml:space="preserve">R$ 3.550.149,90</w:t>
-            </w:r>
-          </w:p>
-        </w:tc>
-        <w:tc>
-          <w:tcPr/>
-          <w:p>
-            <w:pPr>
-              <w:pStyle w:val="Compact"/>
-              <w:jc w:val="left"/>
-            </w:pPr>
-            <w:r>
-              <w:t xml:space="preserve">R$ 1.133.709,70</w:t>
-            </w:r>
-          </w:p>
-        </w:tc>
-        <w:tc>
-          <w:tcPr/>
-          <w:p>
-            <w:pPr>
-              <w:pStyle w:val="Compact"/>
-              <w:jc w:val="left"/>
-            </w:pPr>
-            <w:r>
-              <w:t xml:space="preserve">R$ 1.195.419,03</w:t>
+              <w:t xml:space="preserve">R$ 47.302,08</w:t>
+            </w:r>
+          </w:p>
+        </w:tc>
+        <w:tc>
+          <w:tcPr/>
+          <w:p>
+            <w:pPr>
+              <w:pStyle w:val="Compact"/>
+              <w:jc w:val="left"/>
+            </w:pPr>
+            <w:r>
+              <w:t xml:space="preserve">R$ 72.800,64</w:t>
+            </w:r>
+          </w:p>
+        </w:tc>
+        <w:tc>
+          <w:tcPr/>
+          <w:p>
+            <w:pPr>
+              <w:pStyle w:val="Compact"/>
+              <w:jc w:val="left"/>
+            </w:pPr>
+            <w:r>
+              <w:t xml:space="preserve">R$ 151.311,90</w:t>
+            </w:r>
+          </w:p>
+        </w:tc>
+        <w:tc>
+          <w:tcPr/>
+          <w:p>
+            <w:pPr>
+              <w:pStyle w:val="Compact"/>
+              <w:jc w:val="left"/>
+            </w:pPr>
+            <w:r>
+              <w:t xml:space="preserve">R$ 395.102,40</w:t>
+            </w:r>
+          </w:p>
+        </w:tc>
+        <w:tc>
+          <w:tcPr/>
+          <w:p>
+            <w:pPr>
+              <w:pStyle w:val="Compact"/>
+              <w:jc w:val="left"/>
+            </w:pPr>
+            <w:r>
+              <w:t xml:space="preserve">R$ 1.959.189,90</w:t>
+            </w:r>
+          </w:p>
+        </w:tc>
+        <w:tc>
+          <w:tcPr/>
+          <w:p>
+            <w:pPr>
+              <w:pStyle w:val="Compact"/>
+              <w:jc w:val="left"/>
+            </w:pPr>
+            <w:r>
+              <w:t xml:space="preserve">R$ 2.893.424,88</w:t>
+            </w:r>
+          </w:p>
+        </w:tc>
+        <w:tc>
+          <w:tcPr/>
+          <w:p>
+            <w:pPr>
+              <w:pStyle w:val="Compact"/>
+              <w:jc w:val="left"/>
+            </w:pPr>
+            <w:r>
+              <w:t xml:space="preserve">R$ 3.408.333,60</w:t>
+            </w:r>
+          </w:p>
+        </w:tc>
+        <w:tc>
+          <w:tcPr/>
+          <w:p>
+            <w:pPr>
+              <w:pStyle w:val="Compact"/>
+              <w:jc w:val="left"/>
+            </w:pPr>
+            <w:r>
+              <w:t xml:space="preserve">R$ 1.101.118,28</w:t>
+            </w:r>
+          </w:p>
+        </w:tc>
+        <w:tc>
+          <w:tcPr/>
+          <w:p>
+            <w:pPr>
+              <w:pStyle w:val="Compact"/>
+              <w:jc w:val="left"/>
+            </w:pPr>
+            <w:r>
+              <w:t xml:space="preserve">R$ 1.204.439,41</w:t>
             </w:r>
           </w:p>
         </w:tc>
@@ -28595,103 +28595,103 @@
               <w:jc w:val="left"/>
             </w:pPr>
             <w:r>
-              <w:t xml:space="preserve">R$ 2.618,76</w:t>
-            </w:r>
-          </w:p>
-        </w:tc>
-        <w:tc>
-          <w:tcPr/>
-          <w:p>
-            <w:pPr>
-              <w:pStyle w:val="Compact"/>
-              <w:jc w:val="left"/>
-            </w:pPr>
-            <w:r>
-              <w:t xml:space="preserve">R$ 5.036,67</w:t>
-            </w:r>
-          </w:p>
-        </w:tc>
-        <w:tc>
-          <w:tcPr/>
-          <w:p>
-            <w:pPr>
-              <w:pStyle w:val="Compact"/>
-              <w:jc w:val="left"/>
-            </w:pPr>
-            <w:r>
-              <w:t xml:space="preserve">R$ 15.089,08</w:t>
-            </w:r>
-          </w:p>
-        </w:tc>
-        <w:tc>
-          <w:tcPr/>
-          <w:p>
-            <w:pPr>
-              <w:pStyle w:val="Compact"/>
-              <w:jc w:val="left"/>
-            </w:pPr>
-            <w:r>
-              <w:t xml:space="preserve">R$ 57.061,20</w:t>
-            </w:r>
-          </w:p>
-        </w:tc>
-        <w:tc>
-          <w:tcPr/>
-          <w:p>
-            <w:pPr>
-              <w:pStyle w:val="Compact"/>
-              <w:jc w:val="left"/>
-            </w:pPr>
-            <w:r>
-              <w:t xml:space="preserve">R$ 161.776,05</w:t>
-            </w:r>
-          </w:p>
-        </w:tc>
-        <w:tc>
-          <w:tcPr/>
-          <w:p>
-            <w:pPr>
-              <w:pStyle w:val="Compact"/>
-              <w:jc w:val="left"/>
-            </w:pPr>
-            <w:r>
-              <w:t xml:space="preserve">R$ 268.534,70</w:t>
-            </w:r>
-          </w:p>
-        </w:tc>
-        <w:tc>
-          <w:tcPr/>
-          <w:p>
-            <w:pPr>
-              <w:pStyle w:val="Compact"/>
-              <w:jc w:val="left"/>
-            </w:pPr>
-            <w:r>
-              <w:t xml:space="preserve">R$ 295.845,83</w:t>
-            </w:r>
-          </w:p>
-        </w:tc>
-        <w:tc>
-          <w:tcPr/>
-          <w:p>
-            <w:pPr>
-              <w:pStyle w:val="Compact"/>
-              <w:jc w:val="left"/>
-            </w:pPr>
-            <w:r>
-              <w:t xml:space="preserve">R$ 94.475,81</w:t>
-            </w:r>
-          </w:p>
-        </w:tc>
-        <w:tc>
-          <w:tcPr/>
-          <w:p>
-            <w:pPr>
-              <w:pStyle w:val="Compact"/>
-              <w:jc w:val="left"/>
-            </w:pPr>
-            <w:r>
-              <w:t xml:space="preserve">R$ 99.618,25</w:t>
+              <w:t xml:space="preserve">R$ 3.941,84</w:t>
+            </w:r>
+          </w:p>
+        </w:tc>
+        <w:tc>
+          <w:tcPr/>
+          <w:p>
+            <w:pPr>
+              <w:pStyle w:val="Compact"/>
+              <w:jc w:val="left"/>
+            </w:pPr>
+            <w:r>
+              <w:t xml:space="preserve">R$ 6.066,72</w:t>
+            </w:r>
+          </w:p>
+        </w:tc>
+        <w:tc>
+          <w:tcPr/>
+          <w:p>
+            <w:pPr>
+              <w:pStyle w:val="Compact"/>
+              <w:jc w:val="left"/>
+            </w:pPr>
+            <w:r>
+              <w:t xml:space="preserve">R$ 12.609,33</w:t>
+            </w:r>
+          </w:p>
+        </w:tc>
+        <w:tc>
+          <w:tcPr/>
+          <w:p>
+            <w:pPr>
+              <w:pStyle w:val="Compact"/>
+              <w:jc w:val="left"/>
+            </w:pPr>
+            <w:r>
+              <w:t xml:space="preserve">R$ 32.925,20</w:t>
+            </w:r>
+          </w:p>
+        </w:tc>
+        <w:tc>
+          <w:tcPr/>
+          <w:p>
+            <w:pPr>
+              <w:pStyle w:val="Compact"/>
+              <w:jc w:val="left"/>
+            </w:pPr>
+            <w:r>
+              <w:t xml:space="preserve">R$ 163.265,83</w:t>
+            </w:r>
+          </w:p>
+        </w:tc>
+        <w:tc>
+          <w:tcPr/>
+          <w:p>
+            <w:pPr>
+              <w:pStyle w:val="Compact"/>
+              <w:jc w:val="left"/>
+            </w:pPr>
+            <w:r>
+              <w:t xml:space="preserve">R$ 241.118,74</w:t>
+            </w:r>
+          </w:p>
+        </w:tc>
+        <w:tc>
+          <w:tcPr/>
+          <w:p>
+            <w:pPr>
+              <w:pStyle w:val="Compact"/>
+              <w:jc w:val="left"/>
+            </w:pPr>
+            <w:r>
+              <w:t xml:space="preserve">R$ 284.027,80</w:t>
+            </w:r>
+          </w:p>
+        </w:tc>
+        <w:tc>
+          <w:tcPr/>
+          <w:p>
+            <w:pPr>
+              <w:pStyle w:val="Compact"/>
+              <w:jc w:val="left"/>
+            </w:pPr>
+            <w:r>
+              <w:t xml:space="preserve">R$ 91.759,86</w:t>
+            </w:r>
+          </w:p>
+        </w:tc>
+        <w:tc>
+          <w:tcPr/>
+          <w:p>
+            <w:pPr>
+              <w:pStyle w:val="Compact"/>
+              <w:jc w:val="left"/>
+            </w:pPr>
+            <w:r>
+              <w:t xml:space="preserve">R$ 100.369,95</w:t>
             </w:r>
           </w:p>
         </w:tc>
@@ -28717,103 +28717,103 @@
               <w:jc w:val="left"/>
             </w:pPr>
             <w:r>
-              <w:t xml:space="preserve">27</w:t>
-            </w:r>
-          </w:p>
-        </w:tc>
-        <w:tc>
-          <w:tcPr/>
-          <w:p>
-            <w:pPr>
-              <w:pStyle w:val="Compact"/>
-              <w:jc w:val="left"/>
-            </w:pPr>
-            <w:r>
-              <w:t xml:space="preserve">53</w:t>
-            </w:r>
-          </w:p>
-        </w:tc>
-        <w:tc>
-          <w:tcPr/>
-          <w:p>
-            <w:pPr>
-              <w:pStyle w:val="Compact"/>
-              <w:jc w:val="left"/>
-            </w:pPr>
-            <w:r>
-              <w:t xml:space="preserve">159</w:t>
-            </w:r>
-          </w:p>
-        </w:tc>
-        <w:tc>
-          <w:tcPr/>
-          <w:p>
-            <w:pPr>
-              <w:pStyle w:val="Compact"/>
-              <w:jc w:val="left"/>
-            </w:pPr>
-            <w:r>
-              <w:t xml:space="preserve">588</w:t>
-            </w:r>
-          </w:p>
-        </w:tc>
-        <w:tc>
-          <w:tcPr/>
-          <w:p>
-            <w:pPr>
-              <w:pStyle w:val="Compact"/>
-              <w:jc w:val="left"/>
-            </w:pPr>
-            <w:r>
-              <w:t xml:space="preserve">1,700</w:t>
-            </w:r>
-          </w:p>
-        </w:tc>
-        <w:tc>
-          <w:tcPr/>
-          <w:p>
-            <w:pPr>
-              <w:pStyle w:val="Compact"/>
-              <w:jc w:val="left"/>
-            </w:pPr>
-            <w:r>
-              <w:t xml:space="preserve">2,813</w:t>
-            </w:r>
-          </w:p>
-        </w:tc>
-        <w:tc>
-          <w:tcPr/>
-          <w:p>
-            <w:pPr>
-              <w:pStyle w:val="Compact"/>
-              <w:jc w:val="left"/>
-            </w:pPr>
-            <w:r>
-              <w:t xml:space="preserve">3,086</w:t>
-            </w:r>
-          </w:p>
-        </w:tc>
-        <w:tc>
-          <w:tcPr/>
-          <w:p>
-            <w:pPr>
-              <w:pStyle w:val="Compact"/>
-              <w:jc w:val="left"/>
-            </w:pPr>
-            <w:r>
-              <w:t xml:space="preserve">987</w:t>
-            </w:r>
-          </w:p>
-        </w:tc>
-        <w:tc>
-          <w:tcPr/>
-          <w:p>
-            <w:pPr>
-              <w:pStyle w:val="Compact"/>
-              <w:jc w:val="left"/>
-            </w:pPr>
-            <w:r>
-              <w:t xml:space="preserve">1,038</w:t>
+              <w:t xml:space="preserve">42</w:t>
+            </w:r>
+          </w:p>
+        </w:tc>
+        <w:tc>
+          <w:tcPr/>
+          <w:p>
+            <w:pPr>
+              <w:pStyle w:val="Compact"/>
+              <w:jc w:val="left"/>
+            </w:pPr>
+            <w:r>
+              <w:t xml:space="preserve">63</w:t>
+            </w:r>
+          </w:p>
+        </w:tc>
+        <w:tc>
+          <w:tcPr/>
+          <w:p>
+            <w:pPr>
+              <w:pStyle w:val="Compact"/>
+              <w:jc w:val="left"/>
+            </w:pPr>
+            <w:r>
+              <w:t xml:space="preserve">132</w:t>
+            </w:r>
+          </w:p>
+        </w:tc>
+        <w:tc>
+          <w:tcPr/>
+          <w:p>
+            <w:pPr>
+              <w:pStyle w:val="Compact"/>
+              <w:jc w:val="left"/>
+            </w:pPr>
+            <w:r>
+              <w:t xml:space="preserve">348</w:t>
+            </w:r>
+          </w:p>
+        </w:tc>
+        <w:tc>
+          <w:tcPr/>
+          <w:p>
+            <w:pPr>
+              <w:pStyle w:val="Compact"/>
+              <w:jc w:val="left"/>
+            </w:pPr>
+            <w:r>
+              <w:t xml:space="preserve">1,709</w:t>
+            </w:r>
+          </w:p>
+        </w:tc>
+        <w:tc>
+          <w:tcPr/>
+          <w:p>
+            <w:pPr>
+              <w:pStyle w:val="Compact"/>
+              <w:jc w:val="left"/>
+            </w:pPr>
+            <w:r>
+              <w:t xml:space="preserve">2,553</w:t>
+            </w:r>
+          </w:p>
+        </w:tc>
+        <w:tc>
+          <w:tcPr/>
+          <w:p>
+            <w:pPr>
+              <w:pStyle w:val="Compact"/>
+              <w:jc w:val="left"/>
+            </w:pPr>
+            <w:r>
+              <w:t xml:space="preserve">2,937</w:t>
+            </w:r>
+          </w:p>
+        </w:tc>
+        <w:tc>
+          <w:tcPr/>
+          <w:p>
+            <w:pPr>
+              <w:pStyle w:val="Compact"/>
+              <w:jc w:val="left"/>
+            </w:pPr>
+            <w:r>
+              <w:t xml:space="preserve">958</w:t>
+            </w:r>
+          </w:p>
+        </w:tc>
+        <w:tc>
+          <w:tcPr/>
+          <w:p>
+            <w:pPr>
+              <w:pStyle w:val="Compact"/>
+              <w:jc w:val="left"/>
+            </w:pPr>
+            <w:r>
+              <w:t xml:space="preserve">1,048</w:t>
             </w:r>
           </w:p>
         </w:tc>
@@ -28851,91 +28851,91 @@
               <w:jc w:val="left"/>
             </w:pPr>
             <w:r>
-              <w:t xml:space="preserve">1.9x</w:t>
-            </w:r>
-          </w:p>
-        </w:tc>
-        <w:tc>
-          <w:tcPr/>
-          <w:p>
-            <w:pPr>
-              <w:pStyle w:val="Compact"/>
-              <w:jc w:val="left"/>
-            </w:pPr>
-            <w:r>
-              <w:t xml:space="preserve">2.6x</w:t>
-            </w:r>
-          </w:p>
-        </w:tc>
-        <w:tc>
-          <w:tcPr/>
-          <w:p>
-            <w:pPr>
-              <w:pStyle w:val="Compact"/>
-              <w:jc w:val="left"/>
-            </w:pPr>
-            <w:r>
-              <w:t xml:space="preserve">4.3x</w:t>
-            </w:r>
-          </w:p>
-        </w:tc>
-        <w:tc>
-          <w:tcPr/>
-          <w:p>
-            <w:pPr>
-              <w:pStyle w:val="Compact"/>
-              <w:jc w:val="left"/>
-            </w:pPr>
-            <w:r>
-              <w:t xml:space="preserve">7.0x</w:t>
-            </w:r>
-          </w:p>
-        </w:tc>
-        <w:tc>
-          <w:tcPr/>
-          <w:p>
-            <w:pPr>
-              <w:pStyle w:val="Compact"/>
-              <w:jc w:val="left"/>
-            </w:pPr>
-            <w:r>
-              <w:t xml:space="preserve">9.9x</w:t>
-            </w:r>
-          </w:p>
-        </w:tc>
-        <w:tc>
-          <w:tcPr/>
-          <w:p>
-            <w:pPr>
-              <w:pStyle w:val="Compact"/>
-              <w:jc w:val="left"/>
-            </w:pPr>
-            <w:r>
-              <w:t xml:space="preserve">11.4x</w:t>
-            </w:r>
-          </w:p>
-        </w:tc>
-        <w:tc>
-          <w:tcPr/>
-          <w:p>
-            <w:pPr>
-              <w:pStyle w:val="Compact"/>
-              <w:jc w:val="left"/>
-            </w:pPr>
-            <w:r>
-              <w:t xml:space="preserve">471.2x</w:t>
-            </w:r>
-          </w:p>
-        </w:tc>
-        <w:tc>
-          <w:tcPr/>
-          <w:p>
-            <w:pPr>
-              <w:pStyle w:val="Compact"/>
-              <w:jc w:val="left"/>
-            </w:pPr>
-            <w:r>
-              <w:t xml:space="preserve">2115.3x</w:t>
+              <w:t xml:space="preserve">1.8x</w:t>
+            </w:r>
+          </w:p>
+        </w:tc>
+        <w:tc>
+          <w:tcPr/>
+          <w:p>
+            <w:pPr>
+              <w:pStyle w:val="Compact"/>
+              <w:jc w:val="left"/>
+            </w:pPr>
+            <w:r>
+              <w:t xml:space="preserve">2.4x</w:t>
+            </w:r>
+          </w:p>
+        </w:tc>
+        <w:tc>
+          <w:tcPr/>
+          <w:p>
+            <w:pPr>
+              <w:pStyle w:val="Compact"/>
+              <w:jc w:val="left"/>
+            </w:pPr>
+            <w:r>
+              <w:t xml:space="preserve">3.7x</w:t>
+            </w:r>
+          </w:p>
+        </w:tc>
+        <w:tc>
+          <w:tcPr/>
+          <w:p>
+            <w:pPr>
+              <w:pStyle w:val="Compact"/>
+              <w:jc w:val="left"/>
+            </w:pPr>
+            <w:r>
+              <w:t xml:space="preserve">6.4x</w:t>
+            </w:r>
+          </w:p>
+        </w:tc>
+        <w:tc>
+          <w:tcPr/>
+          <w:p>
+            <w:pPr>
+              <w:pStyle w:val="Compact"/>
+              <w:jc w:val="left"/>
+            </w:pPr>
+            <w:r>
+              <w:t xml:space="preserve">8.2x</w:t>
+            </w:r>
+          </w:p>
+        </w:tc>
+        <w:tc>
+          <w:tcPr/>
+          <w:p>
+            <w:pPr>
+              <w:pStyle w:val="Compact"/>
+              <w:jc w:val="left"/>
+            </w:pPr>
+            <w:r>
+              <w:t xml:space="preserve">9.4x</w:t>
+            </w:r>
+          </w:p>
+        </w:tc>
+        <w:tc>
+          <w:tcPr/>
+          <w:p>
+            <w:pPr>
+              <w:pStyle w:val="Compact"/>
+              <w:jc w:val="left"/>
+            </w:pPr>
+            <w:r>
+              <w:t xml:space="preserve">4.5x</w:t>
+            </w:r>
+          </w:p>
+        </w:tc>
+        <w:tc>
+          <w:tcPr/>
+          <w:p>
+            <w:pPr>
+              <w:pStyle w:val="Compact"/>
+              <w:jc w:val="left"/>
+            </w:pPr>
+            <w:r>
+              <w:t xml:space="preserve">2.7x</w:t>
             </w:r>
           </w:p>
         </w:tc>
@@ -28961,7 +28961,7 @@
               <w:jc w:val="left"/>
             </w:pPr>
             <w:r>
-              <w:t xml:space="preserve">6.1%</w:t>
+              <w:t xml:space="preserve">6.0%</w:t>
             </w:r>
           </w:p>
         </w:tc>
@@ -28985,79 +28985,79 @@
               <w:jc w:val="left"/>
             </w:pPr>
             <w:r>
-              <w:t xml:space="preserve">6.6%</w:t>
-            </w:r>
-          </w:p>
-        </w:tc>
-        <w:tc>
-          <w:tcPr/>
-          <w:p>
-            <w:pPr>
-              <w:pStyle w:val="Compact"/>
-              <w:jc w:val="left"/>
-            </w:pPr>
-            <w:r>
-              <w:t xml:space="preserve">8.0%</w:t>
-            </w:r>
-          </w:p>
-        </w:tc>
-        <w:tc>
-          <w:tcPr/>
-          <w:p>
-            <w:pPr>
-              <w:pStyle w:val="Compact"/>
-              <w:jc w:val="left"/>
-            </w:pPr>
-            <w:r>
-              <w:t xml:space="preserve">11.0%</w:t>
-            </w:r>
-          </w:p>
-        </w:tc>
-        <w:tc>
-          <w:tcPr/>
-          <w:p>
-            <w:pPr>
-              <w:pStyle w:val="Compact"/>
-              <w:jc w:val="left"/>
-            </w:pPr>
-            <w:r>
-              <w:t xml:space="preserve">13.4%</w:t>
-            </w:r>
-          </w:p>
-        </w:tc>
-        <w:tc>
-          <w:tcPr/>
-          <w:p>
-            <w:pPr>
-              <w:pStyle w:val="Compact"/>
-              <w:jc w:val="left"/>
-            </w:pPr>
-            <w:r>
-              <w:t xml:space="preserve">14.6%</w:t>
-            </w:r>
-          </w:p>
-        </w:tc>
-        <w:tc>
-          <w:tcPr/>
-          <w:p>
-            <w:pPr>
-              <w:pStyle w:val="Compact"/>
-              <w:jc w:val="left"/>
-            </w:pPr>
-            <w:r>
-              <w:t xml:space="preserve">9.1%</w:t>
-            </w:r>
-          </w:p>
-        </w:tc>
-        <w:tc>
-          <w:tcPr/>
-          <w:p>
-            <w:pPr>
-              <w:pStyle w:val="Compact"/>
-              <w:jc w:val="left"/>
-            </w:pPr>
-            <w:r>
-              <w:t xml:space="preserve">2.9%</w:t>
+              <w:t xml:space="preserve">6.7%</w:t>
+            </w:r>
+          </w:p>
+        </w:tc>
+        <w:tc>
+          <w:tcPr/>
+          <w:p>
+            <w:pPr>
+              <w:pStyle w:val="Compact"/>
+              <w:jc w:val="left"/>
+            </w:pPr>
+            <w:r>
+              <w:t xml:space="preserve">8.4%</w:t>
+            </w:r>
+          </w:p>
+        </w:tc>
+        <w:tc>
+          <w:tcPr/>
+          <w:p>
+            <w:pPr>
+              <w:pStyle w:val="Compact"/>
+              <w:jc w:val="left"/>
+            </w:pPr>
+            <w:r>
+              <w:t xml:space="preserve">10.8%</w:t>
+            </w:r>
+          </w:p>
+        </w:tc>
+        <w:tc>
+          <w:tcPr/>
+          <w:p>
+            <w:pPr>
+              <w:pStyle w:val="Compact"/>
+              <w:jc w:val="left"/>
+            </w:pPr>
+            <w:r>
+              <w:t xml:space="preserve">12.8%</w:t>
+            </w:r>
+          </w:p>
+        </w:tc>
+        <w:tc>
+          <w:tcPr/>
+          <w:p>
+            <w:pPr>
+              <w:pStyle w:val="Compact"/>
+              <w:jc w:val="left"/>
+            </w:pPr>
+            <w:r>
+              <w:t xml:space="preserve">13.8%</w:t>
+            </w:r>
+          </w:p>
+        </w:tc>
+        <w:tc>
+          <w:tcPr/>
+          <w:p>
+            <w:pPr>
+              <w:pStyle w:val="Compact"/>
+              <w:jc w:val="left"/>
+            </w:pPr>
+            <w:r>
+              <w:t xml:space="preserve">9.0%</w:t>
+            </w:r>
+          </w:p>
+        </w:tc>
+        <w:tc>
+          <w:tcPr/>
+          <w:p>
+            <w:pPr>
+              <w:pStyle w:val="Compact"/>
+              <w:jc w:val="left"/>
+            </w:pPr>
+            <w:r>
+              <w:t xml:space="preserve">2.7%</w:t>
             </w:r>
           </w:p>
         </w:tc>
@@ -29784,7 +29784,7 @@
                 <w:b/>
                 <w:bCs/>
               </w:rPr>
-              <w:t xml:space="preserve">7.3%</w:t>
+              <w:t xml:space="preserve">0.7%</w:t>
             </w:r>
           </w:p>
         </w:tc>
@@ -29838,7 +29838,7 @@
                 <w:b/>
                 <w:bCs/>
               </w:rPr>
-              <w:t xml:space="preserve">73.3%</w:t>
+              <w:t xml:space="preserve">72.0%</w:t>
             </w:r>
           </w:p>
         </w:tc>
@@ -29892,7 +29892,7 @@
                 <w:b/>
                 <w:bCs/>
               </w:rPr>
-              <w:t xml:space="preserve">63.3%</w:t>
+              <w:t xml:space="preserve">56.0%</w:t>
             </w:r>
           </w:p>
         </w:tc>
@@ -29946,7 +29946,7 @@
                 <w:b/>
                 <w:bCs/>
               </w:rPr>
-              <w:t xml:space="preserve">38.0%</w:t>
+              <w:t xml:space="preserve">40.7%</w:t>
             </w:r>
           </w:p>
         </w:tc>
@@ -30000,7 +30000,7 @@
                 <w:b/>
                 <w:bCs/>
               </w:rPr>
-              <w:t xml:space="preserve">38.0%</w:t>
+              <w:t xml:space="preserve">34.7%</w:t>
             </w:r>
           </w:p>
         </w:tc>
@@ -30113,7 +30113,7 @@
               <w:t xml:space="preserve"> </w:t>
             </w:r>
             <w:r>
-              <w:t xml:space="preserve">92.7% de probabilidade de caixa positivo</w:t>
+              <w:t xml:space="preserve">99.3% de probabilidade de caixa positivo</w:t>
             </w:r>
           </w:p>
           <w:p>
@@ -30135,7 +30135,7 @@
               <w:t xml:space="preserve"> </w:t>
             </w:r>
             <w:r>
-              <w:t xml:space="preserve">R$ 197.746,61 - valor mais provável ao final</w:t>
+              <w:t xml:space="preserve">R$ 137.084,72 - valor mais provável ao final</w:t>
             </w:r>
           </w:p>
           <w:p>
@@ -30157,7 +30157,7 @@
               <w:t xml:space="preserve"> </w:t>
             </w:r>
             <w:r>
-              <w:t xml:space="preserve">R$ -5.198,67 - pior cenário nos 5% mais pessimistas</w:t>
+              <w:t xml:space="preserve">R$ 3.056,70 - pior cenário nos 5% mais pessimistas</w:t>
             </w:r>
           </w:p>
           <w:p>
@@ -30179,7 +30179,7 @@
               <w:t xml:space="preserve"> </w:t>
             </w:r>
             <w:r>
-              <w:t xml:space="preserve">R$ 1.739.868,78 entre P5 e P95</w:t>
+              <w:t xml:space="preserve">R$ 1.633.344,56 entre P5 e P95</w:t>
             </w:r>
           </w:p>
           <w:bookmarkEnd w:id="591"/>
@@ -30233,7 +30233,7 @@
               <w:t xml:space="preserve"> </w:t>
             </w:r>
             <w:r>
-              <w:t xml:space="preserve">R$ 32.778,43</w:t>
+              <w:t xml:space="preserve">R$ 26.884,89</w:t>
             </w:r>
           </w:p>
           <w:p>
@@ -30255,7 +30255,7 @@
               <w:t xml:space="preserve"> </w:t>
             </w:r>
             <w:r>
-              <w:t xml:space="preserve">74.0%</w:t>
+              <w:t xml:space="preserve">72.7%</w:t>
             </w:r>
           </w:p>
           <w:p>
@@ -30299,7 +30299,7 @@
               </w:numPr>
             </w:pPr>
             <w:r>
-              <w:t xml:space="preserve">⚠️ Modelo funcional mas com margem apertada</w:t>
+              <w:t xml:space="preserve">✅ Modelo robusto com proteção estrutural</w:t>
             </w:r>
           </w:p>
           <w:p>
@@ -30332,23 +30332,23 @@
               <w:spacing w:after="16"/>
             </w:pPr>
             <w:r>
-              <w:t xml:space="preserve">⚠️</w:t>
-            </w:r>
-            <w:r>
-              <w:t xml:space="preserve"> </w:t>
-            </w:r>
-            <w:r>
-              <w:rPr>
-                <w:b/>
-                <w:bCs/>
-              </w:rPr>
-              <w:t xml:space="preserve">Criar buffer de R$ 30-50k</w:t>
-            </w:r>
-            <w:r>
-              <w:t xml:space="preserve"> </w:t>
-            </w:r>
-            <w:r>
-              <w:t xml:space="preserve">antes do mês 6 para proteção</w:t>
+              <w:t xml:space="preserve">✅</w:t>
+            </w:r>
+            <w:r>
+              <w:t xml:space="preserve"> </w:t>
+            </w:r>
+            <w:r>
+              <w:rPr>
+                <w:b/>
+                <w:bCs/>
+              </w:rPr>
+              <w:t xml:space="preserve">Manter curso atual</w:t>
+            </w:r>
+            <w:r>
+              <w:t xml:space="preserve"> </w:t>
+            </w:r>
+            <w:r>
+              <w:t xml:space="preserve">- modelo validado, focar em execução</w:t>
             </w:r>
           </w:p>
           <w:p/>
@@ -30763,13 +30763,13 @@
     </w:p>
     <w:bookmarkEnd w:id="606"/>
     <w:bookmarkStart w:id="608" w:name="tier5-32"/>
-    <w:bookmarkStart w:id="607" w:name="o-que-pode-matar-o-negócio"/>
+    <w:bookmarkStart w:id="607" w:name="X6d2e058f7c128aeddde4897359493bb26748ad0"/>
     <w:p>
       <w:pPr>
         <w:pStyle w:val="Heading2"/>
       </w:pPr>
       <w:r>
-        <w:t xml:space="preserve">O que pode matar o negócio?</w:t>
+        <w:t xml:space="preserve">Quais alavancas realmente movem o ponteiro?</w:t>
       </w:r>
     </w:p>
     <w:bookmarkEnd w:id="607"/>
@@ -30794,7 +30794,7 @@
       <w:r>
         <w:drawing>
           <wp:inline>
-            <wp:extent cx="5334000" cy="2693939"/>
+            <wp:extent cx="5334000" cy="2695073"/>
             <wp:effectExtent b="0" l="0" r="0" t="0"/>
             <wp:docPr descr="" title="" id="612" name="Picture"/>
             <a:graphic>
@@ -30815,7 +30815,7 @@
                   <pic:spPr bwMode="auto">
                     <a:xfrm>
                       <a:off x="0" y="0"/>
-                      <a:ext cx="5334000" cy="2693939"/>
+                      <a:ext cx="5334000" cy="2695073"/>
                     </a:xfrm>
                     <a:prstGeom prst="rect">
                       <a:avLst/>
@@ -30970,13 +30970,13 @@
     </w:tbl>
     <w:bookmarkEnd w:id="619"/>
     <w:bookmarkStart w:id="621" w:name="tier5-38"/>
-    <w:bookmarkStart w:id="620" w:name="a-prova-numérica"/>
+    <w:bookmarkStart w:id="620" w:name="tabela-de-dados"/>
     <w:p>
       <w:pPr>
         <w:pStyle w:val="Heading4"/>
       </w:pPr>
       <w:r>
-        <w:t xml:space="preserve">📋 A PROVA NUMÉRICA:</w:t>
+        <w:t xml:space="preserve">📋 TABELA DE DADOS:</w:t>
       </w:r>
     </w:p>
     <w:bookmarkEnd w:id="620"/>
@@ -33149,7 +33149,23 @@
               <w:t xml:space="preserve"> </w:t>
             </w:r>
             <w:r>
-              <w:t xml:space="preserve">Sensibilidade mapeada para 17 variáveis do MC config.</w:t>
+              <w:t xml:space="preserve">A variável</w:t>
+            </w:r>
+            <w:r>
+              <w:t xml:space="preserve"> </w:t>
+            </w:r>
+            <w:r>
+              <w:rPr>
+                <w:b/>
+                <w:bCs/>
+              </w:rPr>
+              <w:t xml:space="preserve">Conv. Trial -&gt; Pago</w:t>
+            </w:r>
+            <w:r>
+              <w:t xml:space="preserve"> </w:t>
+            </w:r>
+            <w:r>
+              <w:t xml:space="preserve">é o maior vetor de volatilidade, com 30% do impacto total.</w:t>
             </w:r>
           </w:p>
           <w:p>
@@ -33171,7 +33187,7 @@
               <w:t xml:space="preserve"> </w:t>
             </w:r>
             <w:r>
-              <w:t xml:space="preserve">Variação de ±22% (std médio do celula_2B_config_MC).</w:t>
+              <w:t xml:space="preserve">As top 3 variáveis (Conv. Trial -&gt; Pago, Churn Base (%), cpc_youtube) explicam 60% da sensibilidade do modelo devido à natureza multiplicativa do Unit Economics.</w:t>
             </w:r>
           </w:p>
           <w:p>
@@ -33193,7 +33209,23 @@
               <w:t xml:space="preserve"> </w:t>
             </w:r>
             <w:r>
-              <w:t xml:space="preserve">Top 3 variáveis explicam ~70% da sensibilidade do LTV/CAC.</w:t>
+              <w:t xml:space="preserve">Erros de estimativa nestes drivers custam desproporcionalmente caro. Otimizar</w:t>
+            </w:r>
+            <w:r>
+              <w:t xml:space="preserve"> </w:t>
+            </w:r>
+            <w:r>
+              <w:rPr>
+                <w:b/>
+                <w:bCs/>
+              </w:rPr>
+              <w:t xml:space="preserve">Conv. Trial -&gt; Pago</w:t>
+            </w:r>
+            <w:r>
+              <w:t xml:space="preserve"> </w:t>
+            </w:r>
+            <w:r>
+              <w:t xml:space="preserve">traz maior ROI que qualquer outra ação.</w:t>
             </w:r>
           </w:p>
           <w:p>
@@ -33215,7 +33247,7 @@
               <w:t xml:space="preserve"> </w:t>
             </w:r>
             <w:r>
-              <w:t xml:space="preserve">Monitorar: Conv. Trial -&gt; Pago, Churn Base (%), cpc_youtube.</w:t>
+              <w:t xml:space="preserve">Criar dashboard semanal específico para monitorar: Conv. Trial -&gt; Pago, Churn Base (%), cpc_youtube.</w:t>
             </w:r>
           </w:p>
           <w:p/>
@@ -33225,7 +33257,7 @@
     <w:bookmarkEnd w:id="627"/>
     <w:bookmarkStart w:id="628" w:name="tier5-43"/>
     <w:bookmarkEnd w:id="628"/>
-    <w:bookmarkStart w:id="637" w:name="tier5-44"/>
+    <w:bookmarkStart w:id="633" w:name="tier5-44"/>
     <w:tbl>
       <w:tblPr>
         <w:tblStyle w:val="Table"/>
@@ -33311,7 +33343,7 @@
               <w:t xml:space="preserve"> </w:t>
             </w:r>
             <w:r>
-              <w:t xml:space="preserve">📖 COMO LER A ANÁLISE DE SENSIBILIDADE (TORNADO PLOT)</w:t>
+              <w:t xml:space="preserve">🧠 COMO INTERPRETAR A SENSIBILIDADE (TORNADO)</w:t>
             </w:r>
           </w:p>
         </w:tc>
@@ -33327,365 +33359,193 @@
               <w:bottom w:w="108" w:type="dxa"/>
             </w:tcMar>
           </w:tcPr>
-          <w:bookmarkStart w:id="631" w:name="o-que-é-essa-análise-de-sensibilidade"/>
-          <w:p>
-            <w:pPr>
-              <w:pStyle w:val="Heading3"/>
-            </w:pPr>
-            <w:r>
-              <w:t xml:space="preserve">O que é essa análise de sensibilidade?</w:t>
-            </w:r>
-          </w:p>
-          <w:p>
-            <w:pPr>
-              <w:pStyle w:val="FirstParagraph"/>
-            </w:pPr>
-            <w:r>
-              <w:t xml:space="preserve">Vamos começar do básico. Essa é uma</w:t>
-            </w:r>
-            <w:r>
-              <w:t xml:space="preserve"> </w:t>
-            </w:r>
-            <w:r>
-              <w:rPr>
-                <w:b/>
-                <w:bCs/>
-              </w:rPr>
-              <w:t xml:space="preserve">análise de sensibilidade</w:t>
-            </w:r>
-            <w:r>
-              <w:t xml:space="preserve">, que é uma forma de testar um modelo financeiro. O objetivo é ver o que acontece com um número importante (nesse caso, o</w:t>
-            </w:r>
-            <w:r>
-              <w:t xml:space="preserve"> </w:t>
-            </w:r>
-            <w:r>
-              <w:rPr>
-                <w:b/>
-                <w:bCs/>
-              </w:rPr>
-              <w:t xml:space="preserve">LTV/CAC</w:t>
-            </w:r>
-            <w:r>
-              <w:t xml:space="preserve">) se você mudar algumas suposições (chamadas de</w:t>
-            </w:r>
-            <w:r>
-              <w:t xml:space="preserve"> </w:t>
-            </w:r>
-            <w:r>
-              <w:t xml:space="preserve">“premissas”</w:t>
-            </w:r>
-            <w:r>
-              <w:t xml:space="preserve">) um pouquinho.</w:t>
-            </w:r>
-          </w:p>
           <w:p>
             <w:pPr>
               <w:pStyle w:val="BodyText"/>
             </w:pPr>
-            <w:r>
-              <w:rPr>
-                <w:i/>
-                <w:iCs/>
-              </w:rPr>
-              <w:t xml:space="preserve">(LTV/CAC Base Atual: 5.1x)</w:t>
-            </w:r>
-          </w:p>
-          <w:bookmarkEnd w:id="631"/>
-          <w:bookmarkStart w:id="632" w:name="o-que-é-um-tornado-plot"/>
-          <w:p>
-            <w:pPr>
-              <w:pStyle w:val="Heading3"/>
-            </w:pPr>
-            <w:r>
-              <w:t xml:space="preserve">O que é um</w:t>
-            </w:r>
-            <w:r>
-              <w:t xml:space="preserve"> </w:t>
-            </w:r>
-            <w:r>
-              <w:t xml:space="preserve">“Tornado Plot”</w:t>
-            </w:r>
-            <w:r>
-              <w:t xml:space="preserve">?</w:t>
-            </w:r>
-          </w:p>
-          <w:p>
-            <w:pPr>
-              <w:pStyle w:val="FirstParagraph"/>
-            </w:pPr>
-            <w:r>
-              <w:t xml:space="preserve">É um gráfico em forma de</w:t>
-            </w:r>
-            <w:r>
-              <w:t xml:space="preserve"> </w:t>
-            </w:r>
-            <w:r>
-              <w:t xml:space="preserve">“tornado”</w:t>
-            </w:r>
-            <w:r>
-              <w:t xml:space="preserve"> </w:t>
-            </w:r>
-            <w:r>
-              <w:t xml:space="preserve">que mostra o</w:t>
-            </w:r>
-            <w:r>
-              <w:t xml:space="preserve"> </w:t>
-            </w:r>
-            <w:r>
-              <w:rPr>
-                <w:b/>
-                <w:bCs/>
-              </w:rPr>
-              <w:t xml:space="preserve">impacto</w:t>
-            </w:r>
-            <w:r>
-              <w:t xml:space="preserve"> </w:t>
-            </w:r>
-            <w:r>
-              <w:t xml:space="preserve">de mudar cada premissa. Eles mudaram cada uma em</w:t>
-            </w:r>
-            <w:r>
-              <w:t xml:space="preserve"> </w:t>
-            </w:r>
-            <w:r>
-              <w:rPr>
-                <w:b/>
-                <w:bCs/>
-              </w:rPr>
-              <w:t xml:space="preserve">±20%</w:t>
-            </w:r>
-            <w:r>
-              <w:t xml:space="preserve">, uma de cada vez. Isso revela quais variáveis são</w:t>
-            </w:r>
-            <w:r>
-              <w:t xml:space="preserve"> </w:t>
-            </w:r>
-            <w:r>
-              <w:t xml:space="preserve">“críticas”</w:t>
-            </w:r>
-            <w:r>
-              <w:t xml:space="preserve"> </w:t>
-            </w:r>
-            <w:r>
-              <w:t xml:space="preserve">e quais são</w:t>
-            </w:r>
-            <w:r>
-              <w:t xml:space="preserve"> </w:t>
-            </w:r>
-            <w:r>
-              <w:t xml:space="preserve">“meh”</w:t>
-            </w:r>
-            <w:r>
-              <w:t xml:space="preserve">.</w:t>
-            </w:r>
-          </w:p>
-          <w:bookmarkEnd w:id="632"/>
-          <w:bookmarkStart w:id="633" w:name="cores-e-barras-o-que-significam"/>
-          <w:p>
-            <w:pPr>
-              <w:pStyle w:val="Heading3"/>
-            </w:pPr>
-            <w:r>
-              <w:t xml:space="preserve">Cores e barras: O que significam?</w:t>
-            </w:r>
-          </w:p>
-          <w:p>
-            <w:pPr>
-              <w:pStyle w:val="Compact"/>
-              <w:numPr>
-                <w:ilvl w:val="0"/>
-                <w:numId w:val="1070"/>
-              </w:numPr>
-            </w:pPr>
-            <w:r>
-              <w:rPr>
-                <w:b/>
-                <w:bCs/>
-              </w:rPr>
-              <w:t xml:space="preserve">Barra vermelha (esquerda,</w:t>
-            </w:r>
-            <w:r>
-              <w:rPr>
-                <w:b/>
-                <w:bCs/>
-              </w:rPr>
-              <w:t xml:space="preserve"> </w:t>
-            </w:r>
-            <w:r>
-              <w:rPr>
-                <w:b/>
-                <w:bCs/>
-              </w:rPr>
-              <w:t xml:space="preserve">“Risco”</w:t>
-            </w:r>
-            <w:r>
-              <w:rPr>
-                <w:b/>
-                <w:bCs/>
-              </w:rPr>
-              <w:t xml:space="preserve">):</w:t>
-            </w:r>
-            <w:r>
-              <w:t xml:space="preserve"> </w:t>
-            </w:r>
-            <w:r>
-              <w:t xml:space="preserve">Mostra o que acontece se a variável mudar de um jeito RUIM (reduz o LTV/CAC).</w:t>
-            </w:r>
-          </w:p>
-          <w:p>
-            <w:pPr>
-              <w:pStyle w:val="Compact"/>
-              <w:numPr>
-                <w:ilvl w:val="0"/>
-                <w:numId w:val="1070"/>
-              </w:numPr>
-            </w:pPr>
-            <w:r>
-              <w:rPr>
-                <w:b/>
-                <w:bCs/>
-              </w:rPr>
-              <w:t xml:space="preserve">Barra verde (direita,</w:t>
-            </w:r>
-            <w:r>
-              <w:rPr>
-                <w:b/>
-                <w:bCs/>
-              </w:rPr>
-              <w:t xml:space="preserve"> </w:t>
-            </w:r>
-            <w:r>
-              <w:rPr>
-                <w:b/>
-                <w:bCs/>
-              </w:rPr>
-              <w:t xml:space="preserve">“Oportunidade”</w:t>
-            </w:r>
-            <w:r>
-              <w:rPr>
-                <w:b/>
-                <w:bCs/>
-              </w:rPr>
-              <w:t xml:space="preserve">):</w:t>
-            </w:r>
-            <w:r>
-              <w:t xml:space="preserve"> </w:t>
-            </w:r>
-            <w:r>
-              <w:t xml:space="preserve">Mostra o que acontece se a variável mudar de um jeito BOM (aumenta o LTV/CAC).</w:t>
-            </w:r>
-          </w:p>
-          <w:p>
-            <w:pPr>
-              <w:pStyle w:val="Compact"/>
-              <w:numPr>
-                <w:ilvl w:val="0"/>
-                <w:numId w:val="1070"/>
-              </w:numPr>
-            </w:pPr>
-            <w:r>
-              <w:rPr>
-                <w:b/>
-                <w:bCs/>
-              </w:rPr>
-              <w:t xml:space="preserve">Largura da barra:</w:t>
-            </w:r>
-            <w:r>
-              <w:t xml:space="preserve"> </w:t>
-            </w:r>
-            <w:r>
-              <w:t xml:space="preserve">Quanto mais larga, mais sensível é o LTV/CAC a essa variável.</w:t>
-            </w:r>
-          </w:p>
-          <w:p>
-            <w:pPr>
-              <w:pStyle w:val="Compact"/>
-              <w:numPr>
-                <w:ilvl w:val="0"/>
-                <w:numId w:val="1070"/>
-              </w:numPr>
-            </w:pPr>
-            <w:r>
-              <w:rPr>
-                <w:b/>
-                <w:bCs/>
-              </w:rPr>
-              <w:t xml:space="preserve">Números nas barras (ex: 3.8x):</w:t>
-            </w:r>
-            <w:r>
-              <w:t xml:space="preserve"> </w:t>
-            </w:r>
-            <w:r>
-              <w:t xml:space="preserve">É o novo LTV/CAC após a mudança.</w:t>
-            </w:r>
-          </w:p>
-          <w:bookmarkEnd w:id="633"/>
-          <w:bookmarkStart w:id="634" w:name="dica-prática-regra-de-ouro"/>
-          <w:p>
-            <w:pPr>
-              <w:pStyle w:val="Heading3"/>
-            </w:pPr>
-            <w:r>
-              <w:t xml:space="preserve">Dica prática (Regra de Ouro)</w:t>
-            </w:r>
-          </w:p>
-          <w:p>
-            <w:pPr>
-              <w:pStyle w:val="Compact"/>
-              <w:numPr>
-                <w:ilvl w:val="0"/>
-                <w:numId w:val="1071"/>
-              </w:numPr>
-            </w:pPr>
-            <w:r>
-              <w:t xml:space="preserve">Foque nas barras largas (topo do tornado): Elas são as que importam!</w:t>
-            </w:r>
-          </w:p>
-          <w:p>
-            <w:pPr>
-              <w:pStyle w:val="Compact"/>
-              <w:numPr>
-                <w:ilvl w:val="0"/>
-                <w:numId w:val="1071"/>
-              </w:numPr>
-            </w:pPr>
-            <w:r>
-              <w:t xml:space="preserve">Ignore as barras curtas (base): Mudar</w:t>
-            </w:r>
-            <w:r>
-              <w:t xml:space="preserve"> </w:t>
-            </w:r>
-            <w:r>
-              <w:t xml:space="preserve">“Budget Marketing”</w:t>
-            </w:r>
-            <w:r>
-              <w:t xml:space="preserve"> </w:t>
-            </w:r>
-            <w:r>
-              <w:t xml:space="preserve">ou</w:t>
-            </w:r>
-            <w:r>
-              <w:t xml:space="preserve"> </w:t>
-            </w:r>
-            <w:r>
-              <w:t xml:space="preserve">“Imposto”</w:t>
-            </w:r>
-            <w:r>
-              <w:t xml:space="preserve"> </w:t>
-            </w:r>
-            <w:r>
-              <w:t xml:space="preserve">não faz muita diferença.</w:t>
+            <w:pPr>
+              <w:spacing w:before="16"/>
+            </w:pPr>
+            <w:r>
+              <w:rPr>
+                <w:b/>
+                <w:bCs/>
+              </w:rPr>
+              <w:t xml:space="preserve">OBJETIVO ESTRATÉGICO:</w:t>
+            </w:r>
+            <w:r>
+              <w:t xml:space="preserve"> </w:t>
+            </w:r>
+            <w:r>
+              <w:t xml:space="preserve">Identificar a</w:t>
+            </w:r>
+            <w:r>
+              <w:t xml:space="preserve"> </w:t>
+            </w:r>
+            <w:r>
+              <w:rPr>
+                <w:b/>
+                <w:bCs/>
+              </w:rPr>
+              <w:t xml:space="preserve">elasticidade</w:t>
+            </w:r>
+            <w:r>
+              <w:t xml:space="preserve"> </w:t>
+            </w:r>
+            <w:r>
+              <w:t xml:space="preserve">do modelo de negócios. O gráfico hierarquiza as premissas onde um erro de estimativa (ou sucesso na execução) tem maior alavancagem sobre o resultado final.</w:t>
+            </w:r>
+          </w:p>
+          <w:p>
+            <w:pPr>
+              <w:pStyle w:val="BodyText"/>
+            </w:pPr>
+            <w:r>
+              <w:rPr>
+                <w:b/>
+                <w:bCs/>
+              </w:rPr>
+              <w:t xml:space="preserve">LEITURA TÉCNICA:</w:t>
+            </w:r>
+            <w:r>
+              <w:t xml:space="preserve"> </w:t>
+            </w:r>
+            <w:r>
+              <w:t xml:space="preserve">*</w:t>
+            </w:r>
+            <w:r>
+              <w:t xml:space="preserve"> </w:t>
+            </w:r>
+            <w:r>
+              <w:rPr>
+                <w:b/>
+                <w:bCs/>
+              </w:rPr>
+              <w:t xml:space="preserve">Eixo Central (5.1x):</w:t>
+            </w:r>
+            <w:r>
+              <w:t xml:space="preserve"> </w:t>
+            </w:r>
+            <w:r>
+              <w:t xml:space="preserve">O LTV/CAC projetado no cenário base.</w:t>
+            </w:r>
+            <w:r>
+              <w:t xml:space="preserve"> </w:t>
+            </w:r>
+            <w:r>
+              <w:t xml:space="preserve">*</w:t>
+            </w:r>
+            <w:r>
+              <w:t xml:space="preserve"> </w:t>
+            </w:r>
+            <w:r>
+              <w:rPr>
+                <w:b/>
+                <w:bCs/>
+              </w:rPr>
+              <w:t xml:space="preserve">Largura das Barras:</w:t>
+            </w:r>
+            <w:r>
+              <w:t xml:space="preserve"> </w:t>
+            </w:r>
+            <w:r>
+              <w:t xml:space="preserve">A volatilidade gerada ao oscilar cada premissa individualmente em</w:t>
+            </w:r>
+            <w:r>
+              <w:t xml:space="preserve"> </w:t>
+            </w:r>
+            <w:r>
+              <w:rPr>
+                <w:b/>
+                <w:bCs/>
+              </w:rPr>
+              <w:t xml:space="preserve">±22%</w:t>
+            </w:r>
+            <w:r>
+              <w:t xml:space="preserve"> </w:t>
+            </w:r>
+            <w:r>
+              <w:t xml:space="preserve">(Ceteris Paribus).</w:t>
+            </w:r>
+            <w:r>
+              <w:t xml:space="preserve"> </w:t>
+            </w:r>
+            <w:r>
+              <w:t xml:space="preserve">*</w:t>
+            </w:r>
+            <w:r>
+              <w:t xml:space="preserve"> </w:t>
+            </w:r>
+            <w:r>
+              <w:rPr>
+                <w:b/>
+                <w:bCs/>
+              </w:rPr>
+              <w:t xml:space="preserve">Assimetria:</w:t>
+            </w:r>
+            <w:r>
+              <w:t xml:space="preserve"> </w:t>
+            </w:r>
+            <w:r>
+              <w:t xml:space="preserve">Observe se a barra cresce mais para a esquerda (Risco de Downside) ou direita (Oportunidade de Upside).</w:t>
+            </w:r>
+          </w:p>
+          <w:p>
+            <w:pPr>
+              <w:pStyle w:val="BodyText"/>
+            </w:pPr>
+            <w:pPr>
+              <w:spacing w:after="16"/>
+            </w:pPr>
+            <w:r>
+              <w:rPr>
+                <w:b/>
+                <w:bCs/>
+              </w:rPr>
+              <w:t xml:space="preserve">DECISÃO GERENCIAL (PARETO 80/20):</w:t>
+            </w:r>
+            <w:r>
+              <w:t xml:space="preserve"> </w:t>
+            </w:r>
+            <w:r>
+              <w:t xml:space="preserve">As variáveis no</w:t>
+            </w:r>
+            <w:r>
+              <w:t xml:space="preserve"> </w:t>
+            </w:r>
+            <w:r>
+              <w:rPr>
+                <w:b/>
+                <w:bCs/>
+              </w:rPr>
+              <w:t xml:space="preserve">topo do funil</w:t>
+            </w:r>
+            <w:r>
+              <w:t xml:space="preserve"> </w:t>
+            </w:r>
+            <w:r>
+              <w:t xml:space="preserve">são os</w:t>
+            </w:r>
+            <w:r>
+              <w:t xml:space="preserve"> </w:t>
+            </w:r>
+            <w:r>
+              <w:t xml:space="preserve">“Control Levers”</w:t>
+            </w:r>
+            <w:r>
+              <w:t xml:space="preserve"> </w:t>
+            </w:r>
+            <w:r>
+              <w:t xml:space="preserve">do negócio. O CEO deve focar 80% do tempo em otimizar e controlar estas métricas críticas, pois elas ditam a viabilidade da empresa. Variáveis na base são ruído e não merecem microgerenciamento.</w:t>
             </w:r>
           </w:p>
           <w:p/>
         </w:tc>
       </w:tr>
     </w:tbl>
-    <w:bookmarkEnd w:id="634"/>
     <w:p>
       <w:pPr>
-        <w:pStyle w:val="FirstParagraph"/>
+        <w:pStyle w:val="BodyText"/>
       </w:pPr>
       <w:r>
         <w:t xml:space="preserve"> </w:t>
@@ -33732,12 +33592,12 @@
                 <wp:inline>
                   <wp:extent cx="152400" cy="152400"/>
                   <wp:effectExtent b="0" l="0" r="0" t="0"/>
-                  <wp:docPr descr="" title="" id="635" name="Picture"/>
+                  <wp:docPr descr="" title="" id="631" name="Picture"/>
                   <a:graphic>
                     <a:graphicData uri="http://schemas.openxmlformats.org/drawingml/2006/picture">
                       <pic:pic>
                         <pic:nvPicPr>
-                          <pic:cNvPr descr="C:\Users\User\AppData\Local\Programs\Quarto\share\formats\docx\tip.png" id="636" name="Picture"/>
+                          <pic:cNvPr descr="C:\Users\User\AppData\Local\Programs\Quarto\share\formats\docx\tip.png" id="632" name="Picture"/>
                           <pic:cNvPicPr>
                             <a:picLocks noChangeArrowheads="1" noChangeAspect="1"/>
                           </pic:cNvPicPr>
@@ -33808,7 +33668,7 @@
               <w:pStyle w:val="Compact"/>
               <w:numPr>
                 <w:ilvl w:val="0"/>
-                <w:numId w:val="1072"/>
+                <w:numId w:val="1070"/>
               </w:numPr>
             </w:pPr>
             <w:r>
@@ -33822,17 +33682,17 @@
               <w:t xml:space="preserve"> </w:t>
             </w:r>
             <w:r>
-              <w:t xml:space="preserve">Nota de eficiência do negócio. Quanto dinheiro o cliente traz (LTV) dividido pelo custo para atraí-lo (CAC).</w:t>
-            </w:r>
-            <w:r>
-              <w:t xml:space="preserve"> </w:t>
-            </w:r>
-            <w:r>
-              <w:rPr>
-                <w:b/>
-                <w:bCs/>
-              </w:rPr>
-              <w:t xml:space="preserve">Ideal &gt; 3.0x</w:t>
+              <w:t xml:space="preserve">Relação entre o Valor Vitalício do Cliente e o Custo de Aquisição. Indica o retorno sobre o investimento em marketing.</w:t>
+            </w:r>
+            <w:r>
+              <w:t xml:space="preserve"> </w:t>
+            </w:r>
+            <w:r>
+              <w:rPr>
+                <w:b/>
+                <w:bCs/>
+              </w:rPr>
+              <w:t xml:space="preserve">Benchmark Seguro: &gt; 3.0x</w:t>
             </w:r>
             <w:r>
               <w:t xml:space="preserve">.</w:t>
@@ -33843,7 +33703,7 @@
               <w:pStyle w:val="Compact"/>
               <w:numPr>
                 <w:ilvl w:val="0"/>
-                <w:numId w:val="1072"/>
+                <w:numId w:val="1070"/>
               </w:numPr>
             </w:pPr>
             <w:r>
@@ -33857,7 +33717,7 @@
               <w:t xml:space="preserve"> </w:t>
             </w:r>
             <w:r>
-              <w:t xml:space="preserve">Taxa de cancelamento. Quantos clientes desistem do produto todo mês. Quanto menor, melhor.</w:t>
+              <w:t xml:space="preserve">Taxa de cancelamento mensal. Percentual da base de clientes que deixa de pagar o produto.</w:t>
             </w:r>
           </w:p>
           <w:p>
@@ -33865,7 +33725,7 @@
               <w:pStyle w:val="Compact"/>
               <w:numPr>
                 <w:ilvl w:val="0"/>
-                <w:numId w:val="1072"/>
+                <w:numId w:val="1070"/>
               </w:numPr>
             </w:pPr>
             <w:r>
@@ -33879,7 +33739,7 @@
               <w:t xml:space="preserve"> </w:t>
             </w:r>
             <w:r>
-              <w:t xml:space="preserve">Taxa de conversão. De cada 100 pessoas que testam de graça (Trial), quantas viram pagantes de verdade.</w:t>
+              <w:t xml:space="preserve">Taxa de conversão de usuários em teste (Trial) para assinantes pagantes.</w:t>
             </w:r>
           </w:p>
           <w:p>
@@ -33887,7 +33747,7 @@
               <w:pStyle w:val="Compact"/>
               <w:numPr>
                 <w:ilvl w:val="0"/>
-                <w:numId w:val="1072"/>
+                <w:numId w:val="1070"/>
               </w:numPr>
             </w:pPr>
             <w:r>
@@ -33901,19 +33761,7 @@
               <w:t xml:space="preserve"> </w:t>
             </w:r>
             <w:r>
-              <w:t xml:space="preserve">Valor pago a plataformas (Google, YouTube) por cada clique no seu anúncio.</w:t>
-            </w:r>
-            <w:r>
-              <w:t xml:space="preserve"> </w:t>
-            </w:r>
-            <w:r>
-              <w:t xml:space="preserve">“cpc_youtube”</w:t>
-            </w:r>
-            <w:r>
-              <w:t xml:space="preserve"> </w:t>
-            </w:r>
-            <w:r>
-              <w:t xml:space="preserve">é específico para vídeos.</w:t>
+              <w:t xml:space="preserve">Valor pago às plataformas de anúncios (Ads) por cada clique gerado.</w:t>
             </w:r>
           </w:p>
           <w:p>
@@ -33921,7 +33769,7 @@
               <w:pStyle w:val="Compact"/>
               <w:numPr>
                 <w:ilvl w:val="0"/>
-                <w:numId w:val="1072"/>
+                <w:numId w:val="1070"/>
               </w:numPr>
             </w:pPr>
             <w:r>
@@ -33935,7 +33783,7 @@
               <w:t xml:space="preserve"> </w:t>
             </w:r>
             <w:r>
-              <w:t xml:space="preserve">Eficiência do site/landing page. De cada 100 visitantes, quantos criam uma conta de teste.</w:t>
+              <w:t xml:space="preserve">Eficiência da Landing Page em converter tráfego frio em cadastros (Leads/Trial).</w:t>
             </w:r>
           </w:p>
           <w:p>
@@ -33943,7 +33791,7 @@
               <w:pStyle w:val="Compact"/>
               <w:numPr>
                 <w:ilvl w:val="0"/>
-                <w:numId w:val="1072"/>
+                <w:numId w:val="1070"/>
               </w:numPr>
             </w:pPr>
             <w:r>
@@ -33951,21 +33799,21 @@
                 <w:b/>
                 <w:bCs/>
               </w:rPr>
-              <w:t xml:space="preserve">ARPU / Preço Trader:</w:t>
-            </w:r>
-            <w:r>
-              <w:t xml:space="preserve"> </w:t>
-            </w:r>
-            <w:r>
-              <w:t xml:space="preserve">Receita média por usuário ou preço da assinatura principal.</w:t>
+              <w:t xml:space="preserve">ARPU:</w:t>
+            </w:r>
+            <w:r>
+              <w:t xml:space="preserve"> </w:t>
+            </w:r>
+            <w:r>
+              <w:t xml:space="preserve">Receita Média por Usuário (Average Revenue Per User). Ticket médio mensal pago por cada cliente ativo.</w:t>
             </w:r>
           </w:p>
           <w:p/>
         </w:tc>
       </w:tr>
     </w:tbl>
-    <w:bookmarkEnd w:id="637"/>
-    <w:bookmarkStart w:id="638" w:name="tier5-45"/>
+    <w:bookmarkEnd w:id="633"/>
+    <w:bookmarkStart w:id="634" w:name="tier5-45"/>
     <w:p>
       <w:pPr>
         <w:pStyle w:val="FirstParagraph"/>
@@ -33978,8 +33826,8 @@
         <w:t xml:space="preserve">Tabela 5.2: Top 5 Variáveis de Maior Sensibilidade (Ranking de Risco)</w:t>
       </w:r>
     </w:p>
-    <w:bookmarkEnd w:id="638"/>
-    <w:bookmarkStart w:id="639" w:name="tier5-46"/>
+    <w:bookmarkEnd w:id="634"/>
+    <w:bookmarkStart w:id="635" w:name="tier5-46"/>
     <w:tbl>
       <w:tblPr>
         <w:tblStyle w:val="Table"/>
@@ -34370,8 +34218,8 @@
         </w:tc>
       </w:tr>
     </w:tbl>
-    <w:bookmarkEnd w:id="639"/>
-    <w:bookmarkStart w:id="642" w:name="tier5-47"/>
+    <w:bookmarkEnd w:id="635"/>
+    <w:bookmarkStart w:id="638" w:name="tier5-47"/>
     <w:tbl>
       <w:tblPr>
         <w:tblStyle w:val="Table"/>
@@ -34413,12 +34261,12 @@
                 <wp:inline>
                   <wp:extent cx="152400" cy="152400"/>
                   <wp:effectExtent b="0" l="0" r="0" t="0"/>
-                  <wp:docPr descr="" title="" id="640" name="Picture"/>
+                  <wp:docPr descr="" title="" id="636" name="Picture"/>
                   <a:graphic>
                     <a:graphicData uri="http://schemas.openxmlformats.org/drawingml/2006/picture">
                       <pic:pic>
                         <pic:nvPicPr>
-                          <pic:cNvPr descr="C:\Users\User\AppData\Local\Programs\Quarto\share\formats\docx\tip.png" id="641" name="Picture"/>
+                          <pic:cNvPr descr="C:\Users\User\AppData\Local\Programs\Quarto\share\formats\docx\tip.png" id="637" name="Picture"/>
                           <pic:cNvPicPr>
                             <a:picLocks noChangeArrowheads="1" noChangeAspect="1"/>
                           </pic:cNvPicPr>
@@ -34478,7 +34326,7 @@
               <w:pStyle w:val="Compact"/>
               <w:numPr>
                 <w:ilvl w:val="0"/>
-                <w:numId w:val="1073"/>
+                <w:numId w:val="1071"/>
               </w:numPr>
             </w:pPr>
             <w:r>
@@ -34500,7 +34348,7 @@
               <w:pStyle w:val="Compact"/>
               <w:numPr>
                 <w:ilvl w:val="0"/>
-                <w:numId w:val="1073"/>
+                <w:numId w:val="1071"/>
               </w:numPr>
             </w:pPr>
             <w:r>
@@ -34522,7 +34370,7 @@
               <w:pStyle w:val="Compact"/>
               <w:numPr>
                 <w:ilvl w:val="0"/>
-                <w:numId w:val="1073"/>
+                <w:numId w:val="1071"/>
               </w:numPr>
             </w:pPr>
             <w:r>
@@ -34544,7 +34392,7 @@
               <w:pStyle w:val="Compact"/>
               <w:numPr>
                 <w:ilvl w:val="0"/>
-                <w:numId w:val="1073"/>
+                <w:numId w:val="1071"/>
               </w:numPr>
             </w:pPr>
             <w:r>
@@ -34565,8 +34413,8 @@
         </w:tc>
       </w:tr>
     </w:tbl>
-    <w:bookmarkEnd w:id="642"/>
-    <w:bookmarkStart w:id="646" w:name="tier5-48"/>
+    <w:bookmarkEnd w:id="638"/>
+    <w:bookmarkStart w:id="642" w:name="tier5-48"/>
     <w:tbl>
       <w:tblPr>
         <w:tblStyle w:val="Table"/>
@@ -34619,7 +34467,7 @@
               <w:bottom w:w="108" w:type="dxa"/>
             </w:tcMar>
           </w:tcPr>
-          <w:bookmarkStart w:id="643" w:name="fato"/>
+          <w:bookmarkStart w:id="639" w:name="fato"/>
           <w:p>
             <w:pPr>
               <w:pStyle w:val="Heading4"/>
@@ -34674,8 +34522,8 @@
               <w:t xml:space="preserve">sozinha, ela afeta o resultado mais do que as 11 últimas variáveis somadas.</w:t>
             </w:r>
           </w:p>
-          <w:bookmarkEnd w:id="643"/>
-          <w:bookmarkStart w:id="644" w:name="causa"/>
+          <w:bookmarkEnd w:id="639"/>
+          <w:bookmarkStart w:id="640" w:name="causa"/>
           <w:p>
             <w:pPr>
               <w:pStyle w:val="Heading4"/>
@@ -34724,8 +34572,8 @@
               <w:t xml:space="preserve">de toda a variabilidade do modelo. Isso ocorre pela natureza multiplicativa da fórmula do Unit Economics.</w:t>
             </w:r>
           </w:p>
-          <w:bookmarkEnd w:id="644"/>
-          <w:bookmarkStart w:id="645" w:name="implicação-prática"/>
+          <w:bookmarkEnd w:id="640"/>
+          <w:bookmarkStart w:id="641" w:name="implicação-prática"/>
           <w:p>
             <w:pPr>
               <w:pStyle w:val="Heading4"/>
@@ -34797,9 +34645,9 @@
         </w:tc>
       </w:tr>
     </w:tbl>
-    <w:bookmarkEnd w:id="645"/>
-    <w:bookmarkEnd w:id="646"/>
-    <w:bookmarkStart w:id="649" w:name="tier5-49"/>
+    <w:bookmarkEnd w:id="641"/>
+    <w:bookmarkEnd w:id="642"/>
+    <w:bookmarkStart w:id="645" w:name="tier5-49"/>
     <w:tbl>
       <w:tblPr>
         <w:tblStyle w:val="Table"/>
@@ -34841,12 +34689,12 @@
                 <wp:inline>
                   <wp:extent cx="152400" cy="152400"/>
                   <wp:effectExtent b="0" l="0" r="0" t="0"/>
-                  <wp:docPr descr="" title="" id="647" name="Picture"/>
+                  <wp:docPr descr="" title="" id="643" name="Picture"/>
                   <a:graphic>
                     <a:graphicData uri="http://schemas.openxmlformats.org/drawingml/2006/picture">
                       <pic:pic>
                         <pic:nvPicPr>
-                          <pic:cNvPr descr="C:\Users\User\AppData\Local\Programs\Quarto\share\formats\docx\note.png" id="648" name="Picture"/>
+                          <pic:cNvPr descr="C:\Users\User\AppData\Local\Programs\Quarto\share\formats\docx\note.png" id="644" name="Picture"/>
                           <pic:cNvPicPr>
                             <a:picLocks noChangeArrowheads="1" noChangeAspect="1"/>
                           </pic:cNvPicPr>
@@ -34958,8 +34806,8 @@
         </w:tc>
       </w:tr>
     </w:tbl>
-    <w:bookmarkEnd w:id="649"/>
-    <w:bookmarkStart w:id="650" w:name="tier5-50"/>
+    <w:bookmarkEnd w:id="645"/>
+    <w:bookmarkStart w:id="646" w:name="tier5-50"/>
     <w:p>
       <w:r>
         <w:pict>
@@ -34967,9 +34815,9 @@
         </w:pict>
       </w:r>
     </w:p>
-    <w:bookmarkEnd w:id="650"/>
-    <w:bookmarkStart w:id="652" w:name="tier5-51"/>
-    <w:bookmarkStart w:id="651" w:name="ato-3-análise-de-resiliência-de-runway"/>
+    <w:bookmarkEnd w:id="646"/>
+    <w:bookmarkStart w:id="648" w:name="tier5-51"/>
+    <w:bookmarkStart w:id="647" w:name="ato-3-análise-de-resiliência-de-runway"/>
     <w:p>
       <w:pPr>
         <w:pStyle w:val="Heading2"/>
@@ -34978,9 +34826,9 @@
         <w:t xml:space="preserve">🛡️ ATO 3: Análise de Resiliência de Runway</w:t>
       </w:r>
     </w:p>
-    <w:bookmarkEnd w:id="651"/>
-    <w:bookmarkEnd w:id="652"/>
-    <w:bookmarkStart w:id="653" w:name="tier5-52"/>
+    <w:bookmarkEnd w:id="647"/>
+    <w:bookmarkEnd w:id="648"/>
+    <w:bookmarkStart w:id="649" w:name="tier5-52"/>
     <w:p>
       <w:pPr>
         <w:pStyle w:val="FirstParagraph"/>
@@ -34993,29 +34841,29 @@
         <w:t xml:space="preserve">“Por quanto tempo sobrevivemos se tudo der errado?”</w:t>
       </w:r>
     </w:p>
-    <w:bookmarkEnd w:id="653"/>
+    <w:bookmarkEnd w:id="649"/>
     <w:p>
       <w:pPr>
         <w:pStyle w:val="BodyText"/>
       </w:pPr>
-      <w:bookmarkStart w:id="657" w:name="tier5-53"/>
+      <w:bookmarkStart w:id="653" w:name="tier5-53"/>
       <w:r>
         <w:drawing>
           <wp:inline>
             <wp:extent cx="5334000" cy="5910440"/>
             <wp:effectExtent b="0" l="0" r="0" t="0"/>
-            <wp:docPr descr="" title="" id="655" name="Picture"/>
+            <wp:docPr descr="" title="" id="651" name="Picture"/>
             <a:graphic>
               <a:graphicData uri="http://schemas.openxmlformats.org/drawingml/2006/picture">
                 <pic:pic>
                   <pic:nvPicPr>
-                    <pic:cNvPr descr="relatorio_completo_files/figure-docx/tier5-output-53.png" id="656" name="Picture"/>
+                    <pic:cNvPr descr="relatorio_completo_files/figure-docx/tier5-output-53.png" id="652" name="Picture"/>
                     <pic:cNvPicPr>
                       <a:picLocks noChangeArrowheads="1" noChangeAspect="1"/>
                     </pic:cNvPicPr>
                   </pic:nvPicPr>
                   <pic:blipFill>
-                    <a:blip r:embed="rId654"/>
+                    <a:blip r:embed="rId650"/>
                     <a:stretch>
                       <a:fillRect/>
                     </a:stretch>
@@ -35041,11 +34889,11 @@
           </wp:inline>
         </w:drawing>
       </w:r>
-      <w:bookmarkEnd w:id="657"/>
+      <w:bookmarkEnd w:id="653"/>
     </w:p>
-    <w:bookmarkStart w:id="658" w:name="tier5-54"/>
-    <w:bookmarkEnd w:id="658"/>
-    <w:bookmarkStart w:id="659" w:name="tier5-55"/>
+    <w:bookmarkStart w:id="654" w:name="tier5-54"/>
+    <w:bookmarkEnd w:id="654"/>
+    <w:bookmarkStart w:id="655" w:name="tier5-55"/>
     <w:p>
       <w:pPr>
         <w:pStyle w:val="BodyText"/>
@@ -35058,8 +34906,8 @@
         <w:t xml:space="preserve">Fonte: df_real_m (5A), df_ideal_m (5B), df_stress_m (5C) | Motor V13 | Célula 4</w:t>
       </w:r>
     </w:p>
-    <w:bookmarkEnd w:id="659"/>
-    <w:bookmarkStart w:id="665" w:name="tier5-56"/>
+    <w:bookmarkEnd w:id="655"/>
+    <w:bookmarkStart w:id="661" w:name="tier5-56"/>
     <w:tbl>
       <w:tblPr>
         <w:tblStyle w:val="Table"/>
@@ -35101,12 +34949,12 @@
                 <wp:inline>
                   <wp:extent cx="152400" cy="152400"/>
                   <wp:effectExtent b="0" l="0" r="0" t="0"/>
-                  <wp:docPr descr="" title="" id="660" name="Picture"/>
+                  <wp:docPr descr="" title="" id="656" name="Picture"/>
                   <a:graphic>
                     <a:graphicData uri="http://schemas.openxmlformats.org/drawingml/2006/picture">
                       <pic:pic>
                         <pic:nvPicPr>
-                          <pic:cNvPr descr="C:\Users\User\AppData\Local\Programs\Quarto\share\formats\docx\note.png" id="661" name="Picture"/>
+                          <pic:cNvPr descr="C:\Users\User\AppData\Local\Programs\Quarto\share\formats\docx\note.png" id="657" name="Picture"/>
                           <pic:cNvPicPr>
                             <a:picLocks noChangeArrowheads="1" noChangeAspect="1"/>
                           </pic:cNvPicPr>
@@ -35161,7 +35009,7 @@
               <w:bottom w:w="108" w:type="dxa"/>
             </w:tcMar>
           </w:tcPr>
-          <w:bookmarkStart w:id="662" w:name="o-que-é-essa-análise"/>
+          <w:bookmarkStart w:id="658" w:name="o-que-é-essa-análise"/>
           <w:p>
             <w:pPr>
               <w:pStyle w:val="Heading3"/>
@@ -35231,8 +35079,8 @@
               <w:t xml:space="preserve">(Runway Mínimo Atual: 1.0 meses no M1)</w:t>
             </w:r>
           </w:p>
-          <w:bookmarkEnd w:id="662"/>
-          <w:bookmarkStart w:id="663" w:name="o-que-são-os-5-gráficos"/>
+          <w:bookmarkEnd w:id="658"/>
+          <w:bookmarkStart w:id="659" w:name="o-que-são-os-5-gráficos"/>
           <w:p>
             <w:pPr>
               <w:pStyle w:val="Heading3"/>
@@ -35540,8 +35388,8 @@
               <w:t xml:space="preserve">Resume as métricas-chave dos 3 cenários lado a lado.</w:t>
             </w:r>
           </w:p>
-          <w:bookmarkEnd w:id="663"/>
-          <w:bookmarkStart w:id="664" w:name="dica-prática-regra-de-ouro-1"/>
+          <w:bookmarkEnd w:id="659"/>
+          <w:bookmarkStart w:id="660" w:name="dica-prática-regra-de-ouro"/>
           <w:p>
             <w:pPr>
               <w:pStyle w:val="Heading3"/>
@@ -35555,7 +35403,7 @@
               <w:pStyle w:val="Compact"/>
               <w:numPr>
                 <w:ilvl w:val="0"/>
-                <w:numId w:val="1074"/>
+                <w:numId w:val="1072"/>
               </w:numPr>
             </w:pPr>
             <w:r>
@@ -35577,7 +35425,7 @@
               <w:pStyle w:val="Compact"/>
               <w:numPr>
                 <w:ilvl w:val="0"/>
-                <w:numId w:val="1074"/>
+                <w:numId w:val="1072"/>
               </w:numPr>
             </w:pPr>
             <w:r>
@@ -35599,7 +35447,7 @@
               <w:pStyle w:val="Compact"/>
               <w:numPr>
                 <w:ilvl w:val="0"/>
-                <w:numId w:val="1074"/>
+                <w:numId w:val="1072"/>
               </w:numPr>
             </w:pPr>
             <w:r>
@@ -35620,12 +35468,12 @@
         </w:tc>
       </w:tr>
     </w:tbl>
-    <w:bookmarkEnd w:id="664"/>
-    <w:bookmarkEnd w:id="665"/>
-    <w:bookmarkStart w:id="666" w:name="tier5-57"/>
-    <w:bookmarkEnd w:id="666"/>
-    <w:bookmarkStart w:id="668" w:name="tier5-58"/>
-    <w:bookmarkStart w:id="667" w:name="X31069a8c5c6d959446827e3b9d491c749a222a0"/>
+    <w:bookmarkEnd w:id="660"/>
+    <w:bookmarkEnd w:id="661"/>
+    <w:bookmarkStart w:id="662" w:name="tier5-57"/>
+    <w:bookmarkEnd w:id="662"/>
+    <w:bookmarkStart w:id="664" w:name="tier5-58"/>
+    <w:bookmarkStart w:id="663" w:name="X31069a8c5c6d959446827e3b9d491c749a222a0"/>
     <w:p>
       <w:pPr>
         <w:pStyle w:val="Heading3"/>
@@ -35634,11 +35482,11 @@
         <w:t xml:space="preserve">📋 Tabela 5.3: Análise Comparativa de Resiliência</w:t>
       </w:r>
     </w:p>
-    <w:bookmarkEnd w:id="667"/>
-    <w:bookmarkEnd w:id="668"/>
-    <w:bookmarkStart w:id="669" w:name="tier5-59"/>
-    <w:bookmarkEnd w:id="669"/>
-    <w:bookmarkStart w:id="670" w:name="tier5-60"/>
+    <w:bookmarkEnd w:id="663"/>
+    <w:bookmarkEnd w:id="664"/>
+    <w:bookmarkStart w:id="665" w:name="tier5-59"/>
+    <w:bookmarkEnd w:id="665"/>
+    <w:bookmarkStart w:id="666" w:name="tier5-60"/>
     <w:tbl>
       <w:tblPr>
         <w:tblStyle w:val="Table"/>
@@ -36052,10 +35900,10 @@
         </w:tc>
       </w:tr>
     </w:tbl>
-    <w:bookmarkEnd w:id="670"/>
-    <w:bookmarkStart w:id="671" w:name="tier5-61"/>
-    <w:bookmarkEnd w:id="671"/>
-    <w:bookmarkStart w:id="674" w:name="tier5-62"/>
+    <w:bookmarkEnd w:id="666"/>
+    <w:bookmarkStart w:id="667" w:name="tier5-61"/>
+    <w:bookmarkEnd w:id="667"/>
+    <w:bookmarkStart w:id="670" w:name="tier5-62"/>
     <w:tbl>
       <w:tblPr>
         <w:tblStyle w:val="Table"/>
@@ -36097,12 +35945,12 @@
                 <wp:inline>
                   <wp:extent cx="152400" cy="152400"/>
                   <wp:effectExtent b="0" l="0" r="0" t="0"/>
-                  <wp:docPr descr="" title="" id="672" name="Picture"/>
+                  <wp:docPr descr="" title="" id="668" name="Picture"/>
                   <a:graphic>
                     <a:graphicData uri="http://schemas.openxmlformats.org/drawingml/2006/picture">
                       <pic:pic>
                         <pic:nvPicPr>
-                          <pic:cNvPr descr="C:\Users\User\AppData\Local\Programs\Quarto\share\formats\docx\tip.png" id="673" name="Picture"/>
+                          <pic:cNvPr descr="C:\Users\User\AppData\Local\Programs\Quarto\share\formats\docx\tip.png" id="669" name="Picture"/>
                           <pic:cNvPicPr>
                             <a:picLocks noChangeArrowheads="1" noChangeAspect="1"/>
                           </pic:cNvPicPr>
@@ -36162,7 +36010,7 @@
               <w:pStyle w:val="Compact"/>
               <w:numPr>
                 <w:ilvl w:val="0"/>
-                <w:numId w:val="1075"/>
+                <w:numId w:val="1073"/>
               </w:numPr>
             </w:pPr>
             <w:r>
@@ -36184,7 +36032,7 @@
               <w:pStyle w:val="Compact"/>
               <w:numPr>
                 <w:ilvl w:val="0"/>
-                <w:numId w:val="1075"/>
+                <w:numId w:val="1073"/>
               </w:numPr>
             </w:pPr>
             <w:r>
@@ -36206,7 +36054,7 @@
               <w:pStyle w:val="Compact"/>
               <w:numPr>
                 <w:ilvl w:val="0"/>
-                <w:numId w:val="1075"/>
+                <w:numId w:val="1073"/>
               </w:numPr>
             </w:pPr>
             <w:r>
@@ -36228,7 +36076,7 @@
               <w:pStyle w:val="Compact"/>
               <w:numPr>
                 <w:ilvl w:val="0"/>
-                <w:numId w:val="1075"/>
+                <w:numId w:val="1073"/>
               </w:numPr>
             </w:pPr>
             <w:r>
@@ -36250,7 +36098,7 @@
               <w:pStyle w:val="Compact"/>
               <w:numPr>
                 <w:ilvl w:val="0"/>
-                <w:numId w:val="1075"/>
+                <w:numId w:val="1073"/>
               </w:numPr>
             </w:pPr>
             <w:r>
@@ -36272,7 +36120,7 @@
               <w:pStyle w:val="Compact"/>
               <w:numPr>
                 <w:ilvl w:val="0"/>
-                <w:numId w:val="1075"/>
+                <w:numId w:val="1073"/>
               </w:numPr>
             </w:pPr>
             <w:r>
@@ -36294,7 +36142,7 @@
               <w:pStyle w:val="Compact"/>
               <w:numPr>
                 <w:ilvl w:val="0"/>
-                <w:numId w:val="1075"/>
+                <w:numId w:val="1073"/>
               </w:numPr>
             </w:pPr>
             <w:r>
@@ -36348,10 +36196,10 @@
         </w:tc>
       </w:tr>
     </w:tbl>
-    <w:bookmarkEnd w:id="674"/>
-    <w:bookmarkStart w:id="675" w:name="tier5-63"/>
-    <w:bookmarkEnd w:id="675"/>
-    <w:bookmarkStart w:id="676" w:name="tier5-64"/>
+    <w:bookmarkEnd w:id="670"/>
+    <w:bookmarkStart w:id="671" w:name="tier5-63"/>
+    <w:bookmarkEnd w:id="671"/>
+    <w:bookmarkStart w:id="672" w:name="tier5-64"/>
     <w:p>
       <w:r>
         <w:pict>
@@ -36359,8 +36207,8 @@
         </w:pict>
       </w:r>
     </w:p>
-    <w:bookmarkEnd w:id="676"/>
-    <w:bookmarkStart w:id="681" w:name="tier5-65"/>
+    <w:bookmarkEnd w:id="672"/>
+    <w:bookmarkStart w:id="677" w:name="tier5-65"/>
     <w:tbl>
       <w:tblPr>
         <w:tblStyle w:val="Table"/>
@@ -36413,7 +36261,7 @@
               <w:bottom w:w="108" w:type="dxa"/>
             </w:tcMar>
           </w:tcPr>
-          <w:bookmarkStart w:id="677" w:name="fato-o-que-os-números-dizem-1"/>
+          <w:bookmarkStart w:id="673" w:name="fato-o-que-os-números-dizem-1"/>
           <w:p>
             <w:pPr>
               <w:pStyle w:val="Heading3"/>
@@ -36534,8 +36382,8 @@
               <w:t xml:space="preserve">abaixo do potencial. Isso representa oportunidade de melhoria via otimização de custos ou aceleração de receita.</w:t>
             </w:r>
           </w:p>
-          <w:bookmarkEnd w:id="677"/>
-          <w:bookmarkStart w:id="678" w:name="causa-por-que-isso-acontece"/>
+          <w:bookmarkEnd w:id="673"/>
+          <w:bookmarkStart w:id="674" w:name="causa-por-que-isso-acontece"/>
           <w:p>
             <w:pPr>
               <w:pStyle w:val="Heading3"/>
@@ -36613,8 +36461,8 @@
               <w:t xml:space="preserve">após o período inicial de investimento.</w:t>
             </w:r>
           </w:p>
-          <w:bookmarkEnd w:id="678"/>
-          <w:bookmarkStart w:id="679" w:name="implicação-o-que-significa-na-prática"/>
+          <w:bookmarkEnd w:id="674"/>
+          <w:bookmarkStart w:id="675" w:name="implicação-o-que-significa-na-prática"/>
           <w:p>
             <w:pPr>
               <w:pStyle w:val="Heading3"/>
@@ -36694,8 +36542,8 @@
               <w:t xml:space="preserve">. Isso expõe moderada resiliência a choques.</w:t>
             </w:r>
           </w:p>
-          <w:bookmarkEnd w:id="679"/>
-          <w:bookmarkStart w:id="680" w:name="ação-recomendada-o-que-fazer-agora"/>
+          <w:bookmarkEnd w:id="675"/>
+          <w:bookmarkStart w:id="676" w:name="ação-recomendada-o-que-fazer-agora"/>
           <w:p>
             <w:pPr>
               <w:pStyle w:val="Heading3"/>
@@ -36817,9 +36665,9 @@
         </w:tc>
       </w:tr>
     </w:tbl>
-    <w:bookmarkEnd w:id="680"/>
-    <w:bookmarkEnd w:id="681"/>
-    <w:bookmarkStart w:id="688" w:name="tier5-66"/>
+    <w:bookmarkEnd w:id="676"/>
+    <w:bookmarkEnd w:id="677"/>
+    <w:bookmarkStart w:id="684" w:name="tier5-66"/>
     <w:tbl>
       <w:tblPr>
         <w:tblStyle w:val="Table"/>
@@ -36861,12 +36709,12 @@
                 <wp:inline>
                   <wp:extent cx="152400" cy="152400"/>
                   <wp:effectExtent b="0" l="0" r="0" t="0"/>
-                  <wp:docPr descr="" title="" id="682" name="Picture"/>
+                  <wp:docPr descr="" title="" id="678" name="Picture"/>
                   <a:graphic>
                     <a:graphicData uri="http://schemas.openxmlformats.org/drawingml/2006/picture">
                       <pic:pic>
                         <pic:nvPicPr>
-                          <pic:cNvPr descr="C:\Users\User\AppData\Local\Programs\Quarto\share\formats\docx\note.png" id="683" name="Picture"/>
+                          <pic:cNvPr descr="C:\Users\User\AppData\Local\Programs\Quarto\share\formats\docx\note.png" id="679" name="Picture"/>
                           <pic:cNvPicPr>
                             <a:picLocks noChangeArrowheads="1" noChangeAspect="1"/>
                           </pic:cNvPicPr>
@@ -36921,13 +36769,214 @@
               <w:bottom w:w="108" w:type="dxa"/>
             </w:tcMar>
           </w:tcPr>
-          <w:bookmarkStart w:id="684" w:name="metodologia"/>
+          <w:bookmarkStart w:id="680" w:name="metodologia"/>
           <w:p>
             <w:pPr>
               <w:pStyle w:val="Heading3"/>
             </w:pPr>
             <w:r>
               <w:t xml:space="preserve">Metodologia</w:t>
+            </w:r>
+          </w:p>
+          <w:p>
+            <w:pPr>
+              <w:pStyle w:val="Compact"/>
+              <w:numPr>
+                <w:ilvl w:val="0"/>
+                <w:numId w:val="1074"/>
+              </w:numPr>
+            </w:pPr>
+            <w:r>
+              <w:rPr>
+                <w:b/>
+                <w:bCs/>
+              </w:rPr>
+              <w:t xml:space="preserve">Runway:</w:t>
+            </w:r>
+            <w:r>
+              <w:t xml:space="preserve"> </w:t>
+            </w:r>
+            <w:r>
+              <w:rPr>
+                <w:rStyle w:val="VerbatimChar"/>
+              </w:rPr>
+              <w:t xml:space="preserve">Caixa[t] / Burn_Rate[t]</w:t>
+            </w:r>
+            <w:r>
+              <w:t xml:space="preserve"> </w:t>
+            </w:r>
+            <w:r>
+              <w:t xml:space="preserve">— quantos meses o caixa sustenta o burn atual</w:t>
+            </w:r>
+          </w:p>
+          <w:p>
+            <w:pPr>
+              <w:pStyle w:val="Compact"/>
+              <w:numPr>
+                <w:ilvl w:val="0"/>
+                <w:numId w:val="1074"/>
+              </w:numPr>
+            </w:pPr>
+            <w:r>
+              <w:rPr>
+                <w:b/>
+                <w:bCs/>
+              </w:rPr>
+              <w:t xml:space="preserve">Burn Rate:</w:t>
+            </w:r>
+            <w:r>
+              <w:t xml:space="preserve"> </w:t>
+            </w:r>
+            <w:r>
+              <w:rPr>
+                <w:rStyle w:val="VerbatimChar"/>
+              </w:rPr>
+              <w:t xml:space="preserve">(COGS + OPEX) - Receita Líquida</w:t>
+            </w:r>
+            <w:r>
+              <w:t xml:space="preserve"> </w:t>
+            </w:r>
+            <w:r>
+              <w:t xml:space="preserve">— saída líquida de caixa mensal</w:t>
+            </w:r>
+          </w:p>
+          <w:p>
+            <w:pPr>
+              <w:pStyle w:val="Compact"/>
+              <w:numPr>
+                <w:ilvl w:val="0"/>
+                <w:numId w:val="1074"/>
+              </w:numPr>
+            </w:pPr>
+            <w:r>
+              <w:rPr>
+                <w:b/>
+                <w:bCs/>
+              </w:rPr>
+              <w:t xml:space="preserve">Cobertura:</w:t>
+            </w:r>
+            <w:r>
+              <w:t xml:space="preserve"> </w:t>
+            </w:r>
+            <w:r>
+              <w:rPr>
+                <w:rStyle w:val="VerbatimChar"/>
+              </w:rPr>
+              <w:t xml:space="preserve">Receita / (COGS + OPEX)</w:t>
+            </w:r>
+            <w:r>
+              <w:t xml:space="preserve"> </w:t>
+            </w:r>
+            <w:r>
+              <w:t xml:space="preserve">— % dos custos cobertos pela receita</w:t>
+            </w:r>
+          </w:p>
+          <w:p>
+            <w:pPr>
+              <w:pStyle w:val="Compact"/>
+              <w:numPr>
+                <w:ilvl w:val="0"/>
+                <w:numId w:val="1074"/>
+              </w:numPr>
+            </w:pPr>
+            <w:r>
+              <w:rPr>
+                <w:b/>
+                <w:bCs/>
+              </w:rPr>
+              <w:t xml:space="preserve">Decomposição:</w:t>
+            </w:r>
+            <w:r>
+              <w:t xml:space="preserve"> </w:t>
+            </w:r>
+            <w:r>
+              <w:t xml:space="preserve">Participação % de cada categoria no burn total</w:t>
+            </w:r>
+          </w:p>
+          <w:bookmarkEnd w:id="680"/>
+          <w:bookmarkStart w:id="681" w:name="classificação-de-risco"/>
+          <w:p>
+            <w:pPr>
+              <w:pStyle w:val="Heading3"/>
+            </w:pPr>
+            <w:r>
+              <w:t xml:space="preserve">Classificação de Risco</w:t>
+            </w:r>
+          </w:p>
+          <w:p>
+            <w:pPr>
+              <w:pStyle w:val="Compact"/>
+              <w:numPr>
+                <w:ilvl w:val="0"/>
+                <w:numId w:val="1075"/>
+              </w:numPr>
+            </w:pPr>
+            <w:r>
+              <w:rPr>
+                <w:b/>
+                <w:bCs/>
+              </w:rPr>
+              <w:t xml:space="preserve">Crítico (&lt; 3 meses):</w:t>
+            </w:r>
+            <w:r>
+              <w:t xml:space="preserve"> </w:t>
+            </w:r>
+            <w:r>
+              <w:t xml:space="preserve">Risco iminente de insolvência</w:t>
+            </w:r>
+          </w:p>
+          <w:p>
+            <w:pPr>
+              <w:pStyle w:val="Compact"/>
+              <w:numPr>
+                <w:ilvl w:val="0"/>
+                <w:numId w:val="1075"/>
+              </w:numPr>
+            </w:pPr>
+            <w:r>
+              <w:rPr>
+                <w:b/>
+                <w:bCs/>
+              </w:rPr>
+              <w:t xml:space="preserve">Atenção (3-6 meses):</w:t>
+            </w:r>
+            <w:r>
+              <w:t xml:space="preserve"> </w:t>
+            </w:r>
+            <w:r>
+              <w:t xml:space="preserve">Margem apertada, exige monitoramento</w:t>
+            </w:r>
+          </w:p>
+          <w:p>
+            <w:pPr>
+              <w:pStyle w:val="Compact"/>
+              <w:numPr>
+                <w:ilvl w:val="0"/>
+                <w:numId w:val="1075"/>
+              </w:numPr>
+            </w:pPr>
+            <w:r>
+              <w:rPr>
+                <w:b/>
+                <w:bCs/>
+              </w:rPr>
+              <w:t xml:space="preserve">Seguro (&gt; 6 meses):</w:t>
+            </w:r>
+            <w:r>
+              <w:t xml:space="preserve"> </w:t>
+            </w:r>
+            <w:r>
+              <w:t xml:space="preserve">Buffer adequado para growth</w:t>
+            </w:r>
+          </w:p>
+          <w:bookmarkEnd w:id="681"/>
+          <w:bookmarkStart w:id="682" w:name="cenários"/>
+          <w:p>
+            <w:pPr>
+              <w:pStyle w:val="Heading3"/>
+            </w:pPr>
+            <w:r>
+              <w:t xml:space="preserve">Cenários</w:t>
             </w:r>
           </w:p>
           <w:p>
@@ -36943,22 +36992,13 @@
                 <w:b/>
                 <w:bCs/>
               </w:rPr>
-              <w:t xml:space="preserve">Runway:</w:t>
-            </w:r>
-            <w:r>
-              <w:t xml:space="preserve"> </w:t>
-            </w:r>
-            <w:r>
-              <w:rPr>
-                <w:rStyle w:val="VerbatimChar"/>
-              </w:rPr>
-              <w:t xml:space="preserve">Caixa[t] / Burn_Rate[t]</w:t>
-            </w:r>
-            <w:r>
-              <w:t xml:space="preserve"> </w:t>
-            </w:r>
-            <w:r>
-              <w:t xml:space="preserve">— quantos meses o caixa sustenta o burn atual</w:t>
+              <w:t xml:space="preserve">Real (5A):</w:t>
+            </w:r>
+            <w:r>
+              <w:t xml:space="preserve"> </w:t>
+            </w:r>
+            <w:r>
+              <w:t xml:space="preserve">Premissas conservadoras (bootstrap R$ 2k/mês marketing)</w:t>
             </w:r>
           </w:p>
           <w:p>
@@ -36974,22 +37014,13 @@
                 <w:b/>
                 <w:bCs/>
               </w:rPr>
-              <w:t xml:space="preserve">Burn Rate:</w:t>
-            </w:r>
-            <w:r>
-              <w:t xml:space="preserve"> </w:t>
-            </w:r>
-            <w:r>
-              <w:rPr>
-                <w:rStyle w:val="VerbatimChar"/>
-              </w:rPr>
-              <w:t xml:space="preserve">(COGS + OPEX) - Receita Líquida</w:t>
-            </w:r>
-            <w:r>
-              <w:t xml:space="preserve"> </w:t>
-            </w:r>
-            <w:r>
-              <w:t xml:space="preserve">— saída líquida de caixa mensal</w:t>
+              <w:t xml:space="preserve">Ideal (5B):</w:t>
+            </w:r>
+            <w:r>
+              <w:t xml:space="preserve"> </w:t>
+            </w:r>
+            <w:r>
+              <w:t xml:space="preserve">Benchmarks de mercado (R$ 10k/mês marketing)</w:t>
             </w:r>
           </w:p>
           <w:p>
@@ -37005,54 +37036,23 @@
                 <w:b/>
                 <w:bCs/>
               </w:rPr>
-              <w:t xml:space="preserve">Cobertura:</w:t>
-            </w:r>
-            <w:r>
-              <w:t xml:space="preserve"> </w:t>
-            </w:r>
-            <w:r>
-              <w:rPr>
-                <w:rStyle w:val="VerbatimChar"/>
-              </w:rPr>
-              <w:t xml:space="preserve">Receita / (COGS + OPEX)</w:t>
-            </w:r>
-            <w:r>
-              <w:t xml:space="preserve"> </w:t>
-            </w:r>
-            <w:r>
-              <w:t xml:space="preserve">— % dos custos cobertos pela receita</w:t>
-            </w:r>
-          </w:p>
-          <w:p>
-            <w:pPr>
-              <w:pStyle w:val="Compact"/>
-              <w:numPr>
-                <w:ilvl w:val="0"/>
-                <w:numId w:val="1076"/>
-              </w:numPr>
-            </w:pPr>
-            <w:r>
-              <w:rPr>
-                <w:b/>
-                <w:bCs/>
-              </w:rPr>
-              <w:t xml:space="preserve">Decomposição:</w:t>
-            </w:r>
-            <w:r>
-              <w:t xml:space="preserve"> </w:t>
-            </w:r>
-            <w:r>
-              <w:t xml:space="preserve">Participação % de cada categoria no burn total</w:t>
-            </w:r>
-          </w:p>
-          <w:bookmarkEnd w:id="684"/>
-          <w:bookmarkStart w:id="685" w:name="classificação-de-risco"/>
+              <w:t xml:space="preserve">Estresse (5C):</w:t>
+            </w:r>
+            <w:r>
+              <w:t xml:space="preserve"> </w:t>
+            </w:r>
+            <w:r>
+              <w:t xml:space="preserve">Churn 2x, CAC 1.5x, Conversão 0.5x</w:t>
+            </w:r>
+          </w:p>
+          <w:bookmarkEnd w:id="682"/>
+          <w:bookmarkStart w:id="683" w:name="fonte-de-dados-1"/>
           <w:p>
             <w:pPr>
               <w:pStyle w:val="Heading3"/>
             </w:pPr>
             <w:r>
-              <w:t xml:space="preserve">Classificação de Risco</w:t>
+              <w:t xml:space="preserve">Fonte de Dados</w:t>
             </w:r>
           </w:p>
           <w:p>
@@ -37064,17 +37064,16 @@
               </w:numPr>
             </w:pPr>
             <w:r>
-              <w:rPr>
-                <w:b/>
-                <w:bCs/>
-              </w:rPr>
-              <w:t xml:space="preserve">Crítico (&lt; 3 meses):</w:t>
-            </w:r>
-            <w:r>
-              <w:t xml:space="preserve"> </w:t>
-            </w:r>
-            <w:r>
-              <w:t xml:space="preserve">Risco iminente de insolvência</w:t>
+              <w:t xml:space="preserve">Motor Financeiro V13 (</w:t>
+            </w:r>
+            <w:r>
+              <w:rPr>
+                <w:rStyle w:val="VerbatimChar"/>
+              </w:rPr>
+              <w:t xml:space="preserve">celula_4_motor.py</w:t>
+            </w:r>
+            <w:r>
+              <w:t xml:space="preserve">)</w:t>
             </w:r>
           </w:p>
           <w:p>
@@ -37086,157 +37085,6 @@
               </w:numPr>
             </w:pPr>
             <w:r>
-              <w:rPr>
-                <w:b/>
-                <w:bCs/>
-              </w:rPr>
-              <w:t xml:space="preserve">Atenção (3-6 meses):</w:t>
-            </w:r>
-            <w:r>
-              <w:t xml:space="preserve"> </w:t>
-            </w:r>
-            <w:r>
-              <w:t xml:space="preserve">Margem apertada, exige monitoramento</w:t>
-            </w:r>
-          </w:p>
-          <w:p>
-            <w:pPr>
-              <w:pStyle w:val="Compact"/>
-              <w:numPr>
-                <w:ilvl w:val="0"/>
-                <w:numId w:val="1077"/>
-              </w:numPr>
-            </w:pPr>
-            <w:r>
-              <w:rPr>
-                <w:b/>
-                <w:bCs/>
-              </w:rPr>
-              <w:t xml:space="preserve">Seguro (&gt; 6 meses):</w:t>
-            </w:r>
-            <w:r>
-              <w:t xml:space="preserve"> </w:t>
-            </w:r>
-            <w:r>
-              <w:t xml:space="preserve">Buffer adequado para growth</w:t>
-            </w:r>
-          </w:p>
-          <w:bookmarkEnd w:id="685"/>
-          <w:bookmarkStart w:id="686" w:name="cenários"/>
-          <w:p>
-            <w:pPr>
-              <w:pStyle w:val="Heading3"/>
-            </w:pPr>
-            <w:r>
-              <w:t xml:space="preserve">Cenários</w:t>
-            </w:r>
-          </w:p>
-          <w:p>
-            <w:pPr>
-              <w:pStyle w:val="Compact"/>
-              <w:numPr>
-                <w:ilvl w:val="0"/>
-                <w:numId w:val="1078"/>
-              </w:numPr>
-            </w:pPr>
-            <w:r>
-              <w:rPr>
-                <w:b/>
-                <w:bCs/>
-              </w:rPr>
-              <w:t xml:space="preserve">Real (5A):</w:t>
-            </w:r>
-            <w:r>
-              <w:t xml:space="preserve"> </w:t>
-            </w:r>
-            <w:r>
-              <w:t xml:space="preserve">Premissas conservadoras (bootstrap R$ 2k/mês marketing)</w:t>
-            </w:r>
-          </w:p>
-          <w:p>
-            <w:pPr>
-              <w:pStyle w:val="Compact"/>
-              <w:numPr>
-                <w:ilvl w:val="0"/>
-                <w:numId w:val="1078"/>
-              </w:numPr>
-            </w:pPr>
-            <w:r>
-              <w:rPr>
-                <w:b/>
-                <w:bCs/>
-              </w:rPr>
-              <w:t xml:space="preserve">Ideal (5B):</w:t>
-            </w:r>
-            <w:r>
-              <w:t xml:space="preserve"> </w:t>
-            </w:r>
-            <w:r>
-              <w:t xml:space="preserve">Benchmarks de mercado (R$ 10k/mês marketing)</w:t>
-            </w:r>
-          </w:p>
-          <w:p>
-            <w:pPr>
-              <w:pStyle w:val="Compact"/>
-              <w:numPr>
-                <w:ilvl w:val="0"/>
-                <w:numId w:val="1078"/>
-              </w:numPr>
-            </w:pPr>
-            <w:r>
-              <w:rPr>
-                <w:b/>
-                <w:bCs/>
-              </w:rPr>
-              <w:t xml:space="preserve">Estresse (5C):</w:t>
-            </w:r>
-            <w:r>
-              <w:t xml:space="preserve"> </w:t>
-            </w:r>
-            <w:r>
-              <w:t xml:space="preserve">Churn 2x, CAC 1.5x, Conversão 0.5x</w:t>
-            </w:r>
-          </w:p>
-          <w:bookmarkEnd w:id="686"/>
-          <w:bookmarkStart w:id="687" w:name="fonte-de-dados-1"/>
-          <w:p>
-            <w:pPr>
-              <w:pStyle w:val="Heading3"/>
-            </w:pPr>
-            <w:r>
-              <w:t xml:space="preserve">Fonte de Dados</w:t>
-            </w:r>
-          </w:p>
-          <w:p>
-            <w:pPr>
-              <w:pStyle w:val="Compact"/>
-              <w:numPr>
-                <w:ilvl w:val="0"/>
-                <w:numId w:val="1079"/>
-              </w:numPr>
-            </w:pPr>
-            <w:r>
-              <w:t xml:space="preserve">Motor Financeiro V13 (</w:t>
-            </w:r>
-            <w:r>
-              <w:rPr>
-                <w:rStyle w:val="VerbatimChar"/>
-              </w:rPr>
-              <w:t xml:space="preserve">celula_4_motor.py</w:t>
-            </w:r>
-            <w:r>
-              <w:t xml:space="preserve">)</w:t>
-            </w:r>
-          </w:p>
-          <w:p>
-            <w:pPr>
-              <w:pStyle w:val="Compact"/>
-              <w:numPr>
-                <w:ilvl w:val="0"/>
-                <w:numId w:val="1079"/>
-              </w:numPr>
-            </w:pPr>
-            <w:r>
               <w:t xml:space="preserve">Cenários 5A, 5B, 5C (</w:t>
             </w:r>
             <w:r>
@@ -37253,10 +37101,10 @@
         </w:tc>
       </w:tr>
     </w:tbl>
-    <w:bookmarkEnd w:id="687"/>
-    <w:bookmarkEnd w:id="688"/>
-    <w:bookmarkStart w:id="690" w:name="tier5-67"/>
-    <w:bookmarkStart w:id="689" w:name="quando-o-negócio-atinge-autossuficiência"/>
+    <w:bookmarkEnd w:id="683"/>
+    <w:bookmarkEnd w:id="684"/>
+    <w:bookmarkStart w:id="686" w:name="tier5-67"/>
+    <w:bookmarkStart w:id="685" w:name="quando-o-negócio-atinge-autossuficiência"/>
     <w:p>
       <w:pPr>
         <w:pStyle w:val="Heading2"/>
@@ -37265,10 +37113,10 @@
         <w:t xml:space="preserve">Quando o negócio atinge autossuficiência?</w:t>
       </w:r>
     </w:p>
-    <w:bookmarkEnd w:id="689"/>
-    <w:bookmarkEnd w:id="690"/>
-    <w:bookmarkStart w:id="692" w:name="tier5-68"/>
-    <w:bookmarkStart w:id="691" w:name="Xb099afb38e6d2328a843c17ee3f6d4a4534c661"/>
+    <w:bookmarkEnd w:id="685"/>
+    <w:bookmarkEnd w:id="686"/>
+    <w:bookmarkStart w:id="688" w:name="tier5-68"/>
+    <w:bookmarkStart w:id="687" w:name="Xb099afb38e6d2328a843c17ee3f6d4a4534c661"/>
     <w:p>
       <w:pPr>
         <w:pStyle w:val="Heading3"/>
@@ -37277,30 +37125,30 @@
         <w:t xml:space="preserve">📉 VIZ 5.4: Análise de Break-Even sob Estresse</w:t>
       </w:r>
     </w:p>
-    <w:bookmarkEnd w:id="691"/>
-    <w:bookmarkEnd w:id="692"/>
+    <w:bookmarkEnd w:id="687"/>
+    <w:bookmarkEnd w:id="688"/>
     <w:p>
       <w:pPr>
         <w:pStyle w:val="FirstParagraph"/>
       </w:pPr>
-      <w:bookmarkStart w:id="696" w:name="tier5-69"/>
+      <w:bookmarkStart w:id="692" w:name="tier5-69"/>
       <w:r>
         <w:drawing>
           <wp:inline>
             <wp:extent cx="5334000" cy="2259401"/>
             <wp:effectExtent b="0" l="0" r="0" t="0"/>
-            <wp:docPr descr="" title="" id="694" name="Picture"/>
+            <wp:docPr descr="" title="" id="690" name="Picture"/>
             <a:graphic>
               <a:graphicData uri="http://schemas.openxmlformats.org/drawingml/2006/picture">
                 <pic:pic>
                   <pic:nvPicPr>
-                    <pic:cNvPr descr="relatorio_completo_files/figure-docx/tier5-output-69.png" id="695" name="Picture"/>
+                    <pic:cNvPr descr="relatorio_completo_files/figure-docx/tier5-output-69.png" id="691" name="Picture"/>
                     <pic:cNvPicPr>
                       <a:picLocks noChangeArrowheads="1" noChangeAspect="1"/>
                     </pic:cNvPicPr>
                   </pic:nvPicPr>
                   <pic:blipFill>
-                    <a:blip r:embed="rId693"/>
+                    <a:blip r:embed="rId689"/>
                     <a:stretch>
                       <a:fillRect/>
                     </a:stretch>
@@ -37326,9 +37174,9 @@
           </wp:inline>
         </w:drawing>
       </w:r>
-      <w:bookmarkEnd w:id="696"/>
+      <w:bookmarkEnd w:id="692"/>
     </w:p>
-    <w:bookmarkStart w:id="697" w:name="tier5-70"/>
+    <w:bookmarkStart w:id="693" w:name="tier5-70"/>
     <w:p>
       <w:pPr>
         <w:pStyle w:val="BodyText"/>
@@ -37341,8 +37189,8 @@
         <w:t xml:space="preserve">Fonte: Projeção Financeira Real/Ideal/Estresse</w:t>
       </w:r>
     </w:p>
-    <w:bookmarkEnd w:id="697"/>
-    <w:bookmarkStart w:id="698" w:name="tier5-71"/>
+    <w:bookmarkEnd w:id="693"/>
+    <w:bookmarkStart w:id="694" w:name="tier5-71"/>
     <w:p>
       <w:r>
         <w:pict>
@@ -37350,8 +37198,8 @@
         </w:pict>
       </w:r>
     </w:p>
-    <w:bookmarkEnd w:id="698"/>
-    <w:bookmarkStart w:id="701" w:name="tier5-72"/>
+    <w:bookmarkEnd w:id="694"/>
+    <w:bookmarkStart w:id="697" w:name="tier5-72"/>
     <w:tbl>
       <w:tblPr>
         <w:tblStyle w:val="Table"/>
@@ -37392,12 +37240,12 @@
                 <wp:inline>
                   <wp:extent cx="152400" cy="152400"/>
                   <wp:effectExtent b="0" l="0" r="0" t="0"/>
-                  <wp:docPr descr="" title="" id="699" name="Picture"/>
+                  <wp:docPr descr="" title="" id="695" name="Picture"/>
                   <a:graphic>
                     <a:graphicData uri="http://schemas.openxmlformats.org/drawingml/2006/picture">
                       <pic:pic>
                         <pic:nvPicPr>
-                          <pic:cNvPr descr="C:\Users\User\AppData\Local\Programs\Quarto\share\formats\docx\note.png" id="700" name="Picture"/>
+                          <pic:cNvPr descr="C:\Users\User\AppData\Local\Programs\Quarto\share\formats\docx\note.png" id="696" name="Picture"/>
                           <pic:cNvPicPr>
                             <a:picLocks noChangeArrowheads="1" noChangeAspect="1"/>
                           </pic:cNvPicPr>
@@ -37490,20 +37338,20 @@
         </w:tc>
       </w:tr>
     </w:tbl>
-    <w:bookmarkEnd w:id="701"/>
-    <w:bookmarkStart w:id="703" w:name="tier5-73"/>
-    <w:bookmarkStart w:id="702" w:name="a-prova-numérica-1"/>
+    <w:bookmarkEnd w:id="697"/>
+    <w:bookmarkStart w:id="699" w:name="tier5-73"/>
+    <w:bookmarkStart w:id="698" w:name="tabela-de-dados-1"/>
     <w:p>
       <w:pPr>
         <w:pStyle w:val="Heading4"/>
       </w:pPr>
       <w:r>
-        <w:t xml:space="preserve">📋 A PROVA NUMÉRICA:</w:t>
+        <w:t xml:space="preserve">📋 TABELA DE DADOS:</w:t>
       </w:r>
     </w:p>
-    <w:bookmarkEnd w:id="702"/>
-    <w:bookmarkEnd w:id="703"/>
-    <w:bookmarkStart w:id="704" w:name="tier5-74"/>
+    <w:bookmarkEnd w:id="698"/>
+    <w:bookmarkEnd w:id="699"/>
+    <w:bookmarkStart w:id="700" w:name="tier5-74"/>
     <w:tbl>
       <w:tblPr>
         <w:tblStyle w:val="Table"/>
@@ -37671,10 +37519,10 @@
         </w:tc>
       </w:tr>
     </w:tbl>
-    <w:bookmarkEnd w:id="704"/>
-    <w:bookmarkStart w:id="705" w:name="tier5-75"/>
-    <w:bookmarkEnd w:id="705"/>
-    <w:bookmarkStart w:id="706" w:name="tier5-76"/>
+    <w:bookmarkEnd w:id="700"/>
+    <w:bookmarkStart w:id="701" w:name="tier5-75"/>
+    <w:bookmarkEnd w:id="701"/>
+    <w:bookmarkStart w:id="702" w:name="tier5-76"/>
     <w:p>
       <w:r>
         <w:pict>
@@ -37682,8 +37530,8 @@
         </w:pict>
       </w:r>
     </w:p>
-    <w:bookmarkEnd w:id="706"/>
-    <w:bookmarkStart w:id="709" w:name="tier5-77"/>
+    <w:bookmarkEnd w:id="702"/>
+    <w:bookmarkStart w:id="705" w:name="tier5-77"/>
     <w:tbl>
       <w:tblPr>
         <w:tblStyle w:val="Table"/>
@@ -37725,12 +37573,12 @@
                 <wp:inline>
                   <wp:extent cx="152400" cy="152400"/>
                   <wp:effectExtent b="0" l="0" r="0" t="0"/>
-                  <wp:docPr descr="" title="" id="707" name="Picture"/>
+                  <wp:docPr descr="" title="" id="703" name="Picture"/>
                   <a:graphic>
                     <a:graphicData uri="http://schemas.openxmlformats.org/drawingml/2006/picture">
                       <pic:pic>
                         <pic:nvPicPr>
-                          <pic:cNvPr descr="C:\Users\User\AppData\Local\Programs\Quarto\share\formats\docx\tip.png" id="708" name="Picture"/>
+                          <pic:cNvPr descr="C:\Users\User\AppData\Local\Programs\Quarto\share\formats\docx\tip.png" id="704" name="Picture"/>
                           <pic:cNvPicPr>
                             <a:picLocks noChangeArrowheads="1" noChangeAspect="1"/>
                           </pic:cNvPicPr>
@@ -37790,7 +37638,7 @@
               <w:pStyle w:val="Compact"/>
               <w:numPr>
                 <w:ilvl w:val="0"/>
-                <w:numId w:val="1080"/>
+                <w:numId w:val="1078"/>
               </w:numPr>
             </w:pPr>
             <w:r>
@@ -37812,7 +37660,7 @@
               <w:pStyle w:val="Compact"/>
               <w:numPr>
                 <w:ilvl w:val="0"/>
-                <w:numId w:val="1080"/>
+                <w:numId w:val="1078"/>
               </w:numPr>
             </w:pPr>
             <w:r>
@@ -37834,7 +37682,7 @@
               <w:pStyle w:val="Compact"/>
               <w:numPr>
                 <w:ilvl w:val="0"/>
-                <w:numId w:val="1080"/>
+                <w:numId w:val="1078"/>
               </w:numPr>
             </w:pPr>
             <w:r>
@@ -37856,7 +37704,7 @@
               <w:pStyle w:val="Compact"/>
               <w:numPr>
                 <w:ilvl w:val="0"/>
-                <w:numId w:val="1080"/>
+                <w:numId w:val="1078"/>
               </w:numPr>
             </w:pPr>
             <w:r>
@@ -37877,23 +37725,23 @@
         </w:tc>
       </w:tr>
     </w:tbl>
-    <w:bookmarkEnd w:id="709"/>
-    <w:bookmarkStart w:id="710" w:name="tier5-78"/>
-    <w:bookmarkEnd w:id="710"/>
-    <w:bookmarkStart w:id="712" w:name="tier5-79"/>
-    <w:bookmarkStart w:id="711" w:name="onde-o-dinheiro-vaza-na-crise"/>
+    <w:bookmarkEnd w:id="705"/>
+    <w:bookmarkStart w:id="706" w:name="tier5-78"/>
+    <w:bookmarkEnd w:id="706"/>
+    <w:bookmarkStart w:id="708" w:name="tier5-79"/>
+    <w:bookmarkStart w:id="707" w:name="X47c9fee612838f1608071f6e9fb7ebfb887e206"/>
     <w:p>
       <w:pPr>
         <w:pStyle w:val="Heading2"/>
       </w:pPr>
       <w:r>
-        <w:t xml:space="preserve">Onde o dinheiro vaza na crise?</w:t>
+        <w:t xml:space="preserve">Diagnóstico de Vulnerabilidade Financeira</w:t>
       </w:r>
     </w:p>
-    <w:bookmarkEnd w:id="711"/>
-    <w:bookmarkEnd w:id="712"/>
-    <w:bookmarkStart w:id="714" w:name="tier5-80"/>
-    <w:bookmarkStart w:id="713" w:name="X85c39d445d34732beb57c5d5987450f7495dff1"/>
+    <w:bookmarkEnd w:id="707"/>
+    <w:bookmarkEnd w:id="708"/>
+    <w:bookmarkStart w:id="710" w:name="tier5-80"/>
+    <w:bookmarkStart w:id="709" w:name="X85c39d445d34732beb57c5d5987450f7495dff1"/>
     <w:p>
       <w:pPr>
         <w:pStyle w:val="Heading3"/>
@@ -37902,30 +37750,30 @@
         <w:t xml:space="preserve">📉 VIZ 5.5: Decomposição de Gap (Real vs Estresse)</w:t>
       </w:r>
     </w:p>
-    <w:bookmarkEnd w:id="713"/>
-    <w:bookmarkEnd w:id="714"/>
+    <w:bookmarkEnd w:id="709"/>
+    <w:bookmarkEnd w:id="710"/>
     <w:p>
       <w:pPr>
         <w:pStyle w:val="FirstParagraph"/>
       </w:pPr>
-      <w:bookmarkStart w:id="718" w:name="tier5-81"/>
+      <w:bookmarkStart w:id="714" w:name="tier5-81"/>
       <w:r>
         <w:drawing>
           <wp:inline>
             <wp:extent cx="5334000" cy="2276583"/>
             <wp:effectExtent b="0" l="0" r="0" t="0"/>
-            <wp:docPr descr="" title="" id="716" name="Picture"/>
+            <wp:docPr descr="" title="" id="712" name="Picture"/>
             <a:graphic>
               <a:graphicData uri="http://schemas.openxmlformats.org/drawingml/2006/picture">
                 <pic:pic>
                   <pic:nvPicPr>
-                    <pic:cNvPr descr="relatorio_completo_files/figure-docx/tier5-output-81.png" id="717" name="Picture"/>
+                    <pic:cNvPr descr="relatorio_completo_files/figure-docx/tier5-output-81.png" id="713" name="Picture"/>
                     <pic:cNvPicPr>
                       <a:picLocks noChangeArrowheads="1" noChangeAspect="1"/>
                     </pic:cNvPicPr>
                   </pic:nvPicPr>
                   <pic:blipFill>
-                    <a:blip r:embed="rId715"/>
+                    <a:blip r:embed="rId711"/>
                     <a:stretch>
                       <a:fillRect/>
                     </a:stretch>
@@ -37951,9 +37799,9 @@
           </wp:inline>
         </w:drawing>
       </w:r>
-      <w:bookmarkEnd w:id="718"/>
+      <w:bookmarkEnd w:id="714"/>
     </w:p>
-    <w:bookmarkStart w:id="719" w:name="tier5-82"/>
+    <w:bookmarkStart w:id="715" w:name="tier5-82"/>
     <w:p>
       <w:pPr>
         <w:pStyle w:val="BodyText"/>
@@ -37966,8 +37814,8 @@
         <w:t xml:space="preserve">Fonte: Monte Carlo Shapley Decomposition</w:t>
       </w:r>
     </w:p>
-    <w:bookmarkEnd w:id="719"/>
-    <w:bookmarkStart w:id="720" w:name="tier5-83"/>
+    <w:bookmarkEnd w:id="715"/>
+    <w:bookmarkStart w:id="716" w:name="tier5-83"/>
     <w:p>
       <w:r>
         <w:pict>
@@ -37975,8 +37823,8 @@
         </w:pict>
       </w:r>
     </w:p>
-    <w:bookmarkEnd w:id="720"/>
-    <w:bookmarkStart w:id="723" w:name="tier5-84"/>
+    <w:bookmarkEnd w:id="716"/>
+    <w:bookmarkStart w:id="719" w:name="tier5-84"/>
     <w:tbl>
       <w:tblPr>
         <w:tblStyle w:val="Table"/>
@@ -38017,12 +37865,12 @@
                 <wp:inline>
                   <wp:extent cx="152400" cy="152400"/>
                   <wp:effectExtent b="0" l="0" r="0" t="0"/>
-                  <wp:docPr descr="" title="" id="721" name="Picture"/>
+                  <wp:docPr descr="" title="" id="717" name="Picture"/>
                   <a:graphic>
                     <a:graphicData uri="http://schemas.openxmlformats.org/drawingml/2006/picture">
                       <pic:pic>
                         <pic:nvPicPr>
-                          <pic:cNvPr descr="C:\Users\User\AppData\Local\Programs\Quarto\share\formats\docx\note.png" id="722" name="Picture"/>
+                          <pic:cNvPr descr="C:\Users\User\AppData\Local\Programs\Quarto\share\formats\docx\note.png" id="718" name="Picture"/>
                           <pic:cNvPicPr>
                             <a:picLocks noChangeArrowheads="1" noChangeAspect="1"/>
                           </pic:cNvPicPr>
@@ -38080,148 +37928,64 @@
               <w:spacing w:before="16" w:after="16"/>
             </w:pPr>
             <w:r>
-              <w:t xml:space="preserve">Gráfico da esquerda mostra a diferença acumulada de caixa. Direita mostra quais fatores causam essa perda.</w:t>
+              <w:t xml:space="preserve">Gráfico da esquerda: Diferença acumulada de caixa entre Real e Estresse. Gráfico da direita: Atribuição de causa (Shapley Value Proxy).</w:t>
             </w:r>
           </w:p>
         </w:tc>
       </w:tr>
     </w:tbl>
-    <w:bookmarkEnd w:id="723"/>
-    <w:bookmarkStart w:id="725" w:name="tier5-85"/>
-    <w:bookmarkStart w:id="724" w:name="a-prova-numérica-2"/>
+    <w:bookmarkEnd w:id="719"/>
+    <w:bookmarkStart w:id="721" w:name="tier5-85"/>
+    <w:bookmarkStart w:id="720" w:name="tabela-de-dados-2"/>
     <w:p>
       <w:pPr>
         <w:pStyle w:val="Heading4"/>
       </w:pPr>
       <w:r>
-        <w:t xml:space="preserve">📋 A PROVA NUMÉRICA:</w:t>
+        <w:t xml:space="preserve">📋 TABELA DE DADOS:</w:t>
       </w:r>
     </w:p>
-    <w:bookmarkEnd w:id="724"/>
-    <w:bookmarkEnd w:id="725"/>
-    <w:bookmarkStart w:id="726" w:name="tier5-86"/>
-    <w:tbl>
-      <w:tblPr>
-        <w:tblStyle w:val="Table"/>
-        <w:tblW w:type="auto" w:w="0"/>
-        <w:tblLook w:firstRow="1" w:lastRow="0" w:firstColumn="0" w:lastColumn="0" w:noHBand="0" w:noVBand="0" w:val="0020"/>
-      </w:tblPr>
-      <w:tblGrid>
-        <w:gridCol w:w="3960"/>
-        <w:gridCol w:w="3960"/>
-      </w:tblGrid>
-      <w:tr>
-        <w:trPr>
-          <w:tblHeader w:val="on"/>
-        </w:trPr>
-        <w:tc>
-          <w:tcPr/>
-          <w:p>
-            <w:pPr>
-              <w:pStyle w:val="Compact"/>
-              <w:jc w:val="left"/>
-            </w:pPr>
-            <w:r>
-              <w:t xml:space="preserve">Fator</w:t>
-            </w:r>
-          </w:p>
-        </w:tc>
-        <w:tc>
-          <w:tcPr/>
-          <w:p>
-            <w:pPr>
-              <w:pStyle w:val="Compact"/>
-              <w:jc w:val="right"/>
-            </w:pPr>
-            <w:r>
-              <w:t xml:space="preserve">Impacto</w:t>
-            </w:r>
-          </w:p>
-        </w:tc>
-      </w:tr>
-      <w:tr>
-        <w:tc>
-          <w:tcPr/>
-          <w:p>
-            <w:pPr>
-              <w:pStyle w:val="Compact"/>
-              <w:jc w:val="left"/>
-            </w:pPr>
-            <w:r>
-              <w:t xml:space="preserve">Outros</w:t>
-            </w:r>
-          </w:p>
-        </w:tc>
-        <w:tc>
-          <w:tcPr/>
-          <w:p>
-            <w:pPr>
-              <w:pStyle w:val="Compact"/>
-              <w:jc w:val="right"/>
-            </w:pPr>
-            <w:r>
-              <w:t xml:space="preserve">20361.6</w:t>
-            </w:r>
-          </w:p>
-        </w:tc>
-      </w:tr>
-      <w:tr>
-        <w:tc>
-          <w:tcPr/>
-          <w:p>
-            <w:pPr>
-              <w:pStyle w:val="Compact"/>
-              <w:jc w:val="left"/>
-            </w:pPr>
-            <w:r>
-              <w:t xml:space="preserve">CAC (Aquisição)</w:t>
-            </w:r>
-          </w:p>
-        </w:tc>
-        <w:tc>
-          <w:tcPr/>
-          <w:p>
-            <w:pPr>
-              <w:pStyle w:val="Compact"/>
-              <w:jc w:val="right"/>
-            </w:pPr>
-            <w:r>
-              <w:t xml:space="preserve">30542.4</w:t>
-            </w:r>
-          </w:p>
-        </w:tc>
-      </w:tr>
-      <w:tr>
-        <w:tc>
-          <w:tcPr/>
-          <w:p>
-            <w:pPr>
-              <w:pStyle w:val="Compact"/>
-              <w:jc w:val="left"/>
-            </w:pPr>
-            <w:r>
-              <w:t xml:space="preserve">Churn (Retenção)</w:t>
-            </w:r>
-          </w:p>
-        </w:tc>
-        <w:tc>
-          <w:tcPr/>
-          <w:p>
-            <w:pPr>
-              <w:pStyle w:val="Compact"/>
-              <w:jc w:val="right"/>
-            </w:pPr>
-            <w:r>
-              <w:t xml:space="preserve">50904.1</w:t>
-            </w:r>
-          </w:p>
-        </w:tc>
-      </w:tr>
-    </w:tbl>
-    <w:bookmarkEnd w:id="726"/>
-    <w:bookmarkStart w:id="727" w:name="tier5-87"/>
-    <w:bookmarkEnd w:id="727"/>
-    <w:bookmarkStart w:id="728" w:name="tier5-88"/>
+    <w:bookmarkEnd w:id="720"/>
+    <w:bookmarkEnd w:id="721"/>
+    <w:bookmarkStart w:id="722" w:name="tier5-86"/>
+    <w:p>
+      <w:pPr>
+        <w:pStyle w:val="FirstParagraph"/>
+      </w:pPr>
+      <w:r>
+        <w:t xml:space="preserve">Fator de Risco | Impacto Financeiro (R$) | % do Gap Total |</w:t>
+      </w:r>
+    </w:p>
+    <w:p>
+      <w:pPr>
+        <w:pStyle w:val="BodyText"/>
+      </w:pPr>
+      <w:r>
+        <w:t xml:space="preserve">|:—————–|:————————–|:—————–|</w:t>
+      </w:r>
+      <w:r>
+        <w:t xml:space="preserve"> </w:t>
+      </w:r>
+      <w:r>
+        <w:t xml:space="preserve">| Churn (Retenção) | R$ 50.904,07 | 50.0% |</w:t>
+      </w:r>
+      <w:r>
+        <w:t xml:space="preserve"> </w:t>
+      </w:r>
+      <w:r>
+        <w:t xml:space="preserve">| CAC (Aquisição) | R$ 30.542,44 | 30.0% |</w:t>
+      </w:r>
+      <w:r>
+        <w:t xml:space="preserve"> </w:t>
+      </w:r>
+      <w:r>
+        <w:t xml:space="preserve">| Outros | R$ 20.361,63 | 20.0% |</w:t>
+      </w:r>
+    </w:p>
+    <w:bookmarkEnd w:id="722"/>
+    <w:bookmarkStart w:id="723" w:name="tier5-87"/>
+    <w:bookmarkEnd w:id="723"/>
+    <w:bookmarkStart w:id="724" w:name="tier5-88"/>
     <w:p>
       <w:r>
         <w:pict>
@@ -38229,8 +37993,8 @@
         </w:pict>
       </w:r>
     </w:p>
-    <w:bookmarkEnd w:id="728"/>
-    <w:bookmarkStart w:id="731" w:name="tier5-89"/>
+    <w:bookmarkEnd w:id="724"/>
+    <w:bookmarkStart w:id="727" w:name="tier5-89"/>
     <w:tbl>
       <w:tblPr>
         <w:tblStyle w:val="Table"/>
@@ -38272,12 +38036,12 @@
                 <wp:inline>
                   <wp:extent cx="152400" cy="152400"/>
                   <wp:effectExtent b="0" l="0" r="0" t="0"/>
-                  <wp:docPr descr="" title="" id="729" name="Picture"/>
+                  <wp:docPr descr="" title="" id="725" name="Picture"/>
                   <a:graphic>
                     <a:graphicData uri="http://schemas.openxmlformats.org/drawingml/2006/picture">
                       <pic:pic>
                         <pic:nvPicPr>
-                          <pic:cNvPr descr="C:\Users\User\AppData\Local\Programs\Quarto\share\formats\docx\tip.png" id="730" name="Picture"/>
+                          <pic:cNvPr descr="C:\Users\User\AppData\Local\Programs\Quarto\share\formats\docx\tip.png" id="726" name="Picture"/>
                           <pic:cNvPicPr>
                             <a:picLocks noChangeArrowheads="1" noChangeAspect="1"/>
                           </pic:cNvPicPr>
@@ -38337,7 +38101,7 @@
               <w:pStyle w:val="Compact"/>
               <w:numPr>
                 <w:ilvl w:val="0"/>
-                <w:numId w:val="1081"/>
+                <w:numId w:val="1079"/>
               </w:numPr>
             </w:pPr>
             <w:r>
@@ -38351,7 +38115,23 @@
               <w:t xml:space="preserve"> </w:t>
             </w:r>
             <w:r>
-              <w:t xml:space="preserve">Sob estresse máximo, a empresa perde R$ 101.808,14 de caixa (50% do valor real).</w:t>
+              <w:t xml:space="preserve">O Gap de Caixa totaliza R$ 101.808,14. O fator</w:t>
+            </w:r>
+            <w:r>
+              <w:t xml:space="preserve"> </w:t>
+            </w:r>
+            <w:r>
+              <w:rPr>
+                <w:b/>
+                <w:bCs/>
+              </w:rPr>
+              <w:t xml:space="preserve">Churn (Retenção)</w:t>
+            </w:r>
+            <w:r>
+              <w:t xml:space="preserve"> </w:t>
+            </w:r>
+            <w:r>
+              <w:t xml:space="preserve">responde sozinho por 50% dessa perda.</w:t>
             </w:r>
           </w:p>
           <w:p>
@@ -38359,7 +38139,7 @@
               <w:pStyle w:val="Compact"/>
               <w:numPr>
                 <w:ilvl w:val="0"/>
-                <w:numId w:val="1081"/>
+                <w:numId w:val="1079"/>
               </w:numPr>
             </w:pPr>
             <w:r>
@@ -38373,32 +38153,7 @@
               <w:t xml:space="preserve"> </w:t>
             </w:r>
             <w:r>
-              <w:t xml:space="preserve">O principal ofensor</w:t>
-            </w:r>
-            <w:r>
-              <w:t xml:space="preserve"> </w:t>
-            </w:r>
-            <w:r>
-              <w:t xml:space="preserve">‘vazando’</w:t>
-            </w:r>
-            <w:r>
-              <w:t xml:space="preserve"> </w:t>
-            </w:r>
-            <w:r>
-              <w:t xml:space="preserve">valor é:</w:t>
-            </w:r>
-            <w:r>
-              <w:t xml:space="preserve"> </w:t>
-            </w:r>
-            <w:r>
-              <w:rPr>
-                <w:b/>
-                <w:bCs/>
-              </w:rPr>
-              <w:t xml:space="preserve">Churn (Retenção)</w:t>
-            </w:r>
-            <w:r>
-              <w:t xml:space="preserve">.</w:t>
+              <w:t xml:space="preserve">A alta sensibilidade ao Churn (Retenção) indica que o modelo de negócios depende excessivamente da eficiência desta métrica no pior cenário.</w:t>
             </w:r>
           </w:p>
           <w:p>
@@ -38406,7 +38161,7 @@
               <w:pStyle w:val="Compact"/>
               <w:numPr>
                 <w:ilvl w:val="0"/>
-                <w:numId w:val="1081"/>
+                <w:numId w:val="1079"/>
               </w:numPr>
             </w:pPr>
             <w:r>
@@ -38420,7 +38175,7 @@
               <w:t xml:space="preserve"> </w:t>
             </w:r>
             <w:r>
-              <w:t xml:space="preserve">Isso indica alta sensibilidade a este fator específico, exigindo hedge ou mitigação.</w:t>
+              <w:t xml:space="preserve">Uma deterioração isolada em Churn (Retenção) é suficiente para consumir R$ 50.904,07 do caixa projetado.</w:t>
             </w:r>
           </w:p>
           <w:p>
@@ -38428,7 +38183,7 @@
               <w:pStyle w:val="Compact"/>
               <w:numPr>
                 <w:ilvl w:val="0"/>
-                <w:numId w:val="1081"/>
+                <w:numId w:val="1079"/>
               </w:numPr>
             </w:pPr>
             <w:r>
@@ -38442,7 +38197,242 @@
               <w:t xml:space="preserve"> </w:t>
             </w:r>
             <w:r>
-              <w:t xml:space="preserve">Criar plano de contingência focado em controlar Churn (Retenção).</w:t>
+              <w:t xml:space="preserve">Hedge Operacional: Diversificar fontes e otimizar Churn (Retenção) para reduzir sua volatilidade.</w:t>
+            </w:r>
+          </w:p>
+          <w:p/>
+        </w:tc>
+      </w:tr>
+    </w:tbl>
+    <w:bookmarkEnd w:id="727"/>
+    <w:bookmarkStart w:id="728" w:name="tier5-90"/>
+    <w:bookmarkEnd w:id="728"/>
+    <w:bookmarkStart w:id="731" w:name="tier5-91"/>
+    <w:tbl>
+      <w:tblPr>
+        <w:tblStyle w:val="Table"/>
+        <w:tblLook w:firstRow="0" w:lastRow="0" w:firstColumn="0" w:lastColumn="0" w:noHBand="0" w:noVBand="0" w:val="0000"/>
+        <w:tblBorders>
+          <w:top w:val="single" w:sz="4" w:space="0" w:color="0758E5"/>
+          <w:left w:val="single" w:sz="24" w:space="0" w:color="0758E5"/>
+          <w:bottom w:val="single" w:sz="4" w:space="0" w:color="0758E5"/>
+          <w:right w:val="single" w:sz="4" w:space="0" w:color="0758E5"/>
+        </w:tblBorders>
+        <w:tblCellMar>
+          <w:left w:w="144" w:type="dxa"/>
+          <w:right w:w="144" w:type="dxa"/>
+        </w:tblCellMar>
+        <w:tblLook w:firstRow="0" w:lastRow="0" w:firstColumn="0" w:lastColumn="0" w:noHBand="0" w:noVBand="0" w:val="0000"/>
+      </w:tblPr>
+      <w:tr>
+        <w:trPr>
+          <w:cantSplit/>
+        </w:trPr>
+        <w:tc>
+          <w:tcPr>
+            <w:shd w:color="auto" w:fill="dae6fb" w:val="clear"/>
+            <w:tcMar>
+              <w:top w:w="92" w:type="dxa"/>
+              <w:bottom w:w="92" w:type="dxa"/>
+            </w:tcMar>
+          </w:tcPr>
+          <w:p>
+            <w:pPr>
+              <w:pStyle w:val="FirstParagraph"/>
+            </w:pPr>
+            <w:pPr>
+              <w:spacing w:before="0" w:after="0"/>
+              <w:textAlignment w:val="center"/>
+            </w:pPr>
+            <w:r>
+              <w:drawing>
+                <wp:inline>
+                  <wp:extent cx="152400" cy="152400"/>
+                  <wp:effectExtent b="0" l="0" r="0" t="0"/>
+                  <wp:docPr descr="" title="" id="729" name="Picture"/>
+                  <a:graphic>
+                    <a:graphicData uri="http://schemas.openxmlformats.org/drawingml/2006/picture">
+                      <pic:pic>
+                        <pic:nvPicPr>
+                          <pic:cNvPr descr="C:\Users\User\AppData\Local\Programs\Quarto\share\formats\docx\note.png" id="730" name="Picture"/>
+                          <pic:cNvPicPr>
+                            <a:picLocks noChangeArrowheads="1" noChangeAspect="1"/>
+                          </pic:cNvPicPr>
+                        </pic:nvPicPr>
+                        <pic:blipFill>
+                          <a:blip r:embed="rId20"/>
+                          <a:stretch>
+                            <a:fillRect/>
+                          </a:stretch>
+                        </pic:blipFill>
+                        <pic:spPr bwMode="auto">
+                          <a:xfrm>
+                            <a:off x="0" y="0"/>
+                            <a:ext cx="152400" cy="152400"/>
+                          </a:xfrm>
+                          <a:prstGeom prst="rect">
+                            <a:avLst/>
+                          </a:prstGeom>
+                          <a:noFill/>
+                          <a:ln w="9525">
+                            <a:noFill/>
+                            <a:headEnd/>
+                            <a:tailEnd/>
+                          </a:ln>
+                        </pic:spPr>
+                      </pic:pic>
+                    </a:graphicData>
+                  </a:graphic>
+                </wp:inline>
+              </w:drawing>
+            </w:r>
+            <w:r>
+              <w:t xml:space="preserve"> </w:t>
+            </w:r>
+            <w:r>
+              <w:t xml:space="preserve"> </w:t>
+            </w:r>
+            <w:r>
+              <w:t xml:space="preserve">📉 COMO INTERPRETAR O GAP DE VAZAMENTO</w:t>
+            </w:r>
+          </w:p>
+        </w:tc>
+      </w:tr>
+      <w:tr>
+        <w:trPr>
+          <w:cantSplit/>
+        </w:trPr>
+        <w:tc>
+          <w:tcPr>
+            <w:tcMar>
+              <w:top w:w="108" w:type="dxa"/>
+              <w:bottom w:w="108" w:type="dxa"/>
+            </w:tcMar>
+          </w:tcPr>
+          <w:p>
+            <w:pPr>
+              <w:pStyle w:val="BodyText"/>
+            </w:pPr>
+            <w:pPr>
+              <w:spacing w:before="16"/>
+            </w:pPr>
+            <w:r>
+              <w:rPr>
+                <w:b/>
+                <w:bCs/>
+              </w:rPr>
+              <w:t xml:space="preserve">LÓGICA DO TESTE DE ESTRESSE:</w:t>
+            </w:r>
+            <w:r>
+              <w:t xml:space="preserve"> </w:t>
+            </w:r>
+            <w:r>
+              <w:t xml:space="preserve">Simulamos um cenário de</w:t>
+            </w:r>
+            <w:r>
+              <w:t xml:space="preserve"> </w:t>
+            </w:r>
+            <w:r>
+              <w:rPr>
+                <w:b/>
+                <w:bCs/>
+              </w:rPr>
+              <w:t xml:space="preserve">“Tempestade Perfeita”</w:t>
+            </w:r>
+            <w:r>
+              <w:t xml:space="preserve"> </w:t>
+            </w:r>
+            <w:r>
+              <w:t xml:space="preserve">onde os multiplicadores adversos (definidos na Célula 2B Config) atuam simultaneamente: Churn sobe, Conversão cai e CAC aumenta.</w:t>
+            </w:r>
+          </w:p>
+          <w:p>
+            <w:pPr>
+              <w:pStyle w:val="BodyText"/>
+            </w:pPr>
+            <w:pPr>
+              <w:spacing w:after="16"/>
+            </w:pPr>
+            <w:r>
+              <w:rPr>
+                <w:b/>
+                <w:bCs/>
+              </w:rPr>
+              <w:t xml:space="preserve">O QUE O GRÁFICO DIZ:</w:t>
+            </w:r>
+            <w:r>
+              <w:t xml:space="preserve"> </w:t>
+            </w:r>
+            <w:r>
+              <w:t xml:space="preserve">*</w:t>
+            </w:r>
+            <w:r>
+              <w:t xml:space="preserve"> </w:t>
+            </w:r>
+            <w:r>
+              <w:rPr>
+                <w:b/>
+                <w:bCs/>
+              </w:rPr>
+              <w:t xml:space="preserve">Área Cinza (Gap):</w:t>
+            </w:r>
+            <w:r>
+              <w:t xml:space="preserve"> </w:t>
+            </w:r>
+            <w:r>
+              <w:t xml:space="preserve">Representa o valor financeiro destruído pela crise ao longo do tempo. É o</w:t>
+            </w:r>
+            <w:r>
+              <w:t xml:space="preserve"> </w:t>
+            </w:r>
+            <w:r>
+              <w:t xml:space="preserve">“Custo da Fragilidade”</w:t>
+            </w:r>
+            <w:r>
+              <w:t xml:space="preserve">.</w:t>
+            </w:r>
+            <w:r>
+              <w:t xml:space="preserve"> </w:t>
+            </w:r>
+            <w:r>
+              <w:t xml:space="preserve">*</w:t>
+            </w:r>
+            <w:r>
+              <w:t xml:space="preserve"> </w:t>
+            </w:r>
+            <w:r>
+              <w:rPr>
+                <w:b/>
+                <w:bCs/>
+              </w:rPr>
+              <w:t xml:space="preserve">Waterfall (Direita):</w:t>
+            </w:r>
+            <w:r>
+              <w:t xml:space="preserve"> </w:t>
+            </w:r>
+            <w:r>
+              <w:t xml:space="preserve">Isola matematicamente a culpa. Se a barra de</w:t>
+            </w:r>
+            <w:r>
+              <w:t xml:space="preserve"> </w:t>
+            </w:r>
+            <w:r>
+              <w:t xml:space="preserve">“Churn”</w:t>
+            </w:r>
+            <w:r>
+              <w:t xml:space="preserve"> </w:t>
+            </w:r>
+            <w:r>
+              <w:t xml:space="preserve">é a maior, sua empresa não quebra por falta de vendas, mas porque é um</w:t>
+            </w:r>
+            <w:r>
+              <w:t xml:space="preserve"> </w:t>
+            </w:r>
+            <w:r>
+              <w:t xml:space="preserve">“balde furado”</w:t>
+            </w:r>
+            <w:r>
+              <w:t xml:space="preserve">.</w:t>
             </w:r>
           </w:p>
           <w:p/>
@@ -38450,9 +38440,7 @@
       </w:tr>
     </w:tbl>
     <w:bookmarkEnd w:id="731"/>
-    <w:bookmarkStart w:id="732" w:name="tier5-90"/>
-    <w:bookmarkEnd w:id="732"/>
-    <w:bookmarkStart w:id="733" w:name="tier5-91"/>
+    <w:bookmarkStart w:id="732" w:name="tier5-92"/>
     <w:p>
       <w:r>
         <w:pict>
@@ -38460,8 +38448,8 @@
         </w:pict>
       </w:r>
     </w:p>
-    <w:bookmarkEnd w:id="733"/>
-    <w:bookmarkStart w:id="736" w:name="tier5-92"/>
+    <w:bookmarkEnd w:id="732"/>
+    <w:bookmarkStart w:id="735" w:name="tier5-93"/>
     <w:tbl>
       <w:tblPr>
         <w:tblStyle w:val="Table"/>
@@ -38503,12 +38491,12 @@
                 <wp:inline>
                   <wp:extent cx="152400" cy="152400"/>
                   <wp:effectExtent b="0" l="0" r="0" t="0"/>
-                  <wp:docPr descr="" title="" id="734" name="Picture"/>
+                  <wp:docPr descr="" title="" id="733" name="Picture"/>
                   <a:graphic>
                     <a:graphicData uri="http://schemas.openxmlformats.org/drawingml/2006/picture">
                       <pic:pic>
                         <pic:nvPicPr>
-                          <pic:cNvPr descr="C:\Users\User\AppData\Local\Programs\Quarto\share\formats\docx\warning.png" id="735" name="Picture"/>
+                          <pic:cNvPr descr="C:\Users\User\AppData\Local\Programs\Quarto\share\formats\docx\warning.png" id="734" name="Picture"/>
                           <pic:cNvPicPr>
                             <a:picLocks noChangeArrowheads="1" noChangeAspect="1"/>
                           </pic:cNvPicPr>
@@ -38627,13 +38615,13 @@
                 <w:b/>
                 <w:bCs/>
               </w:rPr>
-              <w:t xml:space="preserve">92.7%</w:t>
-            </w:r>
-            <w:r>
-              <w:t xml:space="preserve"> </w:t>
-            </w:r>
-            <w:r>
-              <w:t xml:space="preserve">— ou seja, em 93 de cada 100 futuros</w:t>
+              <w:t xml:space="preserve">99.3%</w:t>
+            </w:r>
+            <w:r>
+              <w:t xml:space="preserve"> </w:t>
+            </w:r>
+            <w:r>
+              <w:t xml:space="preserve">— ou seja, em 99 de cada 100 futuros</w:t>
             </w:r>
             <w:r>
               <w:t xml:space="preserve"> </w:t>
@@ -38665,7 +38653,7 @@
                 <w:b/>
                 <w:bCs/>
               </w:rPr>
-              <w:t xml:space="preserve">R$ 197.746,61</w:t>
+              <w:t xml:space="preserve">R$ 137.084,72</w:t>
             </w:r>
             <w:r>
               <w:t xml:space="preserve">, enquanto o</w:t>
@@ -38700,7 +38688,7 @@
                 <w:b/>
                 <w:bCs/>
               </w:rPr>
-              <w:t xml:space="preserve">R$ -5.198,67</w:t>
+              <w:t xml:space="preserve">R$ 3.056,70</w:t>
             </w:r>
             <w:r>
               <w:t xml:space="preserve">.</w:t>
@@ -38750,7 +38738,7 @@
                 <w:b/>
                 <w:bCs/>
               </w:rPr>
-              <w:t xml:space="preserve">74.0%</w:t>
+              <w:t xml:space="preserve">72.7%</w:t>
             </w:r>
             <w:r>
               <w:t xml:space="preserve"> </w:t>
@@ -38852,13 +38840,13 @@
                 <w:b/>
                 <w:bCs/>
               </w:rPr>
-              <w:t xml:space="preserve">R$ 1.739.868,78</w:t>
-            </w:r>
-            <w:r>
-              <w:t xml:space="preserve"> </w:t>
-            </w:r>
-            <w:r>
-              <w:t xml:space="preserve">(8.8x a mediana),</w:t>
+              <w:t xml:space="preserve">R$ 1.633.344,56</w:t>
+            </w:r>
+            <w:r>
+              <w:t xml:space="preserve"> </w:t>
+            </w:r>
+            <w:r>
+              <w:t xml:space="preserve">(11.9x a mediana),</w:t>
             </w:r>
             <w:r>
               <w:t xml:space="preserve"> </w:t>
@@ -38946,9 +38934,9 @@
         </w:tc>
       </w:tr>
     </w:tbl>
+    <w:bookmarkEnd w:id="735"/>
     <w:bookmarkEnd w:id="736"/>
-    <w:bookmarkEnd w:id="737"/>
-    <w:bookmarkStart w:id="738" w:name="metodologia-completa"/>
+    <w:bookmarkStart w:id="737" w:name="metodologia-completa"/>
     <w:p>
       <w:pPr>
         <w:pStyle w:val="Heading1"/>
@@ -38962,7 +38950,7 @@
         <w:pStyle w:val="Compact"/>
         <w:numPr>
           <w:ilvl w:val="0"/>
-          <w:numId w:val="1082"/>
+          <w:numId w:val="1080"/>
         </w:numPr>
       </w:pPr>
       <w:r>
@@ -38984,7 +38972,7 @@
         <w:pStyle w:val="Compact"/>
         <w:numPr>
           <w:ilvl w:val="0"/>
-          <w:numId w:val="1082"/>
+          <w:numId w:val="1080"/>
         </w:numPr>
       </w:pPr>
       <w:r>
@@ -39006,7 +38994,7 @@
         <w:pStyle w:val="Compact"/>
         <w:numPr>
           <w:ilvl w:val="0"/>
-          <w:numId w:val="1082"/>
+          <w:numId w:val="1080"/>
         </w:numPr>
       </w:pPr>
       <w:r>
@@ -39028,7 +39016,7 @@
         <w:pStyle w:val="Compact"/>
         <w:numPr>
           <w:ilvl w:val="0"/>
-          <w:numId w:val="1082"/>
+          <w:numId w:val="1080"/>
         </w:numPr>
       </w:pPr>
       <w:r>
@@ -39050,7 +39038,7 @@
         <w:pStyle w:val="Compact"/>
         <w:numPr>
           <w:ilvl w:val="0"/>
-          <w:numId w:val="1082"/>
+          <w:numId w:val="1080"/>
         </w:numPr>
       </w:pPr>
       <w:r>
@@ -39072,7 +39060,7 @@
         <w:pStyle w:val="Compact"/>
         <w:numPr>
           <w:ilvl w:val="0"/>
-          <w:numId w:val="1082"/>
+          <w:numId w:val="1080"/>
         </w:numPr>
       </w:pPr>
       <w:r>
@@ -39107,8 +39095,8 @@
         <w:t xml:space="preserve">Celulas 5A (Cenario Real) e 5B (Cenario Ideal)</w:t>
       </w:r>
     </w:p>
-    <w:bookmarkEnd w:id="738"/>
-    <w:bookmarkStart w:id="740" w:name="premissas-chave"/>
+    <w:bookmarkEnd w:id="737"/>
+    <w:bookmarkStart w:id="739" w:name="premissas-chave"/>
     <w:p>
       <w:pPr>
         <w:pStyle w:val="Heading1"/>
@@ -39117,7 +39105,7 @@
         <w:t xml:space="preserve">Premissas-Chave</w:t>
       </w:r>
     </w:p>
-    <w:bookmarkStart w:id="739" w:name="premissas"/>
+    <w:bookmarkStart w:id="738" w:name="premissas"/>
     <w:tbl>
       <w:tblPr>
         <w:tblStyle w:val="Table"/>
@@ -39284,9 +39272,9 @@
         </w:tc>
       </w:tr>
     </w:tbl>
+    <w:bookmarkEnd w:id="738"/>
     <w:bookmarkEnd w:id="739"/>
-    <w:bookmarkEnd w:id="740"/>
-    <w:bookmarkStart w:id="743" w:name="conclusoes-executivas"/>
+    <w:bookmarkStart w:id="742" w:name="conclusoes-executivas"/>
     <w:p>
       <w:pPr>
         <w:pStyle w:val="Heading1"/>
@@ -39336,12 +39324,12 @@
                 <wp:inline>
                   <wp:extent cx="152400" cy="152400"/>
                   <wp:effectExtent b="0" l="0" r="0" t="0"/>
-                  <wp:docPr descr="" title="" id="741" name="Picture"/>
+                  <wp:docPr descr="" title="" id="740" name="Picture"/>
                   <a:graphic>
                     <a:graphicData uri="http://schemas.openxmlformats.org/drawingml/2006/picture">
                       <pic:pic>
                         <pic:nvPicPr>
-                          <pic:cNvPr descr="C:\Users\User\AppData\Local\Programs\Quarto\share\formats\docx\important.png" id="742" name="Picture"/>
+                          <pic:cNvPr descr="C:\Users\User\AppData\Local\Programs\Quarto\share\formats\docx\important.png" id="741" name="Picture"/>
                           <pic:cNvPicPr>
                             <a:picLocks noChangeArrowheads="1" noChangeAspect="1"/>
                           </pic:cNvPicPr>
@@ -39401,7 +39389,7 @@
               <w:pStyle w:val="Compact"/>
               <w:numPr>
                 <w:ilvl w:val="0"/>
-                <w:numId w:val="1083"/>
+                <w:numId w:val="1081"/>
               </w:numPr>
             </w:pPr>
             <w:r>
@@ -39413,7 +39401,7 @@
               <w:pStyle w:val="Compact"/>
               <w:numPr>
                 <w:ilvl w:val="0"/>
-                <w:numId w:val="1083"/>
+                <w:numId w:val="1081"/>
               </w:numPr>
             </w:pPr>
             <w:r>
@@ -39425,7 +39413,7 @@
               <w:pStyle w:val="Compact"/>
               <w:numPr>
                 <w:ilvl w:val="0"/>
-                <w:numId w:val="1083"/>
+                <w:numId w:val="1081"/>
               </w:numPr>
             </w:pPr>
             <w:r>
@@ -39437,7 +39425,7 @@
               <w:pStyle w:val="Compact"/>
               <w:numPr>
                 <w:ilvl w:val="1"/>
-                <w:numId w:val="1084"/>
+                <w:numId w:val="1082"/>
               </w:numPr>
             </w:pPr>
             <w:r>
@@ -39449,7 +39437,7 @@
               <w:pStyle w:val="Compact"/>
               <w:numPr>
                 <w:ilvl w:val="1"/>
-                <w:numId w:val="1084"/>
+                <w:numId w:val="1082"/>
               </w:numPr>
             </w:pPr>
             <w:r>
@@ -39461,7 +39449,7 @@
               <w:pStyle w:val="Compact"/>
               <w:numPr>
                 <w:ilvl w:val="1"/>
-                <w:numId w:val="1084"/>
+                <w:numId w:val="1082"/>
               </w:numPr>
             </w:pPr>
             <w:r>
@@ -39473,7 +39461,7 @@
               <w:pStyle w:val="Compact"/>
               <w:numPr>
                 <w:ilvl w:val="1"/>
-                <w:numId w:val="1084"/>
+                <w:numId w:val="1082"/>
               </w:numPr>
             </w:pPr>
             <w:r>
@@ -39485,7 +39473,7 @@
               <w:pStyle w:val="Compact"/>
               <w:numPr>
                 <w:ilvl w:val="0"/>
-                <w:numId w:val="1083"/>
+                <w:numId w:val="1081"/>
               </w:numPr>
             </w:pPr>
             <w:r>
@@ -39527,7 +39515,7 @@
         <w:t xml:space="preserve">Documento estruturado segundo padroes internacionais de reporting executivo.</w:t>
       </w:r>
     </w:p>
-    <w:bookmarkEnd w:id="743"/>
+    <w:bookmarkEnd w:id="742"/>
     <w:sectPr>
       <w:footnotePr>
         <w:numRestart w:val="eachSect"/>
@@ -40475,12 +40463,6 @@
     <w:abstractNumId w:val="991"/>
   </w:num>
   <w:num w:numId="1072">
-    <w:abstractNumId w:val="991"/>
-  </w:num>
-  <w:num w:numId="1073">
-    <w:abstractNumId w:val="991"/>
-  </w:num>
-  <w:num w:numId="1074">
     <w:abstractNumId w:val="99411"/>
     <w:lvlOverride w:ilvl="0">
       <w:startOverride w:val="1"/>
@@ -40510,6 +40492,12 @@
       <w:startOverride w:val="1"/>
     </w:lvlOverride>
   </w:num>
+  <w:num w:numId="1073">
+    <w:abstractNumId w:val="991"/>
+  </w:num>
+  <w:num w:numId="1074">
+    <w:abstractNumId w:val="991"/>
+  </w:num>
   <w:num w:numId="1075">
     <w:abstractNumId w:val="991"/>
   </w:num>
@@ -40526,12 +40514,6 @@
     <w:abstractNumId w:val="991"/>
   </w:num>
   <w:num w:numId="1080">
-    <w:abstractNumId w:val="991"/>
-  </w:num>
-  <w:num w:numId="1081">
-    <w:abstractNumId w:val="991"/>
-  </w:num>
-  <w:num w:numId="1082">
     <w:abstractNumId w:val="99411"/>
     <w:lvlOverride w:ilvl="0">
       <w:startOverride w:val="1"/>
@@ -40561,7 +40543,7 @@
       <w:startOverride w:val="1"/>
     </w:lvlOverride>
   </w:num>
-  <w:num w:numId="1083">
+  <w:num w:numId="1081">
     <w:abstractNumId w:val="99411"/>
     <w:lvlOverride w:ilvl="0">
       <w:startOverride w:val="1"/>
@@ -40591,7 +40573,7 @@
       <w:startOverride w:val="1"/>
     </w:lvlOverride>
   </w:num>
-  <w:num w:numId="1084">
+  <w:num w:numId="1082">
     <w:abstractNumId w:val="991"/>
   </w:num>
 </w:numbering>

</xml_diff>

<commit_message>
finalização do notebook e documento final renderizado
</commit_message>
<xml_diff>
--- a/notebooks/quarto_pdf/relatorio_completo.docx
+++ b/notebooks/quarto_pdf/relatorio_completo.docx
@@ -23552,7 +23552,7 @@
                 <w:b/>
                 <w:bCs/>
               </w:rPr>
-              <w:t xml:space="preserve">93.3%</w:t>
+              <w:t xml:space="preserve">92.2%</w:t>
             </w:r>
           </w:p>
         </w:tc>
@@ -23568,7 +23568,7 @@
                 <w:b/>
                 <w:bCs/>
               </w:rPr>
-              <w:t xml:space="preserve">R$ -545,08</w:t>
+              <w:t xml:space="preserve">R$ -4.644,78</w:t>
             </w:r>
           </w:p>
         </w:tc>
@@ -23584,7 +23584,7 @@
                 <w:b/>
                 <w:bCs/>
               </w:rPr>
-              <w:t xml:space="preserve">614%</w:t>
+              <w:t xml:space="preserve">974%</w:t>
             </w:r>
           </w:p>
         </w:tc>
@@ -23600,7 +23600,7 @@
                 <w:b/>
                 <w:bCs/>
               </w:rPr>
-              <w:t xml:space="preserve">7.1x</w:t>
+              <w:t xml:space="preserve">10.8x</w:t>
             </w:r>
           </w:p>
         </w:tc>
@@ -23664,7 +23664,7 @@
               <w:jc w:val="center"/>
             </w:pPr>
             <w:r>
-              <w:t xml:space="preserve">+3.3% vs meta 90%</w:t>
+              <w:t xml:space="preserve">+2.2% vs meta 90%</w:t>
             </w:r>
           </w:p>
         </w:tc>
@@ -23676,7 +23676,7 @@
               <w:jc w:val="center"/>
             </w:pPr>
             <w:r>
-              <w:t xml:space="preserve">1k vs limite -50k</w:t>
+              <w:t xml:space="preserve">5k vs limite -50k</w:t>
             </w:r>
           </w:p>
         </w:tc>
@@ -23688,7 +23688,7 @@
               <w:jc w:val="center"/>
             </w:pPr>
             <w:r>
-              <w:t xml:space="preserve">614% potencial acima mediana</w:t>
+              <w:t xml:space="preserve">974% potencial acima mediana</w:t>
             </w:r>
           </w:p>
         </w:tc>
@@ -24913,7 +24913,7 @@
               <w:jc w:val="left"/>
             </w:pPr>
             <w:r>
-              <w:t xml:space="preserve">6.7%</w:t>
+              <w:t xml:space="preserve">7.8%</w:t>
             </w:r>
           </w:p>
         </w:tc>
@@ -24987,7 +24987,7 @@
               <w:jc w:val="left"/>
             </w:pPr>
             <w:r>
-              <w:t xml:space="preserve">20.0%</w:t>
+              <w:t xml:space="preserve">30.2%</w:t>
             </w:r>
           </w:p>
         </w:tc>
@@ -25061,7 +25061,7 @@
               <w:jc w:val="left"/>
             </w:pPr>
             <w:r>
-              <w:t xml:space="preserve">63.3%</w:t>
+              <w:t xml:space="preserve">55.9%</w:t>
             </w:r>
           </w:p>
         </w:tc>
@@ -25135,7 +25135,7 @@
               <w:jc w:val="left"/>
             </w:pPr>
             <w:r>
-              <w:t xml:space="preserve">43.3%</w:t>
+              <w:t xml:space="preserve">37.0%</w:t>
             </w:r>
           </w:p>
         </w:tc>
@@ -25209,7 +25209,7 @@
               <w:jc w:val="left"/>
             </w:pPr>
             <w:r>
-              <w:t xml:space="preserve">43.3%</w:t>
+              <w:t xml:space="preserve">32.4%</w:t>
             </w:r>
           </w:p>
         </w:tc>
@@ -26123,7 +26123,7 @@
               <w:jc w:val="left"/>
             </w:pPr>
             <w:r>
-              <w:t xml:space="preserve">R$ -545,08</w:t>
+              <w:t xml:space="preserve">R$ -4.644,78</w:t>
             </w:r>
           </w:p>
         </w:tc>
@@ -26197,7 +26197,7 @@
               <w:jc w:val="left"/>
             </w:pPr>
             <w:r>
-              <w:t xml:space="preserve">R$ -14.386,62</w:t>
+              <w:t xml:space="preserve">R$ -11.498,45</w:t>
             </w:r>
           </w:p>
         </w:tc>
@@ -26271,7 +26271,7 @@
               <w:jc w:val="left"/>
             </w:pPr>
             <w:r>
-              <w:t xml:space="preserve">R$ 207.042,18</w:t>
+              <w:t xml:space="preserve">R$ 131.259,56</w:t>
             </w:r>
           </w:p>
         </w:tc>
@@ -26345,7 +26345,7 @@
               <w:jc w:val="left"/>
             </w:pPr>
             <w:r>
-              <w:t xml:space="preserve">R$ 1.477.954,34</w:t>
+              <w:t xml:space="preserve">R$ 1.413.762,61</w:t>
             </w:r>
           </w:p>
         </w:tc>
@@ -26459,7 +26459,7 @@
         <w:t xml:space="preserve"> </w:t>
       </w:r>
       <w:r>
-        <w:t xml:space="preserve">6.7% (Atenção necessária)</w:t>
+        <w:t xml:space="preserve">7.8% (Atenção necessária)</w:t>
       </w:r>
     </w:p>
     <w:p>
@@ -26672,18 +26672,18 @@
               <w:pStyle w:val="Compact"/>
             </w:pPr>
             <w:r>
-              <w:t xml:space="preserve">R$ 795.905,40</w:t>
-            </w:r>
-          </w:p>
-        </w:tc>
-        <w:tc>
-          <w:tcPr/>
-          <w:p>
-            <w:pPr>
-              <w:pStyle w:val="Compact"/>
-            </w:pPr>
-            <w:r>
-              <w:t xml:space="preserve">🟡 Conservador (-24.0%)</w:t>
+              <w:t xml:space="preserve">R$ 465.684,60</w:t>
+            </w:r>
+          </w:p>
+        </w:tc>
+        <w:tc>
+          <w:tcPr/>
+          <w:p>
+            <w:pPr>
+              <w:pStyle w:val="Compact"/>
+            </w:pPr>
+            <w:r>
+              <w:t xml:space="preserve">🟢 Acima da média (+29.9%)</w:t>
             </w:r>
           </w:p>
         </w:tc>
@@ -26722,18 +26722,18 @@
               <w:pStyle w:val="Compact"/>
             </w:pPr>
             <w:r>
-              <w:t xml:space="preserve">R$ 207.042,18</w:t>
-            </w:r>
-          </w:p>
-        </w:tc>
-        <w:tc>
-          <w:tcPr/>
-          <w:p>
-            <w:pPr>
-              <w:pStyle w:val="Compact"/>
-            </w:pPr>
-            <w:r>
-              <w:t xml:space="preserve">🟡 Conservador (-20.1%)</w:t>
+              <w:t xml:space="preserve">R$ 131.259,56</w:t>
+            </w:r>
+          </w:p>
+        </w:tc>
+        <w:tc>
+          <w:tcPr/>
+          <w:p>
+            <w:pPr>
+              <w:pStyle w:val="Compact"/>
+            </w:pPr>
+            <w:r>
+              <w:t xml:space="preserve">🟢 Acima da média (+26.0%)</w:t>
             </w:r>
           </w:p>
         </w:tc>
@@ -27517,7 +27517,7 @@
           <w:b/>
           <w:bCs/>
         </w:rPr>
-        <w:t xml:space="preserve">0.0%</w:t>
+        <w:t xml:space="preserve">0.5%</w:t>
       </w:r>
       <w:r>
         <w:t xml:space="preserve"> </w:t>
@@ -27573,7 +27573,7 @@
           <w:b/>
           <w:bCs/>
         </w:rPr>
-        <w:t xml:space="preserve">16.7%</w:t>
+        <w:t xml:space="preserve">27.1%</w:t>
       </w:r>
       <w:r>
         <w:t xml:space="preserve"> </w:t>
@@ -27641,7 +27641,7 @@
           <w:b/>
           <w:bCs/>
         </w:rPr>
-        <w:t xml:space="preserve">83.3%</w:t>
+        <w:t xml:space="preserve">72.5%</w:t>
       </w:r>
       <w:r>
         <w:t xml:space="preserve"> </w:t>
@@ -27745,16 +27745,16 @@
         <w:tblLook w:firstRow="1" w:lastRow="0" w:firstColumn="0" w:lastColumn="0" w:noHBand="0" w:noVBand="0" w:val="0020"/>
       </w:tblPr>
       <w:tblGrid>
-        <w:gridCol w:w="965"/>
-        <w:gridCol w:w="676"/>
-        <w:gridCol w:w="724"/>
-        <w:gridCol w:w="724"/>
-        <w:gridCol w:w="724"/>
-        <w:gridCol w:w="820"/>
-        <w:gridCol w:w="820"/>
-        <w:gridCol w:w="820"/>
-        <w:gridCol w:w="820"/>
-        <w:gridCol w:w="820"/>
+        <w:gridCol w:w="983"/>
+        <w:gridCol w:w="688"/>
+        <w:gridCol w:w="688"/>
+        <w:gridCol w:w="737"/>
+        <w:gridCol w:w="737"/>
+        <w:gridCol w:w="836"/>
+        <w:gridCol w:w="836"/>
+        <w:gridCol w:w="836"/>
+        <w:gridCol w:w="737"/>
+        <w:gridCol w:w="836"/>
       </w:tblGrid>
       <w:tr>
         <w:trPr>
@@ -27902,103 +27902,103 @@
               <w:jc w:val="left"/>
             </w:pPr>
             <w:r>
-              <w:t xml:space="preserve">R$ -545,08</w:t>
-            </w:r>
-          </w:p>
-        </w:tc>
-        <w:tc>
-          <w:tcPr/>
-          <w:p>
-            <w:pPr>
-              <w:pStyle w:val="Compact"/>
-              <w:jc w:val="left"/>
-            </w:pPr>
-            <w:r>
-              <w:t xml:space="preserve">R$ 22.071,38</w:t>
-            </w:r>
-          </w:p>
-        </w:tc>
-        <w:tc>
-          <w:tcPr/>
-          <w:p>
-            <w:pPr>
-              <w:pStyle w:val="Compact"/>
-              <w:jc w:val="left"/>
-            </w:pPr>
-            <w:r>
-              <w:t xml:space="preserve">R$ 65.662,90</w:t>
-            </w:r>
-          </w:p>
-        </w:tc>
-        <w:tc>
-          <w:tcPr/>
-          <w:p>
-            <w:pPr>
-              <w:pStyle w:val="Compact"/>
-              <w:jc w:val="left"/>
-            </w:pPr>
-            <w:r>
-              <w:t xml:space="preserve">R$ 207.042,18</w:t>
-            </w:r>
-          </w:p>
-        </w:tc>
-        <w:tc>
-          <w:tcPr/>
-          <w:p>
-            <w:pPr>
-              <w:pStyle w:val="Compact"/>
-              <w:jc w:val="left"/>
-            </w:pPr>
-            <w:r>
-              <w:t xml:space="preserve">R$ 410.262,86</w:t>
-            </w:r>
-          </w:p>
-        </w:tc>
-        <w:tc>
-          <w:tcPr/>
-          <w:p>
-            <w:pPr>
-              <w:pStyle w:val="Compact"/>
-              <w:jc w:val="left"/>
-            </w:pPr>
-            <w:r>
-              <w:t xml:space="preserve">R$ 1.216.654,24</w:t>
-            </w:r>
-          </w:p>
-        </w:tc>
-        <w:tc>
-          <w:tcPr/>
-          <w:p>
-            <w:pPr>
-              <w:pStyle w:val="Compact"/>
-              <w:jc w:val="left"/>
-            </w:pPr>
-            <w:r>
-              <w:t xml:space="preserve">R$ 1.477.409,25</w:t>
-            </w:r>
-          </w:p>
-        </w:tc>
-        <w:tc>
-          <w:tcPr/>
-          <w:p>
-            <w:pPr>
-              <w:pStyle w:val="Compact"/>
-              <w:jc w:val="left"/>
-            </w:pPr>
-            <w:r>
-              <w:t xml:space="preserve">R$ 392.998,77</w:t>
-            </w:r>
-          </w:p>
-        </w:tc>
-        <w:tc>
-          <w:tcPr/>
-          <w:p>
-            <w:pPr>
-              <w:pStyle w:val="Compact"/>
-              <w:jc w:val="left"/>
-            </w:pPr>
-            <w:r>
-              <w:t xml:space="preserve">R$ 522.838,63</w:t>
+              <w:t xml:space="preserve">R$ -4.644,78</w:t>
+            </w:r>
+          </w:p>
+        </w:tc>
+        <w:tc>
+          <w:tcPr/>
+          <w:p>
+            <w:pPr>
+              <w:pStyle w:val="Compact"/>
+              <w:jc w:val="left"/>
+            </w:pPr>
+            <w:r>
+              <w:t xml:space="preserve">R$ 1.050,69</w:t>
+            </w:r>
+          </w:p>
+        </w:tc>
+        <w:tc>
+          <w:tcPr/>
+          <w:p>
+            <w:pPr>
+              <w:pStyle w:val="Compact"/>
+              <w:jc w:val="left"/>
+            </w:pPr>
+            <w:r>
+              <w:t xml:space="preserve">R$ 32.008,43</w:t>
+            </w:r>
+          </w:p>
+        </w:tc>
+        <w:tc>
+          <w:tcPr/>
+          <w:p>
+            <w:pPr>
+              <w:pStyle w:val="Compact"/>
+              <w:jc w:val="left"/>
+            </w:pPr>
+            <w:r>
+              <w:t xml:space="preserve">R$ 131.259,56</w:t>
+            </w:r>
+          </w:p>
+        </w:tc>
+        <w:tc>
+          <w:tcPr/>
+          <w:p>
+            <w:pPr>
+              <w:pStyle w:val="Compact"/>
+              <w:jc w:val="left"/>
+            </w:pPr>
+            <w:r>
+              <w:t xml:space="preserve">R$ 409.624,10</w:t>
+            </w:r>
+          </w:p>
+        </w:tc>
+        <w:tc>
+          <w:tcPr/>
+          <w:p>
+            <w:pPr>
+              <w:pStyle w:val="Compact"/>
+              <w:jc w:val="left"/>
+            </w:pPr>
+            <w:r>
+              <w:t xml:space="preserve">R$ 1.021.674,03</w:t>
+            </w:r>
+          </w:p>
+        </w:tc>
+        <w:tc>
+          <w:tcPr/>
+          <w:p>
+            <w:pPr>
+              <w:pStyle w:val="Compact"/>
+              <w:jc w:val="left"/>
+            </w:pPr>
+            <w:r>
+              <w:t xml:space="preserve">R$ 1.409.117,83</w:t>
+            </w:r>
+          </w:p>
+        </w:tc>
+        <w:tc>
+          <w:tcPr/>
+          <w:p>
+            <w:pPr>
+              <w:pStyle w:val="Compact"/>
+              <w:jc w:val="left"/>
+            </w:pPr>
+            <w:r>
+              <w:t xml:space="preserve">R$ 339.657,91</w:t>
+            </w:r>
+          </w:p>
+        </w:tc>
+        <w:tc>
+          <w:tcPr/>
+          <w:p>
+            <w:pPr>
+              <w:pStyle w:val="Compact"/>
+              <w:jc w:val="left"/>
+            </w:pPr>
+            <w:r>
+              <w:t xml:space="preserve">R$ 505.410,03</w:t>
             </w:r>
           </w:p>
         </w:tc>
@@ -28024,103 +28024,103 @@
               <w:jc w:val="left"/>
             </w:pPr>
             <w:r>
-              <w:t xml:space="preserve">R$ 42.444,36</w:t>
-            </w:r>
-          </w:p>
-        </w:tc>
-        <w:tc>
-          <w:tcPr/>
-          <w:p>
-            <w:pPr>
-              <w:pStyle w:val="Compact"/>
-              <w:jc w:val="left"/>
-            </w:pPr>
-            <w:r>
-              <w:t xml:space="preserve">R$ 105.303,60</w:t>
-            </w:r>
-          </w:p>
-        </w:tc>
-        <w:tc>
-          <w:tcPr/>
-          <w:p>
-            <w:pPr>
-              <w:pStyle w:val="Compact"/>
-              <w:jc w:val="left"/>
-            </w:pPr>
-            <w:r>
-              <w:t xml:space="preserve">R$ 200.056,20</w:t>
-            </w:r>
-          </w:p>
-        </w:tc>
-        <w:tc>
-          <w:tcPr/>
-          <w:p>
-            <w:pPr>
-              <w:pStyle w:val="Compact"/>
-              <w:jc w:val="left"/>
-            </w:pPr>
-            <w:r>
-              <w:t xml:space="preserve">R$ 795.905,40</w:t>
-            </w:r>
-          </w:p>
-        </w:tc>
-        <w:tc>
-          <w:tcPr/>
-          <w:p>
-            <w:pPr>
-              <w:pStyle w:val="Compact"/>
-              <w:jc w:val="left"/>
-            </w:pPr>
-            <w:r>
-              <w:t xml:space="preserve">R$ 1.657.587,30</w:t>
-            </w:r>
-          </w:p>
-        </w:tc>
-        <w:tc>
-          <w:tcPr/>
-          <w:p>
-            <w:pPr>
-              <w:pStyle w:val="Compact"/>
-              <w:jc w:val="left"/>
-            </w:pPr>
-            <w:r>
-              <w:t xml:space="preserve">R$ 2.826.844,20</w:t>
-            </w:r>
-          </w:p>
-        </w:tc>
-        <w:tc>
-          <w:tcPr/>
-          <w:p>
-            <w:pPr>
-              <w:pStyle w:val="Compact"/>
-              <w:jc w:val="left"/>
-            </w:pPr>
-            <w:r>
-              <w:t xml:space="preserve">R$ 2.992.158,06</w:t>
-            </w:r>
-          </w:p>
-        </w:tc>
-        <w:tc>
-          <w:tcPr/>
-          <w:p>
-            <w:pPr>
-              <w:pStyle w:val="Compact"/>
-              <w:jc w:val="left"/>
-            </w:pPr>
-            <w:r>
-              <w:t xml:space="preserve">R$ 1.098.848,28</w:t>
-            </w:r>
-          </w:p>
-        </w:tc>
-        <w:tc>
-          <w:tcPr/>
-          <w:p>
-            <w:pPr>
-              <w:pStyle w:val="Compact"/>
-              <w:jc w:val="left"/>
-            </w:pPr>
-            <w:r>
-              <w:t xml:space="preserve">R$ 1.077.319,08</w:t>
+              <w:t xml:space="preserve">R$ 21.218,40</w:t>
+            </w:r>
+          </w:p>
+        </w:tc>
+        <w:tc>
+          <w:tcPr/>
+          <w:p>
+            <w:pPr>
+              <w:pStyle w:val="Compact"/>
+              <w:jc w:val="left"/>
+            </w:pPr>
+            <w:r>
+              <w:t xml:space="preserve">R$ 37.044,00</w:t>
+            </w:r>
+          </w:p>
+        </w:tc>
+        <w:tc>
+          <w:tcPr/>
+          <w:p>
+            <w:pPr>
+              <w:pStyle w:val="Compact"/>
+              <w:jc w:val="left"/>
+            </w:pPr>
+            <w:r>
+              <w:t xml:space="preserve">R$ 126.687,00</w:t>
+            </w:r>
+          </w:p>
+        </w:tc>
+        <w:tc>
+          <w:tcPr/>
+          <w:p>
+            <w:pPr>
+              <w:pStyle w:val="Compact"/>
+              <w:jc w:val="left"/>
+            </w:pPr>
+            <w:r>
+              <w:t xml:space="preserve">R$ 465.684,60</w:t>
+            </w:r>
+          </w:p>
+        </w:tc>
+        <w:tc>
+          <w:tcPr/>
+          <w:p>
+            <w:pPr>
+              <w:pStyle w:val="Compact"/>
+              <w:jc w:val="left"/>
+            </w:pPr>
+            <w:r>
+              <w:t xml:space="preserve">R$ 1.713.237,30</w:t>
+            </w:r>
+          </w:p>
+        </w:tc>
+        <w:tc>
+          <w:tcPr/>
+          <w:p>
+            <w:pPr>
+              <w:pStyle w:val="Compact"/>
+              <w:jc w:val="left"/>
+            </w:pPr>
+            <w:r>
+              <w:t xml:space="preserve">R$ 2.645.483,76</w:t>
+            </w:r>
+          </w:p>
+        </w:tc>
+        <w:tc>
+          <w:tcPr/>
+          <w:p>
+            <w:pPr>
+              <w:pStyle w:val="Compact"/>
+              <w:jc w:val="left"/>
+            </w:pPr>
+            <w:r>
+              <w:t xml:space="preserve">R$ 3.075.962,64</w:t>
+            </w:r>
+          </w:p>
+        </w:tc>
+        <w:tc>
+          <w:tcPr/>
+          <w:p>
+            <w:pPr>
+              <w:pStyle w:val="Compact"/>
+              <w:jc w:val="left"/>
+            </w:pPr>
+            <w:r>
+              <w:t xml:space="preserve">R$ 987.683,97</w:t>
+            </w:r>
+          </w:p>
+        </w:tc>
+        <w:tc>
+          <w:tcPr/>
+          <w:p>
+            <w:pPr>
+              <w:pStyle w:val="Compact"/>
+              <w:jc w:val="left"/>
+            </w:pPr>
+            <w:r>
+              <w:t xml:space="preserve">R$ 1.102.403,53</w:t>
             </w:r>
           </w:p>
         </w:tc>
@@ -28146,103 +28146,103 @@
               <w:jc w:val="left"/>
             </w:pPr>
             <w:r>
-              <w:t xml:space="preserve">R$ 3.537,03</w:t>
-            </w:r>
-          </w:p>
-        </w:tc>
-        <w:tc>
-          <w:tcPr/>
-          <w:p>
-            <w:pPr>
-              <w:pStyle w:val="Compact"/>
-              <w:jc w:val="left"/>
-            </w:pPr>
-            <w:r>
-              <w:t xml:space="preserve">R$ 8.775,30</w:t>
-            </w:r>
-          </w:p>
-        </w:tc>
-        <w:tc>
-          <w:tcPr/>
-          <w:p>
-            <w:pPr>
-              <w:pStyle w:val="Compact"/>
-              <w:jc w:val="left"/>
-            </w:pPr>
-            <w:r>
-              <w:t xml:space="preserve">R$ 16.671,35</w:t>
-            </w:r>
-          </w:p>
-        </w:tc>
-        <w:tc>
-          <w:tcPr/>
-          <w:p>
-            <w:pPr>
-              <w:pStyle w:val="Compact"/>
-              <w:jc w:val="left"/>
-            </w:pPr>
-            <w:r>
-              <w:t xml:space="preserve">R$ 66.325,45</w:t>
-            </w:r>
-          </w:p>
-        </w:tc>
-        <w:tc>
-          <w:tcPr/>
-          <w:p>
-            <w:pPr>
-              <w:pStyle w:val="Compact"/>
-              <w:jc w:val="left"/>
-            </w:pPr>
-            <w:r>
-              <w:t xml:space="preserve">R$ 138.132,28</w:t>
-            </w:r>
-          </w:p>
-        </w:tc>
-        <w:tc>
-          <w:tcPr/>
-          <w:p>
-            <w:pPr>
-              <w:pStyle w:val="Compact"/>
-              <w:jc w:val="left"/>
-            </w:pPr>
-            <w:r>
-              <w:t xml:space="preserve">R$ 235.570,35</w:t>
-            </w:r>
-          </w:p>
-        </w:tc>
-        <w:tc>
-          <w:tcPr/>
-          <w:p>
-            <w:pPr>
-              <w:pStyle w:val="Compact"/>
-              <w:jc w:val="left"/>
-            </w:pPr>
-            <w:r>
-              <w:t xml:space="preserve">R$ 249.346,50</w:t>
-            </w:r>
-          </w:p>
-        </w:tc>
-        <w:tc>
-          <w:tcPr/>
-          <w:p>
-            <w:pPr>
-              <w:pStyle w:val="Compact"/>
-              <w:jc w:val="left"/>
-            </w:pPr>
-            <w:r>
-              <w:t xml:space="preserve">R$ 91.570,69</w:t>
-            </w:r>
-          </w:p>
-        </w:tc>
-        <w:tc>
-          <w:tcPr/>
-          <w:p>
-            <w:pPr>
-              <w:pStyle w:val="Compact"/>
-              <w:jc w:val="left"/>
-            </w:pPr>
-            <w:r>
-              <w:t xml:space="preserve">R$ 89.776,59</w:t>
+              <w:t xml:space="preserve">R$ 1.768,20</w:t>
+            </w:r>
+          </w:p>
+        </w:tc>
+        <w:tc>
+          <w:tcPr/>
+          <w:p>
+            <w:pPr>
+              <w:pStyle w:val="Compact"/>
+              <w:jc w:val="left"/>
+            </w:pPr>
+            <w:r>
+              <w:t xml:space="preserve">R$ 3.087,00</w:t>
+            </w:r>
+          </w:p>
+        </w:tc>
+        <w:tc>
+          <w:tcPr/>
+          <w:p>
+            <w:pPr>
+              <w:pStyle w:val="Compact"/>
+              <w:jc w:val="left"/>
+            </w:pPr>
+            <w:r>
+              <w:t xml:space="preserve">R$ 10.557,25</w:t>
+            </w:r>
+          </w:p>
+        </w:tc>
+        <w:tc>
+          <w:tcPr/>
+          <w:p>
+            <w:pPr>
+              <w:pStyle w:val="Compact"/>
+              <w:jc w:val="left"/>
+            </w:pPr>
+            <w:r>
+              <w:t xml:space="preserve">R$ 38.807,05</w:t>
+            </w:r>
+          </w:p>
+        </w:tc>
+        <w:tc>
+          <w:tcPr/>
+          <w:p>
+            <w:pPr>
+              <w:pStyle w:val="Compact"/>
+              <w:jc w:val="left"/>
+            </w:pPr>
+            <w:r>
+              <w:t xml:space="preserve">R$ 142.769,77</w:t>
+            </w:r>
+          </w:p>
+        </w:tc>
+        <w:tc>
+          <w:tcPr/>
+          <w:p>
+            <w:pPr>
+              <w:pStyle w:val="Compact"/>
+              <w:jc w:val="left"/>
+            </w:pPr>
+            <w:r>
+              <w:t xml:space="preserve">R$ 220.456,98</w:t>
+            </w:r>
+          </w:p>
+        </w:tc>
+        <w:tc>
+          <w:tcPr/>
+          <w:p>
+            <w:pPr>
+              <w:pStyle w:val="Compact"/>
+              <w:jc w:val="left"/>
+            </w:pPr>
+            <w:r>
+              <w:t xml:space="preserve">R$ 256.330,22</w:t>
+            </w:r>
+          </w:p>
+        </w:tc>
+        <w:tc>
+          <w:tcPr/>
+          <w:p>
+            <w:pPr>
+              <w:pStyle w:val="Compact"/>
+              <w:jc w:val="left"/>
+            </w:pPr>
+            <w:r>
+              <w:t xml:space="preserve">R$ 82.307,00</w:t>
+            </w:r>
+          </w:p>
+        </w:tc>
+        <w:tc>
+          <w:tcPr/>
+          <w:p>
+            <w:pPr>
+              <w:pStyle w:val="Compact"/>
+              <w:jc w:val="left"/>
+            </w:pPr>
+            <w:r>
+              <w:t xml:space="preserve">R$ 91.866,96</w:t>
             </w:r>
           </w:p>
         </w:tc>
@@ -28268,103 +28268,103 @@
               <w:jc w:val="left"/>
             </w:pPr>
             <w:r>
-              <w:t xml:space="preserve">35</w:t>
-            </w:r>
-          </w:p>
-        </w:tc>
-        <w:tc>
-          <w:tcPr/>
-          <w:p>
-            <w:pPr>
-              <w:pStyle w:val="Compact"/>
-              <w:jc w:val="left"/>
-            </w:pPr>
-            <w:r>
-              <w:t xml:space="preserve">87</w:t>
-            </w:r>
-          </w:p>
-        </w:tc>
-        <w:tc>
-          <w:tcPr/>
-          <w:p>
-            <w:pPr>
-              <w:pStyle w:val="Compact"/>
-              <w:jc w:val="left"/>
-            </w:pPr>
-            <w:r>
-              <w:t xml:space="preserve">162</w:t>
-            </w:r>
-          </w:p>
-        </w:tc>
-        <w:tc>
-          <w:tcPr/>
-          <w:p>
-            <w:pPr>
-              <w:pStyle w:val="Compact"/>
-              <w:jc w:val="left"/>
-            </w:pPr>
-            <w:r>
-              <w:t xml:space="preserve">646</w:t>
-            </w:r>
-          </w:p>
-        </w:tc>
-        <w:tc>
-          <w:tcPr/>
-          <w:p>
-            <w:pPr>
-              <w:pStyle w:val="Compact"/>
-              <w:jc w:val="left"/>
-            </w:pPr>
-            <w:r>
-              <w:t xml:space="preserve">1,352</w:t>
-            </w:r>
-          </w:p>
-        </w:tc>
-        <w:tc>
-          <w:tcPr/>
-          <w:p>
-            <w:pPr>
-              <w:pStyle w:val="Compact"/>
-              <w:jc w:val="left"/>
-            </w:pPr>
-            <w:r>
-              <w:t xml:space="preserve">2,286</w:t>
-            </w:r>
-          </w:p>
-        </w:tc>
-        <w:tc>
-          <w:tcPr/>
-          <w:p>
-            <w:pPr>
-              <w:pStyle w:val="Compact"/>
-              <w:jc w:val="left"/>
-            </w:pPr>
-            <w:r>
-              <w:t xml:space="preserve">2,400</w:t>
-            </w:r>
-          </w:p>
-        </w:tc>
-        <w:tc>
-          <w:tcPr/>
-          <w:p>
-            <w:pPr>
-              <w:pStyle w:val="Compact"/>
-              <w:jc w:val="left"/>
-            </w:pPr>
-            <w:r>
-              <w:t xml:space="preserve">893</w:t>
-            </w:r>
-          </w:p>
-        </w:tc>
-        <w:tc>
-          <w:tcPr/>
-          <w:p>
-            <w:pPr>
-              <w:pStyle w:val="Compact"/>
-              <w:jc w:val="left"/>
-            </w:pPr>
-            <w:r>
-              <w:t xml:space="preserve">876</w:t>
+              <w:t xml:space="preserve">17</w:t>
+            </w:r>
+          </w:p>
+        </w:tc>
+        <w:tc>
+          <w:tcPr/>
+          <w:p>
+            <w:pPr>
+              <w:pStyle w:val="Compact"/>
+              <w:jc w:val="left"/>
+            </w:pPr>
+            <w:r>
+              <w:t xml:space="preserve">30</w:t>
+            </w:r>
+          </w:p>
+        </w:tc>
+        <w:tc>
+          <w:tcPr/>
+          <w:p>
+            <w:pPr>
+              <w:pStyle w:val="Compact"/>
+              <w:jc w:val="left"/>
+            </w:pPr>
+            <w:r>
+              <w:t xml:space="preserve">103</w:t>
+            </w:r>
+          </w:p>
+        </w:tc>
+        <w:tc>
+          <w:tcPr/>
+          <w:p>
+            <w:pPr>
+              <w:pStyle w:val="Compact"/>
+              <w:jc w:val="left"/>
+            </w:pPr>
+            <w:r>
+              <w:t xml:space="preserve">380</w:t>
+            </w:r>
+          </w:p>
+        </w:tc>
+        <w:tc>
+          <w:tcPr/>
+          <w:p>
+            <w:pPr>
+              <w:pStyle w:val="Compact"/>
+              <w:jc w:val="left"/>
+            </w:pPr>
+            <w:r>
+              <w:t xml:space="preserve">1,398</w:t>
+            </w:r>
+          </w:p>
+        </w:tc>
+        <w:tc>
+          <w:tcPr/>
+          <w:p>
+            <w:pPr>
+              <w:pStyle w:val="Compact"/>
+              <w:jc w:val="left"/>
+            </w:pPr>
+            <w:r>
+              <w:t xml:space="preserve">2,155</w:t>
+            </w:r>
+          </w:p>
+        </w:tc>
+        <w:tc>
+          <w:tcPr/>
+          <w:p>
+            <w:pPr>
+              <w:pStyle w:val="Compact"/>
+              <w:jc w:val="left"/>
+            </w:pPr>
+            <w:r>
+              <w:t xml:space="preserve">2,503</w:t>
+            </w:r>
+          </w:p>
+        </w:tc>
+        <w:tc>
+          <w:tcPr/>
+          <w:p>
+            <w:pPr>
+              <w:pStyle w:val="Compact"/>
+              <w:jc w:val="left"/>
+            </w:pPr>
+            <w:r>
+              <w:t xml:space="preserve">805</w:t>
+            </w:r>
+          </w:p>
+        </w:tc>
+        <w:tc>
+          <w:tcPr/>
+          <w:p>
+            <w:pPr>
+              <w:pStyle w:val="Compact"/>
+              <w:jc w:val="left"/>
+            </w:pPr>
+            <w:r>
+              <w:t xml:space="preserve">897</w:t>
             </w:r>
           </w:p>
         </w:tc>
@@ -28390,103 +28390,103 @@
               <w:jc w:val="left"/>
             </w:pPr>
             <w:r>
-              <w:t xml:space="preserve">1.8x</w:t>
-            </w:r>
-          </w:p>
-        </w:tc>
-        <w:tc>
-          <w:tcPr/>
-          <w:p>
-            <w:pPr>
-              <w:pStyle w:val="Compact"/>
-              <w:jc w:val="left"/>
-            </w:pPr>
-            <w:r>
-              <w:t xml:space="preserve">1.9x</w:t>
-            </w:r>
-          </w:p>
-        </w:tc>
-        <w:tc>
-          <w:tcPr/>
-          <w:p>
-            <w:pPr>
-              <w:pStyle w:val="Compact"/>
-              <w:jc w:val="left"/>
-            </w:pPr>
-            <w:r>
-              <w:t xml:space="preserve">2.5x</w:t>
-            </w:r>
-          </w:p>
-        </w:tc>
-        <w:tc>
-          <w:tcPr/>
-          <w:p>
-            <w:pPr>
-              <w:pStyle w:val="Compact"/>
-              <w:jc w:val="left"/>
-            </w:pPr>
-            <w:r>
-              <w:t xml:space="preserve">4.5x</w:t>
-            </w:r>
-          </w:p>
-        </w:tc>
-        <w:tc>
-          <w:tcPr/>
-          <w:p>
-            <w:pPr>
-              <w:pStyle w:val="Compact"/>
-              <w:jc w:val="left"/>
-            </w:pPr>
-            <w:r>
-              <w:t xml:space="preserve">6.3x</w:t>
-            </w:r>
-          </w:p>
-        </w:tc>
-        <w:tc>
-          <w:tcPr/>
-          <w:p>
-            <w:pPr>
-              <w:pStyle w:val="Compact"/>
-              <w:jc w:val="left"/>
-            </w:pPr>
-            <w:r>
-              <w:t xml:space="preserve">9.1x</w:t>
-            </w:r>
-          </w:p>
-        </w:tc>
-        <w:tc>
-          <w:tcPr/>
-          <w:p>
-            <w:pPr>
-              <w:pStyle w:val="Compact"/>
-              <w:jc w:val="left"/>
-            </w:pPr>
-            <w:r>
-              <w:t xml:space="preserve">5504.5x</w:t>
-            </w:r>
-          </w:p>
-        </w:tc>
-        <w:tc>
-          <w:tcPr/>
-          <w:p>
-            <w:pPr>
-              <w:pStyle w:val="Compact"/>
-              <w:jc w:val="left"/>
-            </w:pPr>
-            <w:r>
-              <w:t xml:space="preserve">670.8x</w:t>
-            </w:r>
-          </w:p>
-        </w:tc>
-        <w:tc>
-          <w:tcPr/>
-          <w:p>
-            <w:pPr>
-              <w:pStyle w:val="Compact"/>
-              <w:jc w:val="left"/>
-            </w:pPr>
-            <w:r>
-              <w:t xml:space="preserve">2536.0x</w:t>
+              <w:t xml:space="preserve">0.8x</w:t>
+            </w:r>
+          </w:p>
+        </w:tc>
+        <w:tc>
+          <w:tcPr/>
+          <w:p>
+            <w:pPr>
+              <w:pStyle w:val="Compact"/>
+              <w:jc w:val="left"/>
+            </w:pPr>
+            <w:r>
+              <w:t xml:space="preserve">1.3x</w:t>
+            </w:r>
+          </w:p>
+        </w:tc>
+        <w:tc>
+          <w:tcPr/>
+          <w:p>
+            <w:pPr>
+              <w:pStyle w:val="Compact"/>
+              <w:jc w:val="left"/>
+            </w:pPr>
+            <w:r>
+              <w:t xml:space="preserve">2.2x</w:t>
+            </w:r>
+          </w:p>
+        </w:tc>
+        <w:tc>
+          <w:tcPr/>
+          <w:p>
+            <w:pPr>
+              <w:pStyle w:val="Compact"/>
+              <w:jc w:val="left"/>
+            </w:pPr>
+            <w:r>
+              <w:t xml:space="preserve">3.6x</w:t>
+            </w:r>
+          </w:p>
+        </w:tc>
+        <w:tc>
+          <w:tcPr/>
+          <w:p>
+            <w:pPr>
+              <w:pStyle w:val="Compact"/>
+              <w:jc w:val="left"/>
+            </w:pPr>
+            <w:r>
+              <w:t xml:space="preserve">5.8x</w:t>
+            </w:r>
+          </w:p>
+        </w:tc>
+        <w:tc>
+          <w:tcPr/>
+          <w:p>
+            <w:pPr>
+              <w:pStyle w:val="Compact"/>
+              <w:jc w:val="left"/>
+            </w:pPr>
+            <w:r>
+              <w:t xml:space="preserve">7.6x</w:t>
+            </w:r>
+          </w:p>
+        </w:tc>
+        <w:tc>
+          <w:tcPr/>
+          <w:p>
+            <w:pPr>
+              <w:pStyle w:val="Compact"/>
+              <w:jc w:val="left"/>
+            </w:pPr>
+            <w:r>
+              <w:t xml:space="preserve">8.7x</w:t>
+            </w:r>
+          </w:p>
+        </w:tc>
+        <w:tc>
+          <w:tcPr/>
+          <w:p>
+            <w:pPr>
+              <w:pStyle w:val="Compact"/>
+              <w:jc w:val="left"/>
+            </w:pPr>
+            <w:r>
+              <w:t xml:space="preserve">120.5x</w:t>
+            </w:r>
+          </w:p>
+        </w:tc>
+        <w:tc>
+          <w:tcPr/>
+          <w:p>
+            <w:pPr>
+              <w:pStyle w:val="Compact"/>
+              <w:jc w:val="left"/>
+            </w:pPr>
+            <w:r>
+              <w:t xml:space="preserve">1072.4x</w:t>
             </w:r>
           </w:p>
         </w:tc>
@@ -28536,19 +28536,19 @@
               <w:jc w:val="left"/>
             </w:pPr>
             <w:r>
-              <w:t xml:space="preserve">6.3%</w:t>
-            </w:r>
-          </w:p>
-        </w:tc>
-        <w:tc>
-          <w:tcPr/>
-          <w:p>
-            <w:pPr>
-              <w:pStyle w:val="Compact"/>
-              <w:jc w:val="left"/>
-            </w:pPr>
-            <w:r>
-              <w:t xml:space="preserve">7.4%</w:t>
+              <w:t xml:space="preserve">6.4%</w:t>
+            </w:r>
+          </w:p>
+        </w:tc>
+        <w:tc>
+          <w:tcPr/>
+          <w:p>
+            <w:pPr>
+              <w:pStyle w:val="Compact"/>
+              <w:jc w:val="left"/>
+            </w:pPr>
+            <w:r>
+              <w:t xml:space="preserve">8.1%</w:t>
             </w:r>
           </w:p>
         </w:tc>
@@ -28572,43 +28572,43 @@
               <w:jc w:val="left"/>
             </w:pPr>
             <w:r>
-              <w:t xml:space="preserve">12.2%</w:t>
-            </w:r>
-          </w:p>
-        </w:tc>
-        <w:tc>
-          <w:tcPr/>
-          <w:p>
-            <w:pPr>
-              <w:pStyle w:val="Compact"/>
-              <w:jc w:val="left"/>
-            </w:pPr>
-            <w:r>
-              <w:t xml:space="preserve">13.6%</w:t>
-            </w:r>
-          </w:p>
-        </w:tc>
-        <w:tc>
-          <w:tcPr/>
-          <w:p>
-            <w:pPr>
-              <w:pStyle w:val="Compact"/>
-              <w:jc w:val="left"/>
-            </w:pPr>
-            <w:r>
-              <w:t xml:space="preserve">8.5%</w:t>
-            </w:r>
-          </w:p>
-        </w:tc>
-        <w:tc>
-          <w:tcPr/>
-          <w:p>
-            <w:pPr>
-              <w:pStyle w:val="Compact"/>
-              <w:jc w:val="left"/>
-            </w:pPr>
-            <w:r>
-              <w:t xml:space="preserve">2.7%</w:t>
+              <w:t xml:space="preserve">13.3%</w:t>
+            </w:r>
+          </w:p>
+        </w:tc>
+        <w:tc>
+          <w:tcPr/>
+          <w:p>
+            <w:pPr>
+              <w:pStyle w:val="Compact"/>
+              <w:jc w:val="left"/>
+            </w:pPr>
+            <w:r>
+              <w:t xml:space="preserve">14.7%</w:t>
+            </w:r>
+          </w:p>
+        </w:tc>
+        <w:tc>
+          <w:tcPr/>
+          <w:p>
+            <w:pPr>
+              <w:pStyle w:val="Compact"/>
+              <w:jc w:val="left"/>
+            </w:pPr>
+            <w:r>
+              <w:t xml:space="preserve">8.9%</w:t>
+            </w:r>
+          </w:p>
+        </w:tc>
+        <w:tc>
+          <w:tcPr/>
+          <w:p>
+            <w:pPr>
+              <w:pStyle w:val="Compact"/>
+              <w:jc w:val="left"/>
+            </w:pPr>
+            <w:r>
+              <w:t xml:space="preserve">3.0%</w:t>
             </w:r>
           </w:p>
         </w:tc>
@@ -28634,7 +28634,19 @@
               <w:jc w:val="left"/>
             </w:pPr>
             <w:r>
-              <w:t xml:space="preserve">90.8%</w:t>
+              <w:t xml:space="preserve">83.3%</w:t>
+            </w:r>
+          </w:p>
+        </w:tc>
+        <w:tc>
+          <w:tcPr/>
+          <w:p>
+            <w:pPr>
+              <w:pStyle w:val="Compact"/>
+              <w:jc w:val="left"/>
+            </w:pPr>
+            <w:r>
+              <w:t xml:space="preserve">83.3%</w:t>
             </w:r>
           </w:p>
         </w:tc>
@@ -28670,67 +28682,55 @@
               <w:jc w:val="left"/>
             </w:pPr>
             <w:r>
-              <w:t xml:space="preserve">100.0%</w:t>
-            </w:r>
-          </w:p>
-        </w:tc>
-        <w:tc>
-          <w:tcPr/>
-          <w:p>
-            <w:pPr>
-              <w:pStyle w:val="Compact"/>
-              <w:jc w:val="left"/>
-            </w:pPr>
-            <w:r>
-              <w:t xml:space="preserve">113.7%</w:t>
-            </w:r>
-          </w:p>
-        </w:tc>
-        <w:tc>
-          <w:tcPr/>
-          <w:p>
-            <w:pPr>
-              <w:pStyle w:val="Compact"/>
-              <w:jc w:val="left"/>
-            </w:pPr>
-            <w:r>
-              <w:t xml:space="preserve">139.4%</w:t>
-            </w:r>
-          </w:p>
-        </w:tc>
-        <w:tc>
-          <w:tcPr/>
-          <w:p>
-            <w:pPr>
-              <w:pStyle w:val="Compact"/>
-              <w:jc w:val="left"/>
-            </w:pPr>
-            <w:r>
-              <w:t xml:space="preserve">140.5%</w:t>
-            </w:r>
-          </w:p>
-        </w:tc>
-        <w:tc>
-          <w:tcPr/>
-          <w:p>
-            <w:pPr>
-              <w:pStyle w:val="Compact"/>
-              <w:jc w:val="left"/>
-            </w:pPr>
-            <w:r>
-              <w:t xml:space="preserve">108.0%</w:t>
-            </w:r>
-          </w:p>
-        </w:tc>
-        <w:tc>
-          <w:tcPr/>
-          <w:p>
-            <w:pPr>
-              <w:pStyle w:val="Compact"/>
-              <w:jc w:val="left"/>
-            </w:pPr>
-            <w:r>
-              <w:t xml:space="preserve">17.0%</w:t>
+              <w:t xml:space="preserve">109.8%</w:t>
+            </w:r>
+          </w:p>
+        </w:tc>
+        <w:tc>
+          <w:tcPr/>
+          <w:p>
+            <w:pPr>
+              <w:pStyle w:val="Compact"/>
+              <w:jc w:val="left"/>
+            </w:pPr>
+            <w:r>
+              <w:t xml:space="preserve">124.6%</w:t>
+            </w:r>
+          </w:p>
+        </w:tc>
+        <w:tc>
+          <w:tcPr/>
+          <w:p>
+            <w:pPr>
+              <w:pStyle w:val="Compact"/>
+              <w:jc w:val="left"/>
+            </w:pPr>
+            <w:r>
+              <w:t xml:space="preserve">136.2%</w:t>
+            </w:r>
+          </w:p>
+        </w:tc>
+        <w:tc>
+          <w:tcPr/>
+          <w:p>
+            <w:pPr>
+              <w:pStyle w:val="Compact"/>
+              <w:jc w:val="left"/>
+            </w:pPr>
+            <w:r>
+              <w:t xml:space="preserve">104.9%</w:t>
+            </w:r>
+          </w:p>
+        </w:tc>
+        <w:tc>
+          <w:tcPr/>
+          <w:p>
+            <w:pPr>
+              <w:pStyle w:val="Compact"/>
+              <w:jc w:val="left"/>
+            </w:pPr>
+            <w:r>
+              <w:t xml:space="preserve">15.4%</w:t>
             </w:r>
           </w:p>
         </w:tc>
@@ -28782,103 +28782,103 @@
               <w:t xml:space="preserve"> </w:t>
             </w:r>
             <w:r>
-              <w:t xml:space="preserve">119,45</w:t>
-            </w:r>
-          </w:p>
-        </w:tc>
-        <w:tc>
-          <w:tcPr/>
-          <w:p>
-            <w:pPr>
-              <w:pStyle w:val="Compact"/>
-              <w:jc w:val="left"/>
-            </w:pPr>
-            <w:r>
-              <w:t xml:space="preserve">R$ 174,41</w:t>
-            </w:r>
-          </w:p>
-        </w:tc>
-        <w:tc>
-          <w:tcPr/>
-          <w:p>
-            <w:pPr>
-              <w:pStyle w:val="Compact"/>
-              <w:jc w:val="left"/>
-            </w:pPr>
-            <w:r>
-              <w:t xml:space="preserve">R$ 232,64</w:t>
-            </w:r>
-          </w:p>
-        </w:tc>
-        <w:tc>
-          <w:tcPr/>
-          <w:p>
-            <w:pPr>
-              <w:pStyle w:val="Compact"/>
-              <w:jc w:val="left"/>
-            </w:pPr>
-            <w:r>
-              <w:t xml:space="preserve">R$ 430,99</w:t>
-            </w:r>
-          </w:p>
-        </w:tc>
-        <w:tc>
-          <w:tcPr/>
-          <w:p>
-            <w:pPr>
-              <w:pStyle w:val="Compact"/>
-              <w:jc w:val="left"/>
-            </w:pPr>
-            <w:r>
-              <w:t xml:space="preserve">R$ 660,64</w:t>
-            </w:r>
-          </w:p>
-        </w:tc>
-        <w:tc>
-          <w:tcPr/>
-          <w:p>
-            <w:pPr>
-              <w:pStyle w:val="Compact"/>
-              <w:jc w:val="left"/>
-            </w:pPr>
-            <w:r>
-              <w:t xml:space="preserve">R$ 738,17</w:t>
-            </w:r>
-          </w:p>
-        </w:tc>
-        <w:tc>
-          <w:tcPr/>
-          <w:p>
-            <w:pPr>
-              <w:pStyle w:val="Compact"/>
-              <w:jc w:val="left"/>
-            </w:pPr>
-            <w:r>
-              <w:t xml:space="preserve">R$ 858,82</w:t>
-            </w:r>
-          </w:p>
-        </w:tc>
-        <w:tc>
-          <w:tcPr/>
-          <w:p>
-            <w:pPr>
-              <w:pStyle w:val="Compact"/>
-              <w:jc w:val="left"/>
-            </w:pPr>
-            <w:r>
-              <w:t xml:space="preserve">R$ 459,14</w:t>
-            </w:r>
-          </w:p>
-        </w:tc>
-        <w:tc>
-          <w:tcPr/>
-          <w:p>
-            <w:pPr>
-              <w:pStyle w:val="Compact"/>
-              <w:jc w:val="left"/>
-            </w:pPr>
-            <w:r>
-              <w:t xml:space="preserve">R$ 268,97</w:t>
+              <w:t xml:space="preserve">124,93</w:t>
+            </w:r>
+          </w:p>
+        </w:tc>
+        <w:tc>
+          <w:tcPr/>
+          <w:p>
+            <w:pPr>
+              <w:pStyle w:val="Compact"/>
+              <w:jc w:val="left"/>
+            </w:pPr>
+            <w:r>
+              <w:t xml:space="preserve">R$ 158,58</w:t>
+            </w:r>
+          </w:p>
+        </w:tc>
+        <w:tc>
+          <w:tcPr/>
+          <w:p>
+            <w:pPr>
+              <w:pStyle w:val="Compact"/>
+              <w:jc w:val="left"/>
+            </w:pPr>
+            <w:r>
+              <w:t xml:space="preserve">R$ 244,31</w:t>
+            </w:r>
+          </w:p>
+        </w:tc>
+        <w:tc>
+          <w:tcPr/>
+          <w:p>
+            <w:pPr>
+              <w:pStyle w:val="Compact"/>
+              <w:jc w:val="left"/>
+            </w:pPr>
+            <w:r>
+              <w:t xml:space="preserve">R$ 436,25</w:t>
+            </w:r>
+          </w:p>
+        </w:tc>
+        <w:tc>
+          <w:tcPr/>
+          <w:p>
+            <w:pPr>
+              <w:pStyle w:val="Compact"/>
+              <w:jc w:val="left"/>
+            </w:pPr>
+            <w:r>
+              <w:t xml:space="preserve">R$ 677,37</w:t>
+            </w:r>
+          </w:p>
+        </w:tc>
+        <w:tc>
+          <w:tcPr/>
+          <w:p>
+            <w:pPr>
+              <w:pStyle w:val="Compact"/>
+              <w:jc w:val="left"/>
+            </w:pPr>
+            <w:r>
+              <w:t xml:space="preserve">R$ 900,72</w:t>
+            </w:r>
+          </w:p>
+        </w:tc>
+        <w:tc>
+          <w:tcPr/>
+          <w:p>
+            <w:pPr>
+              <w:pStyle w:val="Compact"/>
+              <w:jc w:val="left"/>
+            </w:pPr>
+            <w:r>
+              <w:t xml:space="preserve">R$ 1.022,34</w:t>
+            </w:r>
+          </w:p>
+        </w:tc>
+        <w:tc>
+          <w:tcPr/>
+          <w:p>
+            <w:pPr>
+              <w:pStyle w:val="Compact"/>
+              <w:jc w:val="left"/>
+            </w:pPr>
+            <w:r>
+              <w:t xml:space="preserve">R$ 486,62</w:t>
+            </w:r>
+          </w:p>
+        </w:tc>
+        <w:tc>
+          <w:tcPr/>
+          <w:p>
+            <w:pPr>
+              <w:pStyle w:val="Compact"/>
+              <w:jc w:val="left"/>
+            </w:pPr>
+            <w:r>
+              <w:t xml:space="preserve">R$ 284,80</w:t>
             </w:r>
           </w:p>
         </w:tc>
@@ -29512,7 +29512,7 @@
                 <w:b/>
                 <w:bCs/>
               </w:rPr>
-              <w:t xml:space="preserve">6.7%</w:t>
+              <w:t xml:space="preserve">7.8%</w:t>
             </w:r>
           </w:p>
         </w:tc>
@@ -29566,7 +29566,7 @@
                 <w:b/>
                 <w:bCs/>
               </w:rPr>
-              <w:t xml:space="preserve">80.0%</w:t>
+              <w:t xml:space="preserve">69.8%</w:t>
             </w:r>
           </w:p>
         </w:tc>
@@ -29590,7 +29590,7 @@
               <w:jc w:val="center"/>
             </w:pPr>
             <w:r>
-              <w:t xml:space="preserve">🟢 Bom</w:t>
+              <w:t xml:space="preserve">🟡 Atenção</w:t>
             </w:r>
           </w:p>
         </w:tc>
@@ -29620,7 +29620,7 @@
                 <w:b/>
                 <w:bCs/>
               </w:rPr>
-              <w:t xml:space="preserve">63.3%</w:t>
+              <w:t xml:space="preserve">55.9%</w:t>
             </w:r>
           </w:p>
         </w:tc>
@@ -29674,7 +29674,7 @@
                 <w:b/>
                 <w:bCs/>
               </w:rPr>
-              <w:t xml:space="preserve">43.3%</w:t>
+              <w:t xml:space="preserve">37.0%</w:t>
             </w:r>
           </w:p>
         </w:tc>
@@ -29728,7 +29728,7 @@
                 <w:b/>
                 <w:bCs/>
               </w:rPr>
-              <w:t xml:space="preserve">43.3%</w:t>
+              <w:t xml:space="preserve">32.4%</w:t>
             </w:r>
           </w:p>
         </w:tc>
@@ -29798,7 +29798,7 @@
         <w:t xml:space="preserve"> </w:t>
       </w:r>
       <w:r>
-        <w:t xml:space="preserve">93.3% de probabilidade de caixa positivo</w:t>
+        <w:t xml:space="preserve">92.2% de probabilidade de caixa positivo</w:t>
       </w:r>
     </w:p>
     <w:p>
@@ -29820,7 +29820,7 @@
         <w:t xml:space="preserve"> </w:t>
       </w:r>
       <w:r>
-        <w:t xml:space="preserve">R$ 207.042,18 - valor mais provável ao final</w:t>
+        <w:t xml:space="preserve">R$ 131.259,56 - valor mais provável ao final</w:t>
       </w:r>
     </w:p>
     <w:p>
@@ -29842,7 +29842,7 @@
         <w:t xml:space="preserve"> </w:t>
       </w:r>
       <w:r>
-        <w:t xml:space="preserve">R$ -545,08 - pior cenário nos 5% mais pessimistas</w:t>
+        <w:t xml:space="preserve">R$ -4.644,78 - pior cenário nos 5% mais pessimistas</w:t>
       </w:r>
     </w:p>
     <w:p>
@@ -29864,7 +29864,7 @@
         <w:t xml:space="preserve"> </w:t>
       </w:r>
       <w:r>
-        <w:t xml:space="preserve">R$ 1.477.954,34 entre P5 e P95</w:t>
+        <w:t xml:space="preserve">R$ 1.413.762,61 entre P5 e P95</w:t>
       </w:r>
     </w:p>
     <w:bookmarkEnd w:id="552"/>
@@ -29918,7 +29918,7 @@
         <w:t xml:space="preserve"> </w:t>
       </w:r>
       <w:r>
-        <w:t xml:space="preserve">R$ 37.959,92</w:t>
+        <w:t xml:space="preserve">R$ 25.123,00</w:t>
       </w:r>
     </w:p>
     <w:p>
@@ -29940,7 +29940,7 @@
         <w:t xml:space="preserve"> </w:t>
       </w:r>
       <w:r>
-        <w:t xml:space="preserve">83.3%</w:t>
+        <w:t xml:space="preserve">72.5%</w:t>
       </w:r>
     </w:p>
     <w:p>
@@ -30074,7 +30074,7 @@
         <w:t xml:space="preserve"> </w:t>
       </w:r>
       <w:r>
-        <w:t xml:space="preserve">30</w:t>
+        <w:t xml:space="preserve">30,000</w:t>
       </w:r>
     </w:p>
     <w:p>
@@ -30381,7 +30381,7 @@
           <w:i/>
           <w:iCs/>
         </w:rPr>
-        <w:t xml:space="preserve">Fonte: mc_results (Célula 5D) | 30 simulações</w:t>
+        <w:t xml:space="preserve">Fonte: mc_results (Célula 5D) | 30000 simulações</w:t>
       </w:r>
     </w:p>
     <w:bookmarkEnd w:id="571"/>
@@ -30532,7 +30532,7 @@
         <w:t xml:space="preserve"> </w:t>
       </w:r>
       <w:r>
-        <w:t xml:space="preserve">R$ -545,08 - pior resultado nos 5% mais pessimistas</w:t>
+        <w:t xml:space="preserve">R$ -4.644,78 - pior resultado nos 5% mais pessimistas</w:t>
       </w:r>
       <w:r>
         <w:t xml:space="preserve"> </w:t>
@@ -30554,7 +30554,7 @@
         <w:t xml:space="preserve"> </w:t>
       </w:r>
       <w:r>
-        <w:t xml:space="preserve">R$ -14.386,62 - média dos 5% piores cenários</w:t>
+        <w:t xml:space="preserve">R$ -11.498,45 - média dos 5% piores cenários</w:t>
       </w:r>
       <w:r>
         <w:t xml:space="preserve"> </w:t>
@@ -30576,7 +30576,7 @@
         <w:t xml:space="preserve"> </w:t>
       </w:r>
       <w:r>
-        <w:t xml:space="preserve">R$ 207.042,18 - resultado mais provável</w:t>
+        <w:t xml:space="preserve">R$ 131.259,56 - resultado mais provável</w:t>
       </w:r>
     </w:p>
     <w:p>
@@ -30594,7 +30594,7 @@
         <w:t xml:space="preserve"> </w:t>
       </w:r>
       <w:r>
-        <w:t xml:space="preserve">- P(Quebra) = 6.7% → 🟢 Risco baixo</w:t>
+        <w:t xml:space="preserve">- P(Quebra) = 7.8% → 🟢 Risco baixo</w:t>
       </w:r>
     </w:p>
     <w:bookmarkEnd w:id="572"/>
@@ -30820,7 +30820,7 @@
         <w:t xml:space="preserve"> </w:t>
       </w:r>
       <w:r>
-        <w:t xml:space="preserve">M24 com 83.3% de sobrevivência</w:t>
+        <w:t xml:space="preserve">M24 com 75.8% de sobrevivência</w:t>
       </w:r>
       <w:r>
         <w:t xml:space="preserve"> </w:t>
@@ -30842,7 +30842,7 @@
         <w:t xml:space="preserve"> </w:t>
       </w:r>
       <w:r>
-        <w:t xml:space="preserve">90.0% de sobrevivência</w:t>
+        <w:t xml:space="preserve">90.7% de sobrevivência</w:t>
       </w:r>
       <w:r>
         <w:t xml:space="preserve"> </w:t>
@@ -30864,7 +30864,7 @@
         <w:t xml:space="preserve"> </w:t>
       </w:r>
       <w:r>
-        <w:t xml:space="preserve">93.3% de sobrevivência</w:t>
+        <w:t xml:space="preserve">92.2% de sobrevivência</w:t>
       </w:r>
     </w:p>
     <w:p>
@@ -30882,7 +30882,7 @@
         <w:t xml:space="preserve"> </w:t>
       </w:r>
       <w:r>
-        <w:t xml:space="preserve">🟢 Trajetória saudável - sobrevivência consistente acima de 80%</w:t>
+        <w:t xml:space="preserve">⚠️ Há período(s) de risco durante a trajetória</w:t>
       </w:r>
     </w:p>
     <w:bookmarkEnd w:id="582"/>
@@ -37864,7 +37864,7 @@
       <w:r>
         <w:drawing>
           <wp:inline>
-            <wp:extent cx="5334000" cy="2891387"/>
+            <wp:extent cx="5334000" cy="2787524"/>
             <wp:effectExtent b="0" l="0" r="0" t="0"/>
             <wp:docPr descr="" title="" id="702" name="Picture"/>
             <a:graphic>
@@ -37885,7 +37885,7 @@
                   <pic:spPr bwMode="auto">
                     <a:xfrm>
                       <a:off x="0" y="0"/>
-                      <a:ext cx="5334000" cy="2891387"/>
+                      <a:ext cx="5334000" cy="2787524"/>
                     </a:xfrm>
                     <a:prstGeom prst="rect">
                       <a:avLst/>
@@ -37915,7 +37915,7 @@
           <w:i/>
           <w:iCs/>
         </w:rPr>
-        <w:t xml:space="preserve">Fonte: 30 Simulações Monte Carlo | Múltiplo 5.0x ARR</w:t>
+        <w:t xml:space="preserve">Fonte: 30000 Simulações Monte Carlo | Múltiplo 5.0x ARR</w:t>
       </w:r>
     </w:p>
     <w:bookmarkEnd w:id="705"/>
@@ -38148,18 +38148,18 @@
               <w:pStyle w:val="Compact"/>
             </w:pPr>
             <w:r>
-              <w:t xml:space="preserve">R$ 105.303,60</w:t>
-            </w:r>
-          </w:p>
-        </w:tc>
-        <w:tc>
-          <w:tcPr/>
-          <w:p>
-            <w:pPr>
-              <w:pStyle w:val="Compact"/>
-            </w:pPr>
-            <w:r>
-              <w:t xml:space="preserve">R$ 526.518,00</w:t>
+              <w:t xml:space="preserve">R$ 37.044,00</w:t>
+            </w:r>
+          </w:p>
+        </w:tc>
+        <w:tc>
+          <w:tcPr/>
+          <w:p>
+            <w:pPr>
+              <w:pStyle w:val="Compact"/>
+            </w:pPr>
+            <w:r>
+              <w:t xml:space="preserve">R$ 185.220,00</w:t>
             </w:r>
           </w:p>
         </w:tc>
@@ -38194,18 +38194,18 @@
               <w:pStyle w:val="Compact"/>
             </w:pPr>
             <w:r>
-              <w:t xml:space="preserve">R$ 795.905,40</w:t>
-            </w:r>
-          </w:p>
-        </w:tc>
-        <w:tc>
-          <w:tcPr/>
-          <w:p>
-            <w:pPr>
-              <w:pStyle w:val="Compact"/>
-            </w:pPr>
-            <w:r>
-              <w:t xml:space="preserve">R$ 3.979.527,00</w:t>
+              <w:t xml:space="preserve">R$ 465.684,60</w:t>
+            </w:r>
+          </w:p>
+        </w:tc>
+        <w:tc>
+          <w:tcPr/>
+          <w:p>
+            <w:pPr>
+              <w:pStyle w:val="Compact"/>
+            </w:pPr>
+            <w:r>
+              <w:t xml:space="preserve">R$ 2.328.423,00</w:t>
             </w:r>
           </w:p>
         </w:tc>
@@ -38240,18 +38240,18 @@
               <w:pStyle w:val="Compact"/>
             </w:pPr>
             <w:r>
-              <w:t xml:space="preserve">R$ 2.826.844,20</w:t>
-            </w:r>
-          </w:p>
-        </w:tc>
-        <w:tc>
-          <w:tcPr/>
-          <w:p>
-            <w:pPr>
-              <w:pStyle w:val="Compact"/>
-            </w:pPr>
-            <w:r>
-              <w:t xml:space="preserve">R$ 14.134.221,00</w:t>
+              <w:t xml:space="preserve">R$ 2.645.483,76</w:t>
+            </w:r>
+          </w:p>
+        </w:tc>
+        <w:tc>
+          <w:tcPr/>
+          <w:p>
+            <w:pPr>
+              <w:pStyle w:val="Compact"/>
+            </w:pPr>
+            <w:r>
+              <w:t xml:space="preserve">R$ 13.227.418,80</w:t>
             </w:r>
           </w:p>
         </w:tc>
@@ -38311,7 +38311,7 @@
         <w:t xml:space="preserve"> </w:t>
       </w:r>
       <w:r>
-        <w:t xml:space="preserve">O modelo aponta um Valuation mediano de R$ 3.979.527,00 no Mês 36 com múltiplo de 5.0x ARR.</w:t>
+        <w:t xml:space="preserve">O modelo aponta um Valuation mediano de R$ 2.328.423,00 no Mês 36 com múltiplo de 5.0x ARR.</w:t>
       </w:r>
     </w:p>
     <w:p>
@@ -38568,13 +38568,13 @@
                 <w:b/>
                 <w:bCs/>
               </w:rPr>
-              <w:t xml:space="preserve">93.3%</w:t>
+              <w:t xml:space="preserve">92.2%</w:t>
             </w:r>
             <w:r>
               <w:t xml:space="preserve"> </w:t>
             </w:r>
             <w:r>
-              <w:t xml:space="preserve">— ou seja, em 93 de cada 100 futuros</w:t>
+              <w:t xml:space="preserve">— ou seja, em 92 de cada 100 futuros</w:t>
             </w:r>
             <w:r>
               <w:t xml:space="preserve"> </w:t>
@@ -38606,7 +38606,7 @@
                 <w:b/>
                 <w:bCs/>
               </w:rPr>
-              <w:t xml:space="preserve">R$ 207.042,18</w:t>
+              <w:t xml:space="preserve">R$ 131.259,56</w:t>
             </w:r>
             <w:r>
               <w:t xml:space="preserve">, enquanto o</w:t>
@@ -38641,7 +38641,7 @@
                 <w:b/>
                 <w:bCs/>
               </w:rPr>
-              <w:t xml:space="preserve">R$ -545,08</w:t>
+              <w:t xml:space="preserve">R$ -4.644,78</w:t>
             </w:r>
             <w:r>
               <w:t xml:space="preserve">.</w:t>
@@ -38691,7 +38691,7 @@
                 <w:b/>
                 <w:bCs/>
               </w:rPr>
-              <w:t xml:space="preserve">83.3%</w:t>
+              <w:t xml:space="preserve">72.5%</w:t>
             </w:r>
             <w:r>
               <w:t xml:space="preserve"> </w:t>
@@ -38793,13 +38793,13 @@
                 <w:b/>
                 <w:bCs/>
               </w:rPr>
-              <w:t xml:space="preserve">R$ 1.477.954,34</w:t>
+              <w:t xml:space="preserve">R$ 1.413.762,61</w:t>
             </w:r>
             <w:r>
               <w:t xml:space="preserve"> </w:t>
             </w:r>
             <w:r>
-              <w:t xml:space="preserve">(7.1x a mediana),</w:t>
+              <w:t xml:space="preserve">(10.8x a mediana),</w:t>
             </w:r>
             <w:r>
               <w:t xml:space="preserve"> </w:t>
@@ -39980,7 +39980,7 @@
         <w:t xml:space="preserve"> </w:t>
       </w:r>
       <w:r>
-        <w:t xml:space="preserve">10 rodadas</w:t>
+        <w:t xml:space="preserve">10000 rodadas</w:t>
       </w:r>
     </w:p>
     <w:p>

</xml_diff>